<commit_message>
full report generated succesfully
</commit_message>
<xml_diff>
--- a/templates/WAPT_template.docx
+++ b/templates/WAPT_template.docx
@@ -74,7 +74,6 @@
     <w:p/>
     <w:p/>
     <w:p/>
-    <w:p/>
     <w:p>
       <w:r>
         <w:rPr>
@@ -84,15 +83,15 @@
         <mc:AlternateContent>
           <mc:Choice Requires="wps">
             <w:drawing>
-              <wp:anchor distT="45720" distB="45720" distL="114300" distR="114300" simplePos="0" relativeHeight="251661312" behindDoc="0" locked="0" layoutInCell="1" allowOverlap="1" wp14:anchorId="49CAAF13" wp14:editId="18F850D7">
+              <wp:anchor distT="45720" distB="45720" distL="114300" distR="114300" simplePos="0" relativeHeight="251661312" behindDoc="0" locked="0" layoutInCell="1" allowOverlap="1" wp14:anchorId="49CAAF13" wp14:editId="507CB6F0">
                 <wp:simplePos x="0" y="0"/>
                 <wp:positionH relativeFrom="margin">
-                  <wp:posOffset>-45720</wp:posOffset>
+                  <wp:posOffset>-44450</wp:posOffset>
                 </wp:positionH>
                 <wp:positionV relativeFrom="paragraph">
-                  <wp:posOffset>189865</wp:posOffset>
+                  <wp:posOffset>534670</wp:posOffset>
                 </wp:positionV>
-                <wp:extent cx="6121400" cy="3208020"/>
+                <wp:extent cx="6121400" cy="4480560"/>
                 <wp:effectExtent l="0" t="0" r="0" b="0"/>
                 <wp:wrapSquare wrapText="bothSides"/>
                 <wp:docPr id="217" name="Casella di testo 2"/>
@@ -108,7 +107,7 @@
                       <wps:spPr bwMode="auto">
                         <a:xfrm>
                           <a:off x="0" y="0"/>
-                          <a:ext cx="6121400" cy="3208020"/>
+                          <a:ext cx="6121400" cy="4480560"/>
                         </a:xfrm>
                         <a:prstGeom prst="rect">
                           <a:avLst/>
@@ -219,7 +218,206 @@
                                 <w:szCs w:val="44"/>
                                 <w:lang w:val="en-US"/>
                               </w:rPr>
-                              <w:t>Scenario (Environment)</w:t>
+                              <w:t>{</w:t>
+                            </w:r>
+                            <w:r>
+                              <w:rPr>
+                                <w:rFonts w:ascii="Cambria" w:hAnsi="Cambria"/>
+                                <w:b/>
+                                <w:bCs/>
+                                <w:i/>
+                                <w:iCs/>
+                                <w:sz w:val="44"/>
+                                <w:szCs w:val="44"/>
+                                <w:lang w:val="en-US"/>
+                              </w:rPr>
+                              <w:t>#</w:t>
+                            </w:r>
+                            <w:r>
+                              <w:rPr>
+                                <w:rFonts w:ascii="Cambria" w:hAnsi="Cambria"/>
+                                <w:b/>
+                                <w:bCs/>
+                                <w:i/>
+                                <w:iCs/>
+                                <w:sz w:val="44"/>
+                                <w:szCs w:val="44"/>
+                                <w:lang w:val="en-US"/>
+                              </w:rPr>
+                              <w:t>target</w:t>
+                            </w:r>
+                            <w:r>
+                              <w:rPr>
+                                <w:rFonts w:ascii="Cambria" w:hAnsi="Cambria"/>
+                                <w:b/>
+                                <w:bCs/>
+                                <w:i/>
+                                <w:iCs/>
+                                <w:sz w:val="44"/>
+                                <w:szCs w:val="44"/>
+                                <w:lang w:val="en-US"/>
+                              </w:rPr>
+                              <w:t>s</w:t>
+                            </w:r>
+                            <w:r>
+                              <w:rPr>
+                                <w:rFonts w:ascii="Cambria" w:hAnsi="Cambria"/>
+                                <w:b/>
+                                <w:bCs/>
+                                <w:i/>
+                                <w:iCs/>
+                                <w:sz w:val="44"/>
+                                <w:szCs w:val="44"/>
+                                <w:lang w:val="en-US"/>
+                              </w:rPr>
+                              <w:t>}</w:t>
+                            </w:r>
+                          </w:p>
+                          <w:p>
+                            <w:pPr>
+                              <w:ind w:firstLine="708"/>
+                              <w:rPr>
+                                <w:rFonts w:ascii="Cambria" w:hAnsi="Cambria"/>
+                                <w:b/>
+                                <w:bCs/>
+                                <w:i/>
+                                <w:iCs/>
+                                <w:sz w:val="44"/>
+                                <w:szCs w:val="44"/>
+                                <w:lang w:val="en-US"/>
+                              </w:rPr>
+                            </w:pPr>
+                            <w:r>
+                              <w:rPr>
+                                <w:rFonts w:ascii="Cambria" w:hAnsi="Cambria"/>
+                                <w:b/>
+                                <w:bCs/>
+                                <w:i/>
+                                <w:iCs/>
+                                <w:sz w:val="44"/>
+                                <w:szCs w:val="44"/>
+                                <w:lang w:val="en-US"/>
+                              </w:rPr>
+                              <w:t>{</w:t>
+                            </w:r>
+                            <w:r>
+                              <w:rPr>
+                                <w:rFonts w:ascii="Cambria" w:hAnsi="Cambria"/>
+                                <w:b/>
+                                <w:bCs/>
+                                <w:i/>
+                                <w:iCs/>
+                                <w:sz w:val="44"/>
+                                <w:szCs w:val="44"/>
+                                <w:lang w:val="en-US"/>
+                              </w:rPr>
+                              <w:t>name</w:t>
+                            </w:r>
+                            <w:r>
+                              <w:rPr>
+                                <w:rFonts w:ascii="Cambria" w:hAnsi="Cambria"/>
+                                <w:b/>
+                                <w:bCs/>
+                                <w:i/>
+                                <w:iCs/>
+                                <w:sz w:val="44"/>
+                                <w:szCs w:val="44"/>
+                                <w:lang w:val="en-US"/>
+                              </w:rPr>
+                              <w:t>}</w:t>
+                            </w:r>
+                          </w:p>
+                          <w:p>
+                            <w:pPr>
+                              <w:ind w:firstLine="708"/>
+                              <w:rPr>
+                                <w:rFonts w:ascii="Cambria" w:hAnsi="Cambria"/>
+                                <w:b/>
+                                <w:bCs/>
+                                <w:i/>
+                                <w:iCs/>
+                                <w:sz w:val="44"/>
+                                <w:szCs w:val="44"/>
+                                <w:lang w:val="en-US"/>
+                              </w:rPr>
+                            </w:pPr>
+                            <w:r>
+                              <w:rPr>
+                                <w:rFonts w:ascii="Cambria" w:hAnsi="Cambria"/>
+                                <w:b/>
+                                <w:bCs/>
+                                <w:i/>
+                                <w:iCs/>
+                                <w:sz w:val="44"/>
+                                <w:szCs w:val="44"/>
+                                <w:lang w:val="en-US"/>
+                              </w:rPr>
+                              <w:t>{</w:t>
+                            </w:r>
+                            <w:r>
+                              <w:rPr>
+                                <w:rFonts w:ascii="Cambria" w:hAnsi="Cambria"/>
+                                <w:b/>
+                                <w:bCs/>
+                                <w:i/>
+                                <w:iCs/>
+                                <w:sz w:val="44"/>
+                                <w:szCs w:val="44"/>
+                                <w:lang w:val="en-US"/>
+                              </w:rPr>
+                              <w:t>/</w:t>
+                            </w:r>
+                            <w:r>
+                              <w:rPr>
+                                <w:rFonts w:ascii="Cambria" w:hAnsi="Cambria"/>
+                                <w:b/>
+                                <w:bCs/>
+                                <w:i/>
+                                <w:iCs/>
+                                <w:sz w:val="44"/>
+                                <w:szCs w:val="44"/>
+                                <w:lang w:val="en-US"/>
+                              </w:rPr>
+                              <w:t>target</w:t>
+                            </w:r>
+                            <w:r>
+                              <w:rPr>
+                                <w:rFonts w:ascii="Cambria" w:hAnsi="Cambria"/>
+                                <w:b/>
+                                <w:bCs/>
+                                <w:i/>
+                                <w:iCs/>
+                                <w:sz w:val="44"/>
+                                <w:szCs w:val="44"/>
+                                <w:lang w:val="en-US"/>
+                              </w:rPr>
+                              <w:t>s</w:t>
+                            </w:r>
+                            <w:r>
+                              <w:rPr>
+                                <w:rFonts w:ascii="Cambria" w:hAnsi="Cambria"/>
+                                <w:b/>
+                                <w:bCs/>
+                                <w:i/>
+                                <w:iCs/>
+                                <w:sz w:val="44"/>
+                                <w:szCs w:val="44"/>
+                                <w:lang w:val="en-US"/>
+                              </w:rPr>
+                              <w:t>}</w:t>
+                            </w:r>
+                            <w:r>
+                              <w:rPr>
+                                <w:rFonts w:ascii="Cambria" w:hAnsi="Cambria"/>
+                                <w:b/>
+                                <w:bCs/>
+                                <w:i/>
+                                <w:iCs/>
+                                <w:sz w:val="44"/>
+                                <w:szCs w:val="44"/>
+                                <w:lang w:val="en-US"/>
+                              </w:rPr>
+                              <w:t xml:space="preserve"> </w:t>
                             </w:r>
                           </w:p>
                           <w:p>
@@ -240,12 +438,11 @@
                                 <w:b/>
                                 <w:bCs/>
                                 <w:i/>
-                                <w:iCs/>
-                                <w:sz w:val="44"/>
-                                <w:szCs w:val="44"/>
+                                <w:sz w:val="48"/>
+                                <w:szCs w:val="48"/>
                                 <w:lang w:val="en-US"/>
                               </w:rPr>
-                              <w:t>Client</w:t>
+                              <w:t>{client_name}</w:t>
                             </w:r>
                           </w:p>
                         </w:txbxContent>
@@ -271,7 +468,7 @@
                 <v:stroke joinstyle="miter"/>
                 <v:path gradientshapeok="t" o:connecttype="rect"/>
               </v:shapetype>
-              <v:shape id="Casella di testo 2" o:spid="_x0000_s1026" type="#_x0000_t202" style="position:absolute;margin-left:-3.6pt;margin-top:14.95pt;width:482pt;height:252.6pt;z-index:251661312;visibility:visible;mso-wrap-style:square;mso-width-percent:0;mso-height-percent:0;mso-wrap-distance-left:9pt;mso-wrap-distance-top:3.6pt;mso-wrap-distance-right:9pt;mso-wrap-distance-bottom:3.6pt;mso-position-horizontal:absolute;mso-position-horizontal-relative:margin;mso-position-vertical:absolute;mso-position-vertical-relative:text;mso-width-percent:0;mso-height-percent:0;mso-width-relative:margin;mso-height-relative:margin;v-text-anchor:top" o:gfxdata="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" filled="f" stroked="f">
+              <v:shape id="Casella di testo 2" o:spid="_x0000_s1026" type="#_x0000_t202" style="position:absolute;margin-left:-3.5pt;margin-top:42.1pt;width:482pt;height:352.8pt;z-index:251661312;visibility:visible;mso-wrap-style:square;mso-width-percent:0;mso-height-percent:0;mso-wrap-distance-left:9pt;mso-wrap-distance-top:3.6pt;mso-wrap-distance-right:9pt;mso-wrap-distance-bottom:3.6pt;mso-position-horizontal:absolute;mso-position-horizontal-relative:margin;mso-position-vertical:absolute;mso-position-vertical-relative:text;mso-width-percent:0;mso-height-percent:0;mso-width-relative:margin;mso-height-relative:margin;v-text-anchor:top" o:gfxdata="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" filled="f" stroked="f">
                 <v:textbox>
                   <w:txbxContent>
                     <w:p>
@@ -370,7 +567,206 @@
                           <w:szCs w:val="44"/>
                           <w:lang w:val="en-US"/>
                         </w:rPr>
-                        <w:t>Scenario (Environment)</w:t>
+                        <w:t>{</w:t>
+                      </w:r>
+                      <w:r>
+                        <w:rPr>
+                          <w:rFonts w:ascii="Cambria" w:hAnsi="Cambria"/>
+                          <w:b/>
+                          <w:bCs/>
+                          <w:i/>
+                          <w:iCs/>
+                          <w:sz w:val="44"/>
+                          <w:szCs w:val="44"/>
+                          <w:lang w:val="en-US"/>
+                        </w:rPr>
+                        <w:t>#</w:t>
+                      </w:r>
+                      <w:r>
+                        <w:rPr>
+                          <w:rFonts w:ascii="Cambria" w:hAnsi="Cambria"/>
+                          <w:b/>
+                          <w:bCs/>
+                          <w:i/>
+                          <w:iCs/>
+                          <w:sz w:val="44"/>
+                          <w:szCs w:val="44"/>
+                          <w:lang w:val="en-US"/>
+                        </w:rPr>
+                        <w:t>target</w:t>
+                      </w:r>
+                      <w:r>
+                        <w:rPr>
+                          <w:rFonts w:ascii="Cambria" w:hAnsi="Cambria"/>
+                          <w:b/>
+                          <w:bCs/>
+                          <w:i/>
+                          <w:iCs/>
+                          <w:sz w:val="44"/>
+                          <w:szCs w:val="44"/>
+                          <w:lang w:val="en-US"/>
+                        </w:rPr>
+                        <w:t>s</w:t>
+                      </w:r>
+                      <w:r>
+                        <w:rPr>
+                          <w:rFonts w:ascii="Cambria" w:hAnsi="Cambria"/>
+                          <w:b/>
+                          <w:bCs/>
+                          <w:i/>
+                          <w:iCs/>
+                          <w:sz w:val="44"/>
+                          <w:szCs w:val="44"/>
+                          <w:lang w:val="en-US"/>
+                        </w:rPr>
+                        <w:t>}</w:t>
+                      </w:r>
+                    </w:p>
+                    <w:p>
+                      <w:pPr>
+                        <w:ind w:firstLine="708"/>
+                        <w:rPr>
+                          <w:rFonts w:ascii="Cambria" w:hAnsi="Cambria"/>
+                          <w:b/>
+                          <w:bCs/>
+                          <w:i/>
+                          <w:iCs/>
+                          <w:sz w:val="44"/>
+                          <w:szCs w:val="44"/>
+                          <w:lang w:val="en-US"/>
+                        </w:rPr>
+                      </w:pPr>
+                      <w:r>
+                        <w:rPr>
+                          <w:rFonts w:ascii="Cambria" w:hAnsi="Cambria"/>
+                          <w:b/>
+                          <w:bCs/>
+                          <w:i/>
+                          <w:iCs/>
+                          <w:sz w:val="44"/>
+                          <w:szCs w:val="44"/>
+                          <w:lang w:val="en-US"/>
+                        </w:rPr>
+                        <w:t>{</w:t>
+                      </w:r>
+                      <w:r>
+                        <w:rPr>
+                          <w:rFonts w:ascii="Cambria" w:hAnsi="Cambria"/>
+                          <w:b/>
+                          <w:bCs/>
+                          <w:i/>
+                          <w:iCs/>
+                          <w:sz w:val="44"/>
+                          <w:szCs w:val="44"/>
+                          <w:lang w:val="en-US"/>
+                        </w:rPr>
+                        <w:t>name</w:t>
+                      </w:r>
+                      <w:r>
+                        <w:rPr>
+                          <w:rFonts w:ascii="Cambria" w:hAnsi="Cambria"/>
+                          <w:b/>
+                          <w:bCs/>
+                          <w:i/>
+                          <w:iCs/>
+                          <w:sz w:val="44"/>
+                          <w:szCs w:val="44"/>
+                          <w:lang w:val="en-US"/>
+                        </w:rPr>
+                        <w:t>}</w:t>
+                      </w:r>
+                    </w:p>
+                    <w:p>
+                      <w:pPr>
+                        <w:ind w:firstLine="708"/>
+                        <w:rPr>
+                          <w:rFonts w:ascii="Cambria" w:hAnsi="Cambria"/>
+                          <w:b/>
+                          <w:bCs/>
+                          <w:i/>
+                          <w:iCs/>
+                          <w:sz w:val="44"/>
+                          <w:szCs w:val="44"/>
+                          <w:lang w:val="en-US"/>
+                        </w:rPr>
+                      </w:pPr>
+                      <w:r>
+                        <w:rPr>
+                          <w:rFonts w:ascii="Cambria" w:hAnsi="Cambria"/>
+                          <w:b/>
+                          <w:bCs/>
+                          <w:i/>
+                          <w:iCs/>
+                          <w:sz w:val="44"/>
+                          <w:szCs w:val="44"/>
+                          <w:lang w:val="en-US"/>
+                        </w:rPr>
+                        <w:t>{</w:t>
+                      </w:r>
+                      <w:r>
+                        <w:rPr>
+                          <w:rFonts w:ascii="Cambria" w:hAnsi="Cambria"/>
+                          <w:b/>
+                          <w:bCs/>
+                          <w:i/>
+                          <w:iCs/>
+                          <w:sz w:val="44"/>
+                          <w:szCs w:val="44"/>
+                          <w:lang w:val="en-US"/>
+                        </w:rPr>
+                        <w:t>/</w:t>
+                      </w:r>
+                      <w:r>
+                        <w:rPr>
+                          <w:rFonts w:ascii="Cambria" w:hAnsi="Cambria"/>
+                          <w:b/>
+                          <w:bCs/>
+                          <w:i/>
+                          <w:iCs/>
+                          <w:sz w:val="44"/>
+                          <w:szCs w:val="44"/>
+                          <w:lang w:val="en-US"/>
+                        </w:rPr>
+                        <w:t>target</w:t>
+                      </w:r>
+                      <w:r>
+                        <w:rPr>
+                          <w:rFonts w:ascii="Cambria" w:hAnsi="Cambria"/>
+                          <w:b/>
+                          <w:bCs/>
+                          <w:i/>
+                          <w:iCs/>
+                          <w:sz w:val="44"/>
+                          <w:szCs w:val="44"/>
+                          <w:lang w:val="en-US"/>
+                        </w:rPr>
+                        <w:t>s</w:t>
+                      </w:r>
+                      <w:r>
+                        <w:rPr>
+                          <w:rFonts w:ascii="Cambria" w:hAnsi="Cambria"/>
+                          <w:b/>
+                          <w:bCs/>
+                          <w:i/>
+                          <w:iCs/>
+                          <w:sz w:val="44"/>
+                          <w:szCs w:val="44"/>
+                          <w:lang w:val="en-US"/>
+                        </w:rPr>
+                        <w:t>}</w:t>
+                      </w:r>
+                      <w:r>
+                        <w:rPr>
+                          <w:rFonts w:ascii="Cambria" w:hAnsi="Cambria"/>
+                          <w:b/>
+                          <w:bCs/>
+                          <w:i/>
+                          <w:iCs/>
+                          <w:sz w:val="44"/>
+                          <w:szCs w:val="44"/>
+                          <w:lang w:val="en-US"/>
+                        </w:rPr>
+                        <w:t xml:space="preserve"> </w:t>
                       </w:r>
                     </w:p>
                     <w:p>
@@ -391,12 +787,11 @@
                           <w:b/>
                           <w:bCs/>
                           <w:i/>
-                          <w:iCs/>
-                          <w:sz w:val="44"/>
-                          <w:szCs w:val="44"/>
+                          <w:sz w:val="48"/>
+                          <w:szCs w:val="48"/>
                           <w:lang w:val="en-US"/>
                         </w:rPr>
-                        <w:t>Client</w:t>
+                        <w:t>{client_name}</w:t>
                       </w:r>
                     </w:p>
                   </w:txbxContent>
@@ -408,6 +803,7 @@
         </mc:AlternateContent>
       </w:r>
     </w:p>
+    <w:p/>
     <w:p/>
     <w:p/>
     <w:p/>
@@ -445,6 +841,7 @@
           <w:docPartUnique/>
         </w:docPartObj>
       </w:sdtPr>
+      <w:sdtEndPr/>
       <w:sdtContent>
         <w:p>
           <w:pPr>
@@ -1965,7 +2362,16 @@
         <w:t xml:space="preserve">Prima di leggere il documento, ogni destinatario si impegna a non diffondere o comunicare a terzi alcuna parte di questo documento senza il preventivo consenso scritto di </w:t>
       </w:r>
       <w:r>
-        <w:t>[TESTING COMPANY NAME].</w:t>
+        <w:rPr>
+          <w:i/>
+        </w:rPr>
+        <w:t>{testing_company_name}</w:t>
+      </w:r>
+      <w:r>
+        <w:rPr>
+          <w:i/>
+        </w:rPr>
+        <w:t>.</w:t>
       </w:r>
     </w:p>
     <w:p>
@@ -2261,28 +2667,12 @@
                 <w:rFonts w:ascii="Segoe UI" w:hAnsi="Segoe UI" w:cs="Segoe UI"/>
               </w:rPr>
             </w:pPr>
-            <w:proofErr w:type="spellStart"/>
-            <w:r>
-              <w:rPr>
-                <w:rFonts w:ascii="Segoe UI" w:hAnsi="Segoe UI" w:cs="Segoe UI"/>
-              </w:rPr>
-              <w:t>Xxxxxxx</w:t>
-            </w:r>
-            <w:proofErr w:type="spellEnd"/>
-            <w:r>
-              <w:rPr>
-                <w:rFonts w:ascii="Segoe UI" w:hAnsi="Segoe UI" w:cs="Segoe UI"/>
-              </w:rPr>
-              <w:t xml:space="preserve"> </w:t>
-            </w:r>
-            <w:proofErr w:type="spellStart"/>
-            <w:r>
-              <w:rPr>
-                <w:rFonts w:ascii="Segoe UI" w:hAnsi="Segoe UI" w:cs="Segoe UI"/>
-              </w:rPr>
-              <w:t>Xxxxxxx</w:t>
-            </w:r>
-            <w:proofErr w:type="spellEnd"/>
+            <w:r>
+              <w:rPr>
+                <w:rFonts w:ascii="Segoe UI" w:hAnsi="Segoe UI" w:cs="Segoe UI"/>
+              </w:rPr>
+              <w:t>{approver_name}</w:t>
+            </w:r>
           </w:p>
         </w:tc>
         <w:tc>
@@ -2300,7 +2690,7 @@
               <w:rPr>
                 <w:rFonts w:ascii="Segoe UI" w:hAnsi="Segoe UI" w:cs="Segoe UI"/>
               </w:rPr>
-              <w:t>GG/MM/YYYY</w:t>
+              <w:t>{approver_date}</w:t>
             </w:r>
           </w:p>
         </w:tc>
@@ -2354,7 +2744,7 @@
         </w:trPr>
         <w:tc>
           <w:tcPr>
-            <w:tcW w:w="1001" w:type="pct"/>
+            <w:tcW w:w="1002" w:type="pct"/>
             <w:shd w:val="clear" w:color="auto" w:fill="004C45" w:themeFill="accent1"/>
           </w:tcPr>
           <w:p>
@@ -2391,34 +2781,30 @@
                 <w:szCs w:val="20"/>
               </w:rPr>
             </w:pPr>
-            <w:proofErr w:type="spellStart"/>
             <w:r>
               <w:rPr>
                 <w:rFonts w:ascii="Segoe UI" w:hAnsi="Segoe UI" w:cs="Segoe UI"/>
                 <w:sz w:val="20"/>
                 <w:szCs w:val="20"/>
               </w:rPr>
-              <w:t>Xxxxx</w:t>
-            </w:r>
-            <w:proofErr w:type="spellEnd"/>
+              <w:t>{#tester</w:t>
+            </w:r>
             <w:r>
               <w:rPr>
                 <w:rFonts w:ascii="Segoe UI" w:hAnsi="Segoe UI" w:cs="Segoe UI"/>
                 <w:sz w:val="20"/>
                 <w:szCs w:val="20"/>
               </w:rPr>
-              <w:t xml:space="preserve"> </w:t>
-            </w:r>
-            <w:proofErr w:type="spellStart"/>
+              <w:t>s</w:t>
+            </w:r>
             <w:r>
               <w:rPr>
                 <w:rFonts w:ascii="Segoe UI" w:hAnsi="Segoe UI" w:cs="Segoe UI"/>
                 <w:sz w:val="20"/>
                 <w:szCs w:val="20"/>
               </w:rPr>
-              <w:t>Xxxxx</w:t>
-            </w:r>
-            <w:proofErr w:type="spellEnd"/>
+              <w:t>}{name}</w:t>
+            </w:r>
           </w:p>
         </w:tc>
         <w:tc>
@@ -2461,16 +2847,14 @@
                 <w:szCs w:val="20"/>
               </w:rPr>
             </w:pPr>
-            <w:proofErr w:type="spellStart"/>
             <w:r>
               <w:rPr>
                 <w:rFonts w:ascii="Segoe UI" w:hAnsi="Segoe UI" w:cs="Segoe UI"/>
                 <w:sz w:val="20"/>
                 <w:szCs w:val="20"/>
               </w:rPr>
-              <w:t>Xxxxx</w:t>
-            </w:r>
-            <w:proofErr w:type="spellEnd"/>
+              <w:t>{role}</w:t>
+            </w:r>
           </w:p>
         </w:tc>
         <w:tc>
@@ -2516,7 +2900,43 @@
               <w:rPr>
                 <w:rFonts w:ascii="Segoe UI" w:hAnsi="Segoe UI" w:cs="Segoe UI"/>
               </w:rPr>
-              <w:t>GG/MM/YYYY</w:t>
+              <w:t>{</w:t>
+            </w:r>
+            <w:r>
+              <w:rPr>
+                <w:rFonts w:ascii="Segoe UI" w:hAnsi="Segoe UI" w:cs="Segoe UI"/>
+              </w:rPr>
+              <w:t>date</w:t>
+            </w:r>
+            <w:r>
+              <w:rPr>
+                <w:rFonts w:ascii="Segoe UI" w:hAnsi="Segoe UI" w:cs="Segoe UI"/>
+              </w:rPr>
+              <w:t>}{</w:t>
+            </w:r>
+            <w:r>
+              <w:rPr>
+                <w:rFonts w:ascii="Segoe UI" w:hAnsi="Segoe UI" w:cs="Segoe UI"/>
+              </w:rPr>
+              <w:t>/</w:t>
+            </w:r>
+            <w:r>
+              <w:rPr>
+                <w:rFonts w:ascii="Segoe UI" w:hAnsi="Segoe UI" w:cs="Segoe UI"/>
+              </w:rPr>
+              <w:t>tester</w:t>
+            </w:r>
+            <w:r>
+              <w:rPr>
+                <w:rFonts w:ascii="Segoe UI" w:hAnsi="Segoe UI" w:cs="Segoe UI"/>
+              </w:rPr>
+              <w:t>s</w:t>
+            </w:r>
+            <w:r>
+              <w:rPr>
+                <w:rFonts w:ascii="Segoe UI" w:hAnsi="Segoe UI" w:cs="Segoe UI"/>
+              </w:rPr>
+              <w:t>}</w:t>
             </w:r>
           </w:p>
         </w:tc>
@@ -2527,7 +2947,7 @@
         </w:trPr>
         <w:tc>
           <w:tcPr>
-            <w:tcW w:w="1001" w:type="pct"/>
+            <w:tcW w:w="1002" w:type="pct"/>
             <w:shd w:val="clear" w:color="auto" w:fill="004C45" w:themeFill="accent1"/>
           </w:tcPr>
           <w:p>
@@ -2547,7 +2967,7 @@
                 <w:sz w:val="20"/>
                 <w:szCs w:val="20"/>
               </w:rPr>
-              <w:t>PREPARATO DA</w:t>
+              <w:t>REVISIONATO DA</w:t>
             </w:r>
           </w:p>
         </w:tc>
@@ -2564,34 +2984,14 @@
                 <w:szCs w:val="20"/>
               </w:rPr>
             </w:pPr>
-            <w:proofErr w:type="spellStart"/>
             <w:r>
               <w:rPr>
                 <w:rFonts w:ascii="Segoe UI" w:hAnsi="Segoe UI" w:cs="Segoe UI"/>
                 <w:sz w:val="20"/>
                 <w:szCs w:val="20"/>
               </w:rPr>
-              <w:t>Xxxxx</w:t>
-            </w:r>
-            <w:proofErr w:type="spellEnd"/>
-            <w:r>
-              <w:rPr>
-                <w:rFonts w:ascii="Segoe UI" w:hAnsi="Segoe UI" w:cs="Segoe UI"/>
-                <w:sz w:val="20"/>
-                <w:szCs w:val="20"/>
-              </w:rPr>
-              <w:t xml:space="preserve"> </w:t>
-            </w:r>
-            <w:proofErr w:type="spellStart"/>
-            <w:r>
-              <w:rPr>
-                <w:rFonts w:ascii="Segoe UI" w:hAnsi="Segoe UI" w:cs="Segoe UI"/>
-                <w:sz w:val="20"/>
-                <w:szCs w:val="20"/>
-              </w:rPr>
-              <w:t>Xxxxx</w:t>
-            </w:r>
-            <w:proofErr w:type="spellEnd"/>
+              <w:t>{revisioner_name}</w:t>
+            </w:r>
           </w:p>
         </w:tc>
         <w:tc>
@@ -2633,16 +3033,14 @@
                 <w:szCs w:val="20"/>
               </w:rPr>
             </w:pPr>
-            <w:proofErr w:type="spellStart"/>
             <w:r>
               <w:rPr>
                 <w:rFonts w:ascii="Segoe UI" w:hAnsi="Segoe UI" w:cs="Segoe UI"/>
                 <w:sz w:val="20"/>
                 <w:szCs w:val="20"/>
               </w:rPr>
-              <w:t>Xxxxx</w:t>
-            </w:r>
-            <w:proofErr w:type="spellEnd"/>
+              <w:t>{revisioner_role}</w:t>
+            </w:r>
           </w:p>
         </w:tc>
         <w:tc>
@@ -2688,357 +3086,7 @@
               <w:rPr>
                 <w:rFonts w:ascii="Segoe UI" w:hAnsi="Segoe UI" w:cs="Segoe UI"/>
               </w:rPr>
-              <w:t>GG/MM/YYYY</w:t>
-            </w:r>
-          </w:p>
-        </w:tc>
-      </w:tr>
-      <w:tr>
-        <w:trPr>
-          <w:trHeight w:val="314"/>
-        </w:trPr>
-        <w:tc>
-          <w:tcPr>
-            <w:tcW w:w="1001" w:type="pct"/>
-            <w:shd w:val="clear" w:color="auto" w:fill="004C45" w:themeFill="accent1"/>
-          </w:tcPr>
-          <w:p>
-            <w:pPr>
-              <w:jc w:val="both"/>
-              <w:rPr>
-                <w:rFonts w:ascii="Segoe UI" w:hAnsi="Segoe UI" w:cs="Segoe UI"/>
-                <w:b/>
-                <w:bCs/>
-                <w:sz w:val="20"/>
-                <w:szCs w:val="20"/>
-              </w:rPr>
-            </w:pPr>
-            <w:r>
-              <w:rPr>
-                <w:rFonts w:ascii="Segoe UI" w:hAnsi="Segoe UI" w:cs="Segoe UI"/>
-                <w:b/>
-                <w:bCs/>
-                <w:sz w:val="20"/>
-                <w:szCs w:val="20"/>
-              </w:rPr>
-              <w:t>PREPARATO DA</w:t>
-            </w:r>
-          </w:p>
-        </w:tc>
-        <w:tc>
-          <w:tcPr>
-            <w:tcW w:w="1007" w:type="pct"/>
-          </w:tcPr>
-          <w:p>
-            <w:pPr>
-              <w:jc w:val="both"/>
-              <w:rPr>
-                <w:rFonts w:ascii="Segoe UI" w:hAnsi="Segoe UI" w:cs="Segoe UI"/>
-                <w:sz w:val="20"/>
-                <w:szCs w:val="20"/>
-              </w:rPr>
-            </w:pPr>
-            <w:proofErr w:type="spellStart"/>
-            <w:r>
-              <w:rPr>
-                <w:rFonts w:ascii="Segoe UI" w:hAnsi="Segoe UI" w:cs="Segoe UI"/>
-                <w:sz w:val="20"/>
-                <w:szCs w:val="20"/>
-              </w:rPr>
-              <w:t>Xxxxx</w:t>
-            </w:r>
-            <w:proofErr w:type="spellEnd"/>
-            <w:r>
-              <w:rPr>
-                <w:rFonts w:ascii="Segoe UI" w:hAnsi="Segoe UI" w:cs="Segoe UI"/>
-                <w:sz w:val="20"/>
-                <w:szCs w:val="20"/>
-              </w:rPr>
-              <w:t xml:space="preserve"> </w:t>
-            </w:r>
-            <w:proofErr w:type="spellStart"/>
-            <w:r>
-              <w:rPr>
-                <w:rFonts w:ascii="Segoe UI" w:hAnsi="Segoe UI" w:cs="Segoe UI"/>
-                <w:sz w:val="20"/>
-                <w:szCs w:val="20"/>
-              </w:rPr>
-              <w:t>Xxxxx</w:t>
-            </w:r>
-            <w:proofErr w:type="spellEnd"/>
-          </w:p>
-        </w:tc>
-        <w:tc>
-          <w:tcPr>
-            <w:tcW w:w="489" w:type="pct"/>
-            <w:shd w:val="clear" w:color="auto" w:fill="004C45" w:themeFill="accent1"/>
-          </w:tcPr>
-          <w:p>
-            <w:pPr>
-              <w:jc w:val="both"/>
-              <w:rPr>
-                <w:rFonts w:ascii="Segoe UI" w:hAnsi="Segoe UI" w:cs="Segoe UI"/>
-                <w:b/>
-                <w:bCs/>
-                <w:sz w:val="20"/>
-                <w:szCs w:val="20"/>
-              </w:rPr>
-            </w:pPr>
-            <w:r>
-              <w:rPr>
-                <w:rFonts w:ascii="Segoe UI" w:hAnsi="Segoe UI" w:cs="Segoe UI"/>
-                <w:b/>
-                <w:bCs/>
-                <w:sz w:val="20"/>
-                <w:szCs w:val="20"/>
-              </w:rPr>
-              <w:t>RUOLO</w:t>
-            </w:r>
-          </w:p>
-        </w:tc>
-        <w:tc>
-          <w:tcPr>
-            <w:tcW w:w="1007" w:type="pct"/>
-          </w:tcPr>
-          <w:p>
-            <w:pPr>
-              <w:jc w:val="both"/>
-              <w:rPr>
-                <w:rFonts w:ascii="Segoe UI" w:hAnsi="Segoe UI" w:cs="Segoe UI"/>
-                <w:sz w:val="20"/>
-                <w:szCs w:val="20"/>
-              </w:rPr>
-            </w:pPr>
-            <w:proofErr w:type="spellStart"/>
-            <w:r>
-              <w:rPr>
-                <w:rFonts w:ascii="Segoe UI" w:hAnsi="Segoe UI" w:cs="Segoe UI"/>
-                <w:sz w:val="20"/>
-                <w:szCs w:val="20"/>
-              </w:rPr>
-              <w:t>Xxxxx</w:t>
-            </w:r>
-            <w:proofErr w:type="spellEnd"/>
-          </w:p>
-        </w:tc>
-        <w:tc>
-          <w:tcPr>
-            <w:tcW w:w="488" w:type="pct"/>
-            <w:shd w:val="clear" w:color="auto" w:fill="004C45" w:themeFill="accent1"/>
-          </w:tcPr>
-          <w:p>
-            <w:pPr>
-              <w:jc w:val="both"/>
-              <w:rPr>
-                <w:rFonts w:ascii="Segoe UI" w:hAnsi="Segoe UI" w:cs="Segoe UI"/>
-                <w:b/>
-                <w:bCs/>
-                <w:sz w:val="20"/>
-                <w:szCs w:val="20"/>
-              </w:rPr>
-            </w:pPr>
-            <w:r>
-              <w:rPr>
-                <w:rFonts w:ascii="Segoe UI" w:hAnsi="Segoe UI" w:cs="Segoe UI"/>
-                <w:b/>
-                <w:bCs/>
-                <w:sz w:val="20"/>
-                <w:szCs w:val="20"/>
-              </w:rPr>
-              <w:t>DATA</w:t>
-            </w:r>
-          </w:p>
-        </w:tc>
-        <w:tc>
-          <w:tcPr>
-            <w:tcW w:w="1007" w:type="pct"/>
-          </w:tcPr>
-          <w:p>
-            <w:pPr>
-              <w:jc w:val="both"/>
-              <w:rPr>
-                <w:rFonts w:ascii="Segoe UI" w:hAnsi="Segoe UI" w:cs="Segoe UI"/>
-                <w:sz w:val="20"/>
-                <w:szCs w:val="20"/>
-              </w:rPr>
-            </w:pPr>
-            <w:r>
-              <w:rPr>
-                <w:rFonts w:ascii="Segoe UI" w:hAnsi="Segoe UI" w:cs="Segoe UI"/>
-              </w:rPr>
-              <w:t>GG/MM/YYYY</w:t>
-            </w:r>
-          </w:p>
-        </w:tc>
-      </w:tr>
-      <w:tr>
-        <w:trPr>
-          <w:trHeight w:val="314"/>
-        </w:trPr>
-        <w:tc>
-          <w:tcPr>
-            <w:tcW w:w="1001" w:type="pct"/>
-            <w:shd w:val="clear" w:color="auto" w:fill="004C45" w:themeFill="accent1"/>
-          </w:tcPr>
-          <w:p>
-            <w:pPr>
-              <w:jc w:val="both"/>
-              <w:rPr>
-                <w:rFonts w:ascii="Segoe UI" w:hAnsi="Segoe UI" w:cs="Segoe UI"/>
-                <w:b/>
-                <w:sz w:val="20"/>
-                <w:szCs w:val="20"/>
-              </w:rPr>
-            </w:pPr>
-            <w:r>
-              <w:rPr>
-                <w:rFonts w:ascii="Segoe UI" w:hAnsi="Segoe UI" w:cs="Segoe UI"/>
-                <w:b/>
-                <w:sz w:val="20"/>
-                <w:szCs w:val="20"/>
-              </w:rPr>
-              <w:t>REVISIONATO DA</w:t>
-            </w:r>
-          </w:p>
-        </w:tc>
-        <w:tc>
-          <w:tcPr>
-            <w:tcW w:w="1007" w:type="pct"/>
-          </w:tcPr>
-          <w:p>
-            <w:pPr>
-              <w:jc w:val="both"/>
-              <w:rPr>
-                <w:rFonts w:ascii="Segoe UI" w:hAnsi="Segoe UI" w:cs="Segoe UI"/>
-                <w:sz w:val="20"/>
-                <w:szCs w:val="20"/>
-              </w:rPr>
-            </w:pPr>
-            <w:proofErr w:type="spellStart"/>
-            <w:r>
-              <w:rPr>
-                <w:rFonts w:ascii="Segoe UI" w:hAnsi="Segoe UI" w:cs="Segoe UI"/>
-                <w:sz w:val="20"/>
-                <w:szCs w:val="20"/>
-              </w:rPr>
-              <w:t>Xxxxx</w:t>
-            </w:r>
-            <w:proofErr w:type="spellEnd"/>
-            <w:r>
-              <w:rPr>
-                <w:rFonts w:ascii="Segoe UI" w:hAnsi="Segoe UI" w:cs="Segoe UI"/>
-                <w:sz w:val="20"/>
-                <w:szCs w:val="20"/>
-              </w:rPr>
-              <w:t xml:space="preserve"> </w:t>
-            </w:r>
-            <w:proofErr w:type="spellStart"/>
-            <w:r>
-              <w:rPr>
-                <w:rFonts w:ascii="Segoe UI" w:hAnsi="Segoe UI" w:cs="Segoe UI"/>
-                <w:sz w:val="20"/>
-                <w:szCs w:val="20"/>
-              </w:rPr>
-              <w:t>Xxxxx</w:t>
-            </w:r>
-            <w:proofErr w:type="spellEnd"/>
-          </w:p>
-        </w:tc>
-        <w:tc>
-          <w:tcPr>
-            <w:tcW w:w="489" w:type="pct"/>
-            <w:shd w:val="clear" w:color="auto" w:fill="004C45" w:themeFill="accent1"/>
-          </w:tcPr>
-          <w:p>
-            <w:pPr>
-              <w:jc w:val="both"/>
-              <w:rPr>
-                <w:rFonts w:ascii="Segoe UI" w:hAnsi="Segoe UI" w:cs="Segoe UI"/>
-                <w:b/>
-                <w:sz w:val="20"/>
-                <w:szCs w:val="20"/>
-              </w:rPr>
-            </w:pPr>
-            <w:r>
-              <w:rPr>
-                <w:rFonts w:ascii="Segoe UI" w:hAnsi="Segoe UI" w:cs="Segoe UI"/>
-                <w:b/>
-                <w:sz w:val="20"/>
-                <w:szCs w:val="20"/>
-              </w:rPr>
-              <w:t>RUOLO</w:t>
-            </w:r>
-          </w:p>
-        </w:tc>
-        <w:tc>
-          <w:tcPr>
-            <w:tcW w:w="1007" w:type="pct"/>
-          </w:tcPr>
-          <w:p>
-            <w:pPr>
-              <w:jc w:val="both"/>
-              <w:rPr>
-                <w:rFonts w:ascii="Segoe UI" w:hAnsi="Segoe UI" w:cs="Segoe UI"/>
-                <w:sz w:val="20"/>
-                <w:szCs w:val="20"/>
-              </w:rPr>
-            </w:pPr>
-            <w:proofErr w:type="spellStart"/>
-            <w:r>
-              <w:rPr>
-                <w:rFonts w:ascii="Segoe UI" w:hAnsi="Segoe UI" w:cs="Segoe UI"/>
-                <w:sz w:val="20"/>
-                <w:szCs w:val="20"/>
-              </w:rPr>
-              <w:t>Xxxxx</w:t>
-            </w:r>
-            <w:proofErr w:type="spellEnd"/>
-          </w:p>
-        </w:tc>
-        <w:tc>
-          <w:tcPr>
-            <w:tcW w:w="488" w:type="pct"/>
-            <w:shd w:val="clear" w:color="auto" w:fill="004C45" w:themeFill="accent1"/>
-          </w:tcPr>
-          <w:p>
-            <w:pPr>
-              <w:jc w:val="both"/>
-              <w:rPr>
-                <w:rFonts w:ascii="Segoe UI" w:hAnsi="Segoe UI" w:cs="Segoe UI"/>
-                <w:b/>
-                <w:sz w:val="20"/>
-                <w:szCs w:val="20"/>
-              </w:rPr>
-            </w:pPr>
-            <w:r>
-              <w:rPr>
-                <w:rFonts w:ascii="Segoe UI" w:hAnsi="Segoe UI" w:cs="Segoe UI"/>
-                <w:b/>
-                <w:sz w:val="20"/>
-                <w:szCs w:val="20"/>
-              </w:rPr>
-              <w:t>DATA</w:t>
-            </w:r>
-          </w:p>
-        </w:tc>
-        <w:tc>
-          <w:tcPr>
-            <w:tcW w:w="1007" w:type="pct"/>
-          </w:tcPr>
-          <w:p>
-            <w:pPr>
-              <w:jc w:val="both"/>
-              <w:rPr>
-                <w:rFonts w:ascii="Segoe UI" w:hAnsi="Segoe UI" w:cs="Segoe UI"/>
-                <w:sz w:val="20"/>
-                <w:szCs w:val="20"/>
-              </w:rPr>
-            </w:pPr>
-            <w:r>
-              <w:rPr>
-                <w:rFonts w:ascii="Segoe UI" w:hAnsi="Segoe UI" w:cs="Segoe UI"/>
-              </w:rPr>
-              <w:t>GG/MM/YYYY</w:t>
+              <w:t>{revisioner_date}</w:t>
             </w:r>
           </w:p>
         </w:tc>
@@ -3097,7 +3145,22 @@
         <w:pStyle w:val="IntelleraBodyPT"/>
       </w:pPr>
       <w:r>
-        <w:t>[TESTING COMPANY NAME]</w:t>
+        <w:rPr>
+          <w:i/>
+        </w:rPr>
+        <w:t>{</w:t>
+      </w:r>
+      <w:r>
+        <w:rPr>
+          <w:i/>
+        </w:rPr>
+        <w:t>testing_company</w:t>
+      </w:r>
+      <w:r>
+        <w:rPr>
+          <w:i/>
+        </w:rPr>
+        <w:t>_name}</w:t>
       </w:r>
       <w:r>
         <w:t xml:space="preserve"> </w:t>
@@ -3106,97 +3169,120 @@
         <w:t xml:space="preserve">è stata ingaggiata da </w:t>
       </w:r>
       <w:r>
-        <w:t>[</w:t>
+        <w:rPr>
+          <w:i/>
+        </w:rPr>
+        <w:t>{client_name}</w:t>
+      </w:r>
+      <w:r>
+        <w:t xml:space="preserve"> per condurre attività di Web Application Penetration Test sulle sue applicazioni in esecuzione all'interno/esterno della rete del Cliente. </w:t>
+      </w:r>
+      <w:r>
+        <w:t xml:space="preserve">Le attività tecniche </w:t>
+      </w:r>
+      <w:r>
+        <w:t xml:space="preserve">hanno avuto inizio il giorno </w:t>
+      </w:r>
+      <w:r>
+        <w:t>{</w:t>
+      </w:r>
+      <w:r>
+        <w:t>testing_</w:t>
+      </w:r>
+      <w:r>
+        <w:t xml:space="preserve">start_date} </w:t>
+      </w:r>
+      <w:r>
+        <w:t xml:space="preserve">e hanno coinvolto le risorse di </w:t>
+      </w:r>
+      <w:r>
+        <w:rPr>
+          <w:i/>
+        </w:rPr>
+        <w:t>{testing_company_name}</w:t>
+      </w:r>
+      <w:r>
+        <w:t xml:space="preserve"> </w:t>
+      </w:r>
+      <w:r>
+        <w:t xml:space="preserve">per una durata di </w:t>
+      </w:r>
+      <w:r>
+        <w:t>{testing_duration}</w:t>
+      </w:r>
+      <w:r>
+        <w:t xml:space="preserve"> giorni lavorativi </w:t>
+      </w:r>
+      <w:r>
+        <w:t>durante il</w:t>
+      </w:r>
+      <w:r>
+        <w:t xml:space="preserve"> periodo </w:t>
+      </w:r>
+      <w:r>
+        <w:t xml:space="preserve">compreso tra il </w:t>
+      </w:r>
+      <w:r>
+        <w:t>{</w:t>
+      </w:r>
+      <w:r>
+        <w:t>testing_</w:t>
+      </w:r>
+      <w:r>
+        <w:t xml:space="preserve">start_date} </w:t>
+      </w:r>
+      <w:r>
+        <w:t>e il</w:t>
+      </w:r>
+      <w:r>
+        <w:t xml:space="preserve"> </w:t>
+      </w:r>
+      <w:r>
+        <w:t>{testing_end_date}</w:t>
+      </w:r>
+      <w:r>
+        <w:t xml:space="preserve">. I test sono stati condotti </w:t>
+      </w:r>
+      <w:r>
+        <w:t>da</w:t>
+      </w:r>
+      <w:r>
+        <w:t xml:space="preserve"> remoto </w:t>
+      </w:r>
+      <w:r>
+        <w:t xml:space="preserve">presso la </w:t>
+      </w:r>
+      <w:r>
+        <w:t xml:space="preserve">sede di </w:t>
+      </w:r>
+      <w:r>
+        <w:rPr>
+          <w:i/>
+        </w:rPr>
+        <w:t>{testing_company_name}</w:t>
+      </w:r>
+      <w:r>
+        <w:t xml:space="preserve"> </w:t>
+      </w:r>
+      <w:r>
+        <w:t>/da remoto tramite collegamento VPN su rete Cliente</w:t>
+      </w:r>
+      <w:r>
+        <w:t xml:space="preserve">. </w:t>
+      </w:r>
+      <w:r>
+        <w:t xml:space="preserve">L’attività di Penetration Test è stata effettuata in modalità </w:t>
       </w:r>
       <w:r>
         <w:rPr>
           <w:b/>
         </w:rPr>
-        <w:t>CLIENT]</w:t>
-      </w:r>
-      <w:r>
-        <w:t xml:space="preserve"> per condurre attività di Web Application </w:t>
-      </w:r>
-      <w:proofErr w:type="spellStart"/>
-      <w:r>
-        <w:t>Penetration</w:t>
-      </w:r>
-      <w:proofErr w:type="spellEnd"/>
-      <w:r>
-        <w:t xml:space="preserve"> Test sulle sue applicazioni in esecuzione all'interno/esterno della rete del Cliente. </w:t>
-      </w:r>
-      <w:r>
-        <w:t xml:space="preserve">Le attività tecniche </w:t>
-      </w:r>
-      <w:r>
-        <w:t xml:space="preserve">hanno avuto inizio il giorno XX/XX/XXXX e hanno coinvolto le risorse di </w:t>
-      </w:r>
-      <w:r>
-        <w:t>[TESTING COMPANY NAME]</w:t>
-      </w:r>
-      <w:r>
-        <w:t xml:space="preserve"> per una durata di XX giorni lavorativi </w:t>
-      </w:r>
-      <w:r>
-        <w:t>durante il</w:t>
-      </w:r>
-      <w:r>
-        <w:t xml:space="preserve"> periodo </w:t>
-      </w:r>
-      <w:r>
-        <w:t xml:space="preserve">compreso tra il </w:t>
-      </w:r>
-      <w:r>
-        <w:t xml:space="preserve">XX/XX/XXXX </w:t>
-      </w:r>
-      <w:r>
-        <w:t>e il</w:t>
-      </w:r>
-      <w:r>
-        <w:t xml:space="preserve"> XX/XX/XXXX. I test sono stati condotti </w:t>
-      </w:r>
-      <w:r>
-        <w:t>da</w:t>
-      </w:r>
-      <w:r>
-        <w:t xml:space="preserve"> remoto </w:t>
-      </w:r>
-      <w:r>
-        <w:t xml:space="preserve">presso la </w:t>
-      </w:r>
-      <w:r>
-        <w:t xml:space="preserve">sede di </w:t>
-      </w:r>
-      <w:r>
-        <w:t>[TESTING COMPANY NAME]</w:t>
-      </w:r>
-      <w:r>
-        <w:t xml:space="preserve"> </w:t>
-      </w:r>
-      <w:r>
-        <w:t>/da remoto tramite collegamento VPN su rete Cliente</w:t>
-      </w:r>
-      <w:r>
-        <w:t xml:space="preserve">. </w:t>
-      </w:r>
-      <w:r>
-        <w:t xml:space="preserve">L’attività di </w:t>
-      </w:r>
-      <w:proofErr w:type="spellStart"/>
-      <w:r>
-        <w:t>Penetration</w:t>
-      </w:r>
-      <w:proofErr w:type="spellEnd"/>
-      <w:r>
-        <w:t xml:space="preserve"> Test è stata effettuata in modalità </w:t>
+        <w:t>{testing_mode}</w:t>
       </w:r>
       <w:r>
         <w:rPr>
           <w:b/>
         </w:rPr>
-        <w:t>[TESTING MODE]</w:t>
-      </w:r>
-      <w:r>
         <w:t xml:space="preserve">, </w:t>
       </w:r>
       <w:r>
@@ -3222,13 +3308,14 @@
       <w:r>
         <w:t xml:space="preserve">Il presente documento riassume l’analisi svolta, le evidenze emerse e le azioni mitigative consigliate da </w:t>
       </w:r>
-      <w:proofErr w:type="spellStart"/>
-      <w:r>
-        <w:t>Intellera</w:t>
-      </w:r>
-      <w:proofErr w:type="spellEnd"/>
-      <w:r>
-        <w:t xml:space="preserve"> Consulting per il rientro allo stato di conformità con le best practices in ambito di IT Security</w:t>
+      <w:r>
+        <w:rPr>
+          <w:i/>
+        </w:rPr>
+        <w:t>{testing_company_name}</w:t>
+      </w:r>
+      <w:r>
+        <w:t xml:space="preserve"> per il rientro allo stato di conformità con le best practices in ambito di IT Security</w:t>
       </w:r>
       <w:r>
         <w:t>.</w:t>
@@ -3290,13 +3377,8 @@
         <w:pStyle w:val="ABulletpoint"/>
         <w:spacing w:after="288"/>
       </w:pPr>
-      <w:proofErr w:type="gramStart"/>
-      <w:r>
-        <w:t>Open Source</w:t>
-      </w:r>
-      <w:proofErr w:type="gramEnd"/>
-      <w:r>
-        <w:t xml:space="preserve"> Security Testing Methodology Manual (OSSTMM)</w:t>
+      <w:r>
+        <w:t>Open Source Security Testing Methodology Manual (OSSTMM)</w:t>
       </w:r>
     </w:p>
     <w:p>
@@ -3430,13 +3512,8 @@
         <w:pStyle w:val="BodySubtitle"/>
       </w:pPr>
       <w:r>
-        <w:t xml:space="preserve">Step 1: </w:t>
-      </w:r>
-      <w:proofErr w:type="spellStart"/>
-      <w:r>
-        <w:t>Reconnaissance</w:t>
-      </w:r>
-      <w:proofErr w:type="spellEnd"/>
+        <w:t>Step 1: Reconnaissance</w:t>
+      </w:r>
     </w:p>
     <w:p>
       <w:pPr>
@@ -3444,31 +3521,13 @@
       </w:pPr>
       <w:r>
         <w:lastRenderedPageBreak/>
-        <w:t xml:space="preserve">La prima fase del </w:t>
-      </w:r>
-      <w:proofErr w:type="spellStart"/>
-      <w:r>
-        <w:t>penetration</w:t>
-      </w:r>
-      <w:proofErr w:type="spellEnd"/>
-      <w:r>
-        <w:t xml:space="preserve"> testing è denominata </w:t>
-      </w:r>
-      <w:proofErr w:type="spellStart"/>
+        <w:t xml:space="preserve">La prima fase del penetration testing è denominata </w:t>
+      </w:r>
       <w:r>
         <w:t>reconnaissance</w:t>
       </w:r>
-      <w:proofErr w:type="spellEnd"/>
-      <w:r>
-        <w:t xml:space="preserve">. Durante questa fase, il </w:t>
-      </w:r>
-      <w:proofErr w:type="spellStart"/>
-      <w:r>
-        <w:t>penetration</w:t>
-      </w:r>
-      <w:proofErr w:type="spellEnd"/>
-      <w:r>
-        <w:t xml:space="preserve"> tester raccoglie informazioni sul sistema target, come informazioni sulla topologia della rete, sui sistemi operativi e sulle applicazioni, sugli account utente. L'obiettivo è raccogliere il maggior numero di dati possibile, in modo </w:t>
+      <w:r>
+        <w:t xml:space="preserve">. Durante questa fase, il penetration tester raccoglie informazioni sul sistema target, come informazioni sulla topologia della rete, sui sistemi operativi e sulle applicazioni, sugli account utente. L'obiettivo è raccogliere il maggior numero di dati possibile, in modo </w:t>
       </w:r>
       <w:r>
         <w:t xml:space="preserve">da </w:t>
@@ -3490,11 +3549,9 @@
       <w:r>
         <w:t xml:space="preserve">La fase di </w:t>
       </w:r>
-      <w:proofErr w:type="spellStart"/>
       <w:r>
         <w:t>reconnaissance</w:t>
       </w:r>
-      <w:proofErr w:type="spellEnd"/>
       <w:r>
         <w:t xml:space="preserve"> </w:t>
       </w:r>
@@ -3507,11 +3564,9 @@
       <w:r>
         <w:t xml:space="preserve"> metodi utilizzati per recuperare le informazioni. La </w:t>
       </w:r>
-      <w:proofErr w:type="spellStart"/>
       <w:r>
         <w:t>reconnaissance</w:t>
       </w:r>
-      <w:proofErr w:type="spellEnd"/>
       <w:r>
         <w:t xml:space="preserve"> </w:t>
       </w:r>
@@ -3524,11 +3579,9 @@
       <w:r>
         <w:t xml:space="preserve"> informazioni da risorse già pubblicamente disponibili, mentre la </w:t>
       </w:r>
-      <w:proofErr w:type="spellStart"/>
       <w:r>
         <w:t>reconnaissance</w:t>
       </w:r>
-      <w:proofErr w:type="spellEnd"/>
       <w:r>
         <w:t xml:space="preserve"> </w:t>
       </w:r>
@@ -3536,15 +3589,7 @@
         <w:t>attiva prevede l'interazione diretta con il sistema target</w:t>
       </w:r>
       <w:r>
-        <w:t xml:space="preserve"> per il </w:t>
-      </w:r>
-      <w:proofErr w:type="spellStart"/>
-      <w:r>
-        <w:t>collezionamento</w:t>
-      </w:r>
-      <w:proofErr w:type="spellEnd"/>
-      <w:r>
-        <w:t xml:space="preserve"> dei dati</w:t>
+        <w:t xml:space="preserve"> per il collezionamento dei dati</w:t>
       </w:r>
       <w:r>
         <w:t xml:space="preserve">. </w:t>
@@ -3586,11 +3631,9 @@
       <w:r>
         <w:t xml:space="preserve">fase di </w:t>
       </w:r>
-      <w:proofErr w:type="spellStart"/>
       <w:r>
         <w:t>reconnaissance</w:t>
       </w:r>
-      <w:proofErr w:type="spellEnd"/>
       <w:r>
         <w:t>, il passo successivo consiste nell'eseguire l</w:t>
       </w:r>
@@ -3604,15 +3647,7 @@
         <w:t>scanning</w:t>
       </w:r>
       <w:r>
-        <w:t xml:space="preserve">. In questa fase, il </w:t>
-      </w:r>
-      <w:proofErr w:type="spellStart"/>
-      <w:r>
-        <w:t>penetration</w:t>
-      </w:r>
-      <w:proofErr w:type="spellEnd"/>
-      <w:r>
-        <w:t xml:space="preserve"> tester utilizza vari strumenti </w:t>
+        <w:t xml:space="preserve">. In questa fase, il penetration tester utilizza vari strumenti </w:t>
       </w:r>
       <w:r>
         <w:t>al fine di</w:t>
@@ -3643,30 +3678,38 @@
       <w:r>
         <w:t xml:space="preserve">Questa fase può anche essere eseguita come attività indipendente; in questi casi, viene definita semplicemente </w:t>
       </w:r>
-      <w:proofErr w:type="spellStart"/>
-      <w:r>
-        <w:t>vulnerability</w:t>
-      </w:r>
-      <w:proofErr w:type="spellEnd"/>
+      <w:r>
+        <w:t>vulnerability assessment</w:t>
+      </w:r>
+      <w:r>
+        <w:t xml:space="preserve"> e viene eseguita</w:t>
+      </w:r>
+      <w:r>
+        <w:t xml:space="preserve"> solitamente</w:t>
+      </w:r>
+      <w:r>
+        <w:t xml:space="preserve"> con strumenti automatizzati. Tuttavia, l'esecuzione del sol</w:t>
+      </w:r>
+      <w:r>
+        <w:t xml:space="preserve">o </w:t>
+      </w:r>
+      <w:r>
+        <w:t>scanning</w:t>
+      </w:r>
       <w:r>
         <w:t xml:space="preserve"> </w:t>
       </w:r>
-      <w:proofErr w:type="spellStart"/>
-      <w:r>
-        <w:t>assessment</w:t>
-      </w:r>
-      <w:proofErr w:type="spellEnd"/>
-      <w:r>
-        <w:t xml:space="preserve"> e viene eseguita</w:t>
-      </w:r>
-      <w:r>
-        <w:t xml:space="preserve"> solitamente</w:t>
-      </w:r>
-      <w:r>
-        <w:t xml:space="preserve"> con strumenti automatizzati. Tuttavia, l'esecuzione del sol</w:t>
-      </w:r>
-      <w:r>
-        <w:t xml:space="preserve">o </w:t>
+      <w:r>
+        <w:t>in assenza di analisi dei risultati da parte di un analista</w:t>
+      </w:r>
+      <w:r>
+        <w:t xml:space="preserve"> presenta degli svantaggi. L</w:t>
+      </w:r>
+      <w:r>
+        <w:t>o</w:t>
+      </w:r>
+      <w:r>
+        <w:t xml:space="preserve"> </w:t>
       </w:r>
       <w:r>
         <w:t>scanning</w:t>
@@ -3675,10 +3718,22 @@
         <w:t xml:space="preserve"> </w:t>
       </w:r>
       <w:r>
-        <w:t>in assenza di analisi dei risultati da parte di un analista</w:t>
-      </w:r>
-      <w:r>
-        <w:t xml:space="preserve"> presenta degli svantaggi. L</w:t>
+        <w:t xml:space="preserve">può identificare potenziali difetti, ma non può determinare </w:t>
+      </w:r>
+      <w:r>
+        <w:t xml:space="preserve">l’impatto </w:t>
+      </w:r>
+      <w:r>
+        <w:t>provocato dal</w:t>
+      </w:r>
+      <w:r>
+        <w:t>lo sfruttamento</w:t>
+      </w:r>
+      <w:r>
+        <w:t xml:space="preserve"> delle falle rilevate</w:t>
+      </w:r>
+      <w:r>
+        <w:t>. Pertanto, sebbene l</w:t>
       </w:r>
       <w:r>
         <w:t>o</w:t>
@@ -3693,48 +3748,10 @@
         <w:t xml:space="preserve"> </w:t>
       </w:r>
       <w:r>
-        <w:t xml:space="preserve">può identificare potenziali difetti, ma non può determinare </w:t>
-      </w:r>
-      <w:r>
-        <w:t xml:space="preserve">l’impatto </w:t>
-      </w:r>
-      <w:r>
-        <w:t>provocato dal</w:t>
-      </w:r>
-      <w:r>
-        <w:t>lo sfruttamento</w:t>
-      </w:r>
-      <w:r>
-        <w:t xml:space="preserve"> delle falle rilevate</w:t>
-      </w:r>
-      <w:r>
-        <w:t>. Pertanto, sebbene l</w:t>
-      </w:r>
-      <w:r>
-        <w:t>o</w:t>
-      </w:r>
-      <w:r>
-        <w:t xml:space="preserve"> </w:t>
-      </w:r>
-      <w:r>
-        <w:t>scanning</w:t>
-      </w:r>
-      <w:r>
-        <w:t xml:space="preserve"> </w:t>
-      </w:r>
-      <w:r>
         <w:t xml:space="preserve">sia essenziale per la sicurezza informatica, per raggiungere il suo pieno potenziale ha bisogno dell'intervento </w:t>
       </w:r>
       <w:r>
-        <w:t xml:space="preserve">analitico di </w:t>
-      </w:r>
-      <w:proofErr w:type="spellStart"/>
-      <w:r>
-        <w:t>penetration</w:t>
-      </w:r>
-      <w:proofErr w:type="spellEnd"/>
-      <w:r>
-        <w:t xml:space="preserve"> tester</w:t>
+        <w:t>analitico di penetration tester</w:t>
       </w:r>
       <w:r>
         <w:t>.</w:t>
@@ -3745,72 +3762,31 @@
         <w:pStyle w:val="BodySubtitle"/>
       </w:pPr>
       <w:r>
-        <w:t xml:space="preserve">Step 3: </w:t>
-      </w:r>
-      <w:proofErr w:type="spellStart"/>
-      <w:r>
-        <w:t>Vulnerability</w:t>
-      </w:r>
-      <w:proofErr w:type="spellEnd"/>
-      <w:r>
-        <w:t xml:space="preserve"> </w:t>
-      </w:r>
-      <w:proofErr w:type="spellStart"/>
-      <w:r>
-        <w:t>Assessment</w:t>
-      </w:r>
-      <w:proofErr w:type="spellEnd"/>
+        <w:t>Step 3: Vulnerability Assessment</w:t>
+      </w:r>
     </w:p>
     <w:p>
       <w:pPr>
         <w:pStyle w:val="IntelleraBodyPT"/>
       </w:pPr>
       <w:r>
-        <w:t xml:space="preserve">La terza fase del </w:t>
-      </w:r>
-      <w:proofErr w:type="spellStart"/>
-      <w:r>
-        <w:t>penetration</w:t>
-      </w:r>
-      <w:proofErr w:type="spellEnd"/>
-      <w:r>
-        <w:t xml:space="preserve"> testing è </w:t>
+        <w:t xml:space="preserve">La terza fase del penetration testing è </w:t>
       </w:r>
       <w:r>
         <w:t xml:space="preserve">il </w:t>
       </w:r>
-      <w:proofErr w:type="spellStart"/>
-      <w:r>
-        <w:t>Vulnerability</w:t>
-      </w:r>
-      <w:proofErr w:type="spellEnd"/>
+      <w:r>
+        <w:t>Vulnerability Assessment</w:t>
+      </w:r>
+      <w:r>
+        <w:t xml:space="preserve">. In questa fase, il penetration tester utilizza tutti i dati raccolti nelle fasi di </w:t>
+      </w:r>
+      <w:r>
+        <w:t>reconnaissance</w:t>
+      </w:r>
       <w:r>
         <w:t xml:space="preserve"> </w:t>
       </w:r>
-      <w:proofErr w:type="spellStart"/>
-      <w:r>
-        <w:t>Assessment</w:t>
-      </w:r>
-      <w:proofErr w:type="spellEnd"/>
-      <w:r>
-        <w:t xml:space="preserve">. In questa fase, il </w:t>
-      </w:r>
-      <w:proofErr w:type="spellStart"/>
-      <w:r>
-        <w:t>penetration</w:t>
-      </w:r>
-      <w:proofErr w:type="spellEnd"/>
-      <w:r>
-        <w:t xml:space="preserve"> tester utilizza tutti i dati raccolti nelle fasi di </w:t>
-      </w:r>
-      <w:proofErr w:type="spellStart"/>
-      <w:r>
-        <w:t>reconnaissance</w:t>
-      </w:r>
-      <w:proofErr w:type="spellEnd"/>
-      <w:r>
-        <w:t xml:space="preserve"> </w:t>
-      </w:r>
       <w:r>
         <w:t xml:space="preserve">e </w:t>
       </w:r>
@@ -3821,13 +3797,8 @@
         <w:t xml:space="preserve"> per identificare le potenziali vulnerabilità</w:t>
       </w:r>
       <w:r>
-        <w:t xml:space="preserve">, comprenderne l’impatto e l’effettiva </w:t>
-      </w:r>
-      <w:proofErr w:type="spellStart"/>
-      <w:r>
-        <w:t>sfruttabilità</w:t>
-      </w:r>
-      <w:proofErr w:type="spellEnd"/>
+        <w:t>, comprenderne l’impatto e l’effettiva sfruttabilità</w:t>
+      </w:r>
       <w:r>
         <w:t xml:space="preserve">. </w:t>
       </w:r>
@@ -3852,15 +3823,7 @@
         <w:t>rilevate</w:t>
       </w:r>
       <w:r>
-        <w:t xml:space="preserve"> in questa fase, i </w:t>
-      </w:r>
-      <w:proofErr w:type="spellStart"/>
-      <w:r>
-        <w:t>penetration</w:t>
-      </w:r>
-      <w:proofErr w:type="spellEnd"/>
-      <w:r>
-        <w:t xml:space="preserve"> tester </w:t>
+        <w:t xml:space="preserve"> in questa fase, i penetration tester </w:t>
       </w:r>
       <w:r>
         <w:t>attingere a diverse risorse</w:t>
@@ -3869,35 +3832,14 @@
         <w:t xml:space="preserve">. Una di queste è il </w:t>
       </w:r>
       <w:r>
-        <w:t xml:space="preserve">National </w:t>
-      </w:r>
-      <w:proofErr w:type="spellStart"/>
-      <w:r>
-        <w:t>Vulnerability</w:t>
-      </w:r>
-      <w:proofErr w:type="spellEnd"/>
-      <w:r>
-        <w:t xml:space="preserve"> Database</w:t>
+        <w:t>National Vulnerability Database</w:t>
       </w:r>
       <w:r>
         <w:t xml:space="preserve"> (NVD), un archivio di dati sulla gestione delle vulnerabilità creato e mantenuto dal governo degli Stati Uniti che analizza le vulnerabilità del software pubblicate nel database </w:t>
       </w:r>
       <w:r>
-        <w:t xml:space="preserve">Common </w:t>
-      </w:r>
-      <w:proofErr w:type="spellStart"/>
-      <w:r>
-        <w:t>Vulnerabilities</w:t>
-      </w:r>
-      <w:proofErr w:type="spellEnd"/>
-      <w:r>
-        <w:t xml:space="preserve"> and </w:t>
-      </w:r>
-      <w:proofErr w:type="spellStart"/>
-      <w:r>
-        <w:t>Exposures</w:t>
-      </w:r>
-      <w:proofErr w:type="spellEnd"/>
+        <w:t>Common Vulnerabilities and Exposures</w:t>
+      </w:r>
       <w:r>
         <w:t xml:space="preserve"> (CVE). L'NVD valuta la gravità delle vulnerabilità </w:t>
       </w:r>
@@ -3914,15 +3856,7 @@
         <w:t xml:space="preserve"> </w:t>
       </w:r>
       <w:r>
-        <w:t xml:space="preserve">Common </w:t>
-      </w:r>
-      <w:proofErr w:type="spellStart"/>
-      <w:r>
-        <w:t>Vulnerability</w:t>
-      </w:r>
-      <w:proofErr w:type="spellEnd"/>
-      <w:r>
-        <w:t xml:space="preserve"> Scoring System </w:t>
+        <w:t xml:space="preserve">Common Vulnerability Scoring System </w:t>
       </w:r>
       <w:r>
         <w:t xml:space="preserve">(CVSS), attraverso il quale è possibile </w:t>
@@ -3969,21 +3903,11 @@
         <w:t>exploitation</w:t>
       </w:r>
       <w:r>
-        <w:t xml:space="preserve">. In questa fase, il </w:t>
-      </w:r>
-      <w:proofErr w:type="spellStart"/>
-      <w:r>
-        <w:t>penetration</w:t>
-      </w:r>
-      <w:proofErr w:type="spellEnd"/>
-      <w:r>
-        <w:t xml:space="preserve"> tester tenta di accedere al sistema target e di sfruttare le vulnerabilità identificate. Ciò avviene utilizzando strumenti automatizzati come </w:t>
-      </w:r>
-      <w:proofErr w:type="spellStart"/>
+        <w:t xml:space="preserve">. In questa fase, il penetration tester tenta di accedere al sistema target e di sfruttare le vulnerabilità identificate. Ciò avviene utilizzando strumenti automatizzati come </w:t>
+      </w:r>
       <w:r>
         <w:t>Metasploit</w:t>
       </w:r>
-      <w:proofErr w:type="spellEnd"/>
       <w:r>
         <w:t xml:space="preserve"> combinati con attività manuali, </w:t>
       </w:r>
@@ -4005,15 +3929,7 @@
         <w:t xml:space="preserve">più delicata </w:t>
       </w:r>
       <w:r>
-        <w:t xml:space="preserve">nell’esecuzione di un </w:t>
-      </w:r>
-      <w:proofErr w:type="spellStart"/>
-      <w:r>
-        <w:t>penetration</w:t>
-      </w:r>
-      <w:proofErr w:type="spellEnd"/>
-      <w:r>
-        <w:t xml:space="preserve"> test</w:t>
+        <w:t>nell’esecuzione di un penetration test</w:t>
       </w:r>
       <w:r>
         <w:t xml:space="preserve">, </w:t>
@@ -4119,15 +4035,7 @@
         <w:t>exploitation</w:t>
       </w:r>
       <w:r>
-        <w:t xml:space="preserve">, i </w:t>
-      </w:r>
-      <w:proofErr w:type="spellStart"/>
-      <w:r>
-        <w:t>penetration</w:t>
-      </w:r>
-      <w:proofErr w:type="spellEnd"/>
-      <w:r>
-        <w:t xml:space="preserve"> tester preparano </w:t>
+        <w:t xml:space="preserve">, i penetration tester preparano </w:t>
       </w:r>
       <w:r>
         <w:t>la</w:t>
@@ -4151,15 +4059,7 @@
         <w:t xml:space="preserve">report </w:t>
       </w:r>
       <w:r>
-        <w:t xml:space="preserve">generato in questa fase finale di </w:t>
-      </w:r>
-      <w:proofErr w:type="spellStart"/>
-      <w:r>
-        <w:t>penetration</w:t>
-      </w:r>
-      <w:proofErr w:type="spellEnd"/>
-      <w:r>
-        <w:t xml:space="preserve"> testing </w:t>
+        <w:t xml:space="preserve">generato in questa fase finale di penetration testing </w:t>
       </w:r>
       <w:r>
         <w:t xml:space="preserve">è finalizzato a guidare l’organizzazione nel </w:t>
@@ -4191,15 +4091,7 @@
         <w:t xml:space="preserve">report </w:t>
       </w:r>
       <w:r>
-        <w:t xml:space="preserve">di </w:t>
-      </w:r>
-      <w:proofErr w:type="spellStart"/>
-      <w:r>
-        <w:t>penetration</w:t>
-      </w:r>
-      <w:proofErr w:type="spellEnd"/>
-      <w:r>
-        <w:t xml:space="preserve"> test </w:t>
+        <w:t xml:space="preserve">di penetration test </w:t>
       </w:r>
       <w:r>
         <w:t>prevede la</w:t>
@@ -4274,7 +4166,6 @@
       <w:r>
         <w:t xml:space="preserve">La descrizione di ogni problema di sicurezza individuato è composta da un </w:t>
       </w:r>
-      <w:proofErr w:type="spellStart"/>
       <w:r>
         <w:rPr>
           <w:i/>
@@ -4282,7 +4173,6 @@
         </w:rPr>
         <w:t>finding</w:t>
       </w:r>
-      <w:proofErr w:type="spellEnd"/>
       <w:r>
         <w:t xml:space="preserve">, dall’impatto della criticità rilevata, dalla semplicità di esecuzione dell’attacco da parte di un utente malintenzionato e da un suggerimento sulle contromisure da </w:t>
       </w:r>
@@ -4311,23 +4201,7 @@
           <w:i/>
           <w:iCs/>
         </w:rPr>
-        <w:t xml:space="preserve">Common </w:t>
-      </w:r>
-      <w:proofErr w:type="spellStart"/>
-      <w:r>
-        <w:rPr>
-          <w:i/>
-          <w:iCs/>
-        </w:rPr>
-        <w:t>Vulnerability</w:t>
-      </w:r>
-      <w:proofErr w:type="spellEnd"/>
-      <w:r>
-        <w:rPr>
-          <w:i/>
-          <w:iCs/>
-        </w:rPr>
-        <w:t xml:space="preserve"> Scoring System</w:t>
+        <w:t>Common Vulnerability Scoring System</w:t>
       </w:r>
       <w:r>
         <w:t xml:space="preserve"> (CVSS</w:t>
@@ -4415,7 +4289,6 @@
                 <w:b w:val="0"/>
               </w:rPr>
             </w:pPr>
-            <w:proofErr w:type="spellStart"/>
             <w:r>
               <w:rPr>
                 <w:rFonts w:ascii="Segoe UI" w:hAnsi="Segoe UI" w:cs="Segoe UI"/>
@@ -4423,7 +4296,6 @@
               </w:rPr>
               <w:t>Severità</w:t>
             </w:r>
-            <w:proofErr w:type="spellEnd"/>
           </w:p>
         </w:tc>
         <w:tc>
@@ -4474,7 +4346,6 @@
                 <w:rFonts w:ascii="Segoe UI" w:eastAsia="Times New Roman" w:hAnsi="Segoe UI" w:cs="Segoe UI"/>
               </w:rPr>
             </w:pPr>
-            <w:proofErr w:type="spellStart"/>
             <w:r>
               <w:rPr>
                 <w:rFonts w:ascii="Segoe UI" w:eastAsia="Times New Roman" w:hAnsi="Segoe UI" w:cs="Segoe UI"/>
@@ -4482,7 +4353,6 @@
               </w:rPr>
               <w:t>Nessuna</w:t>
             </w:r>
-            <w:proofErr w:type="spellEnd"/>
           </w:p>
         </w:tc>
         <w:tc>
@@ -4678,14 +4548,12 @@
                 <w:color w:val="FFFFFF" w:themeColor="background1"/>
               </w:rPr>
             </w:pPr>
-            <w:proofErr w:type="spellStart"/>
             <w:r>
               <w:rPr>
                 <w:rFonts w:ascii="Segoe UI" w:hAnsi="Segoe UI" w:cs="Segoe UI"/>
               </w:rPr>
               <w:t>Critica</w:t>
             </w:r>
-            <w:proofErr w:type="spellEnd"/>
           </w:p>
         </w:tc>
         <w:tc>
@@ -4836,7 +4704,6 @@
                 <w:szCs w:val="22"/>
               </w:rPr>
             </w:pPr>
-            <w:proofErr w:type="spellStart"/>
             <w:r>
               <w:rPr>
                 <w:rFonts w:ascii="Segoe UI" w:eastAsiaTheme="minorEastAsia" w:hAnsi="Segoe UI" w:cs="Segoe UI"/>
@@ -4846,7 +4713,6 @@
               </w:rPr>
               <w:t>Applicazione</w:t>
             </w:r>
-            <w:proofErr w:type="spellEnd"/>
           </w:p>
         </w:tc>
         <w:tc>
@@ -4906,19 +4772,30 @@
           <w:p>
             <w:pPr>
               <w:rPr>
-                <w:rFonts w:ascii="Calibri" w:eastAsia="Times New Roman" w:hAnsi="Calibri" w:cs="Calibri"/>
-                <w:color w:val="000000"/>
-                <w:sz w:val="22"/>
-                <w:szCs w:val="22"/>
-                <w:lang w:val="en-US"/>
-              </w:rPr>
-            </w:pPr>
-            <w:r>
-              <w:rPr>
                 <w:rFonts w:ascii="Segoe UI" w:eastAsia="Times New Roman" w:hAnsi="Segoe UI" w:cs="Segoe UI"/>
                 <w:lang w:val="en-US" w:eastAsia="it-IT"/>
               </w:rPr>
-              <w:t>[TARGET1 NAME]</w:t>
+            </w:pPr>
+            <w:r>
+              <w:rPr>
+                <w:rFonts w:ascii="Segoe UI" w:eastAsia="Times New Roman" w:hAnsi="Segoe UI" w:cs="Segoe UI"/>
+                <w:lang w:val="en-US" w:eastAsia="it-IT"/>
+              </w:rPr>
+              <w:t>{#target</w:t>
+            </w:r>
+            <w:r>
+              <w:rPr>
+                <w:rFonts w:ascii="Segoe UI" w:eastAsia="Times New Roman" w:hAnsi="Segoe UI" w:cs="Segoe UI"/>
+                <w:lang w:val="en-US" w:eastAsia="it-IT"/>
+              </w:rPr>
+              <w:t>s</w:t>
+            </w:r>
+            <w:r>
+              <w:rPr>
+                <w:rFonts w:ascii="Segoe UI" w:eastAsia="Times New Roman" w:hAnsi="Segoe UI" w:cs="Segoe UI"/>
+                <w:lang w:val="en-US" w:eastAsia="it-IT"/>
+              </w:rPr>
+              <w:t>}{name}</w:t>
             </w:r>
           </w:p>
         </w:tc>
@@ -4941,86 +4818,11 @@
               <w:keepNext/>
               <w:cnfStyle w:val="000000100000" w:firstRow="0" w:lastRow="0" w:firstColumn="0" w:lastColumn="0" w:oddVBand="0" w:evenVBand="0" w:oddHBand="1" w:evenHBand="0" w:firstRowFirstColumn="0" w:firstRowLastColumn="0" w:lastRowFirstColumn="0" w:lastRowLastColumn="0"/>
               <w:rPr>
-                <w:rFonts w:ascii="Calibri" w:eastAsia="Times New Roman" w:hAnsi="Calibri" w:cs="Calibri"/>
-                <w:color w:val="000000"/>
-                <w:sz w:val="22"/>
-                <w:szCs w:val="22"/>
-                <w:lang w:val="en-US"/>
-              </w:rPr>
-            </w:pPr>
-            <w:r>
-              <w:rPr>
                 <w:rFonts w:ascii="Segoe UI" w:eastAsia="Times New Roman" w:hAnsi="Segoe UI" w:cs="Segoe UI"/>
                 <w:b/>
                 <w:bCs/>
                 <w:lang w:val="en-US" w:eastAsia="it-IT"/>
               </w:rPr>
-              <w:t>[TARGET1 URL]</w:t>
-            </w:r>
-          </w:p>
-        </w:tc>
-      </w:tr>
-      <w:tr>
-        <w:trPr>
-          <w:trHeight w:val="288"/>
-        </w:trPr>
-        <w:tc>
-          <w:tcPr>
-            <w:cnfStyle w:val="001000000000" w:firstRow="0" w:lastRow="0" w:firstColumn="1" w:lastColumn="0" w:oddVBand="0" w:evenVBand="0" w:oddHBand="0" w:evenHBand="0" w:firstRowFirstColumn="0" w:firstRowLastColumn="0" w:lastRowFirstColumn="0" w:lastRowLastColumn="0"/>
-            <w:tcW w:w="2500" w:type="pct"/>
-            <w:tcBorders>
-              <w:top w:val="single" w:sz="4" w:space="0" w:color="auto"/>
-              <w:left w:val="single" w:sz="4" w:space="0" w:color="auto"/>
-              <w:bottom w:val="single" w:sz="4" w:space="0" w:color="auto"/>
-              <w:right w:val="single" w:sz="4" w:space="0" w:color="auto"/>
-            </w:tcBorders>
-            <w:shd w:val="clear" w:color="auto" w:fill="FFFFFF" w:themeFill="background1"/>
-            <w:noWrap/>
-            <w:vAlign w:val="center"/>
-          </w:tcPr>
-          <w:p>
-            <w:pPr>
-              <w:rPr>
-                <w:rFonts w:ascii="Calibri" w:eastAsia="Times New Roman" w:hAnsi="Calibri" w:cs="Calibri"/>
-                <w:color w:val="000000"/>
-                <w:sz w:val="22"/>
-                <w:szCs w:val="22"/>
-                <w:lang w:val="en-US"/>
-              </w:rPr>
-            </w:pPr>
-            <w:r>
-              <w:rPr>
-                <w:rFonts w:ascii="Segoe UI" w:eastAsia="Times New Roman" w:hAnsi="Segoe UI" w:cs="Segoe UI"/>
-                <w:lang w:val="en-US" w:eastAsia="it-IT"/>
-              </w:rPr>
-              <w:t>[TARGET2 NAME]</w:t>
-            </w:r>
-          </w:p>
-        </w:tc>
-        <w:tc>
-          <w:tcPr>
-            <w:tcW w:w="2500" w:type="pct"/>
-            <w:tcBorders>
-              <w:top w:val="single" w:sz="4" w:space="0" w:color="auto"/>
-              <w:left w:val="single" w:sz="4" w:space="0" w:color="auto"/>
-              <w:bottom w:val="single" w:sz="4" w:space="0" w:color="auto"/>
-              <w:right w:val="single" w:sz="4" w:space="0" w:color="auto"/>
-            </w:tcBorders>
-            <w:shd w:val="clear" w:color="auto" w:fill="FFFFFF" w:themeFill="background1"/>
-            <w:noWrap/>
-            <w:vAlign w:val="center"/>
-          </w:tcPr>
-          <w:p>
-            <w:pPr>
-              <w:keepNext/>
-              <w:cnfStyle w:val="000000000000" w:firstRow="0" w:lastRow="0" w:firstColumn="0" w:lastColumn="0" w:oddVBand="0" w:evenVBand="0" w:oddHBand="0" w:evenHBand="0" w:firstRowFirstColumn="0" w:firstRowLastColumn="0" w:lastRowFirstColumn="0" w:lastRowLastColumn="0"/>
-              <w:rPr>
-                <w:rFonts w:ascii="Calibri" w:eastAsia="Times New Roman" w:hAnsi="Calibri" w:cs="Calibri"/>
-                <w:color w:val="000000"/>
-                <w:sz w:val="22"/>
-                <w:szCs w:val="22"/>
-                <w:lang w:val="en-US"/>
-              </w:rPr>
             </w:pPr>
             <w:r>
               <w:rPr>
@@ -5029,7 +4831,61 @@
                 <w:bCs/>
                 <w:lang w:val="en-US" w:eastAsia="it-IT"/>
               </w:rPr>
-              <w:t>[TARGET2 URL]</w:t>
+              <w:t>{</w:t>
+            </w:r>
+            <w:r>
+              <w:rPr>
+                <w:rFonts w:ascii="Segoe UI" w:eastAsia="Times New Roman" w:hAnsi="Segoe UI" w:cs="Segoe UI"/>
+                <w:b/>
+                <w:bCs/>
+                <w:lang w:val="en-US" w:eastAsia="it-IT"/>
+              </w:rPr>
+              <w:t>url</w:t>
+            </w:r>
+            <w:r>
+              <w:rPr>
+                <w:rFonts w:ascii="Segoe UI" w:eastAsia="Times New Roman" w:hAnsi="Segoe UI" w:cs="Segoe UI"/>
+                <w:b/>
+                <w:bCs/>
+                <w:lang w:val="en-US" w:eastAsia="it-IT"/>
+              </w:rPr>
+              <w:t>}{</w:t>
+            </w:r>
+            <w:r>
+              <w:rPr>
+                <w:rFonts w:ascii="Segoe UI" w:eastAsia="Times New Roman" w:hAnsi="Segoe UI" w:cs="Segoe UI"/>
+                <w:b/>
+                <w:bCs/>
+                <w:lang w:val="en-US" w:eastAsia="it-IT"/>
+              </w:rPr>
+              <w:t>/</w:t>
+            </w:r>
+            <w:r>
+              <w:rPr>
+                <w:rFonts w:ascii="Segoe UI" w:eastAsia="Times New Roman" w:hAnsi="Segoe UI" w:cs="Segoe UI"/>
+                <w:b/>
+                <w:bCs/>
+                <w:lang w:val="en-US" w:eastAsia="it-IT"/>
+              </w:rPr>
+              <w:t>target</w:t>
+            </w:r>
+            <w:r>
+              <w:rPr>
+                <w:rFonts w:ascii="Segoe UI" w:eastAsia="Times New Roman" w:hAnsi="Segoe UI" w:cs="Segoe UI"/>
+                <w:b/>
+                <w:bCs/>
+                <w:lang w:val="en-US" w:eastAsia="it-IT"/>
+              </w:rPr>
+              <w:t>s</w:t>
+            </w:r>
+            <w:r>
+              <w:rPr>
+                <w:rFonts w:ascii="Segoe UI" w:eastAsia="Times New Roman" w:hAnsi="Segoe UI" w:cs="Segoe UI"/>
+                <w:b/>
+                <w:bCs/>
+                <w:lang w:val="en-US" w:eastAsia="it-IT"/>
+              </w:rPr>
+              <w:t>}</w:t>
             </w:r>
           </w:p>
         </w:tc>
@@ -5098,21 +4954,7 @@
         <w:rPr>
           <w:lang w:eastAsia="it-IT"/>
         </w:rPr>
-        <w:t>tilizzate per condurre l’</w:t>
-      </w:r>
-      <w:proofErr w:type="spellStart"/>
-      <w:r>
-        <w:rPr>
-          <w:lang w:eastAsia="it-IT"/>
-        </w:rPr>
-        <w:t>assessment</w:t>
-      </w:r>
-      <w:proofErr w:type="spellEnd"/>
-      <w:r>
-        <w:rPr>
-          <w:lang w:eastAsia="it-IT"/>
-        </w:rPr>
-        <w:t xml:space="preserve"> di sicurezza:</w:t>
+        <w:t>tilizzate per condurre l’assessment di sicurezza:</w:t>
       </w:r>
     </w:p>
     <w:tbl>
@@ -5151,7 +4993,6 @@
                 <w:szCs w:val="22"/>
               </w:rPr>
             </w:pPr>
-            <w:proofErr w:type="spellStart"/>
             <w:r>
               <w:rPr>
                 <w:rFonts w:ascii="Segoe UI" w:eastAsiaTheme="minorEastAsia" w:hAnsi="Segoe UI" w:cs="Segoe UI"/>
@@ -5161,7 +5002,6 @@
               </w:rPr>
               <w:t>Utenza</w:t>
             </w:r>
-            <w:proofErr w:type="spellEnd"/>
           </w:p>
         </w:tc>
         <w:tc>
@@ -5186,7 +5026,6 @@
                 <w:szCs w:val="22"/>
               </w:rPr>
             </w:pPr>
-            <w:proofErr w:type="spellStart"/>
             <w:r>
               <w:rPr>
                 <w:rFonts w:ascii="Segoe UI" w:hAnsi="Segoe UI" w:cs="Segoe UI"/>
@@ -5196,7 +5035,6 @@
               </w:rPr>
               <w:t>Descrizione</w:t>
             </w:r>
-            <w:proofErr w:type="spellEnd"/>
           </w:p>
         </w:tc>
       </w:tr>
@@ -5234,21 +5072,28 @@
                 <w:rFonts w:ascii="Segoe UI" w:eastAsia="Times New Roman" w:hAnsi="Segoe UI" w:cs="Segoe UI"/>
                 <w:lang w:val="en-US" w:eastAsia="it-IT"/>
               </w:rPr>
-              <w:t>[USER</w:t>
+              <w:t>{</w:t>
             </w:r>
             <w:r>
               <w:rPr>
                 <w:rFonts w:ascii="Segoe UI" w:eastAsia="Times New Roman" w:hAnsi="Segoe UI" w:cs="Segoe UI"/>
                 <w:lang w:val="en-US" w:eastAsia="it-IT"/>
               </w:rPr>
-              <w:t>NAME1</w:t>
+              <w:t>#</w:t>
             </w:r>
             <w:r>
               <w:rPr>
                 <w:rFonts w:ascii="Segoe UI" w:eastAsia="Times New Roman" w:hAnsi="Segoe UI" w:cs="Segoe UI"/>
                 <w:lang w:val="en-US" w:eastAsia="it-IT"/>
               </w:rPr>
-              <w:t>]</w:t>
+              <w:t>credentials</w:t>
+            </w:r>
+            <w:r>
+              <w:rPr>
+                <w:rFonts w:ascii="Segoe UI" w:eastAsia="Times New Roman" w:hAnsi="Segoe UI" w:cs="Segoe UI"/>
+                <w:lang w:val="en-US" w:eastAsia="it-IT"/>
+              </w:rPr>
+              <w:t>}{username}</w:t>
             </w:r>
           </w:p>
         </w:tc>
@@ -5285,73 +5130,8 @@
                 <w:bCs/>
                 <w:lang w:val="en-US" w:eastAsia="it-IT"/>
               </w:rPr>
-              <w:t>[USERNAME1 DESCRIPTION]</w:t>
-            </w:r>
-          </w:p>
-        </w:tc>
-      </w:tr>
-      <w:tr>
-        <w:trPr>
-          <w:trHeight w:val="288"/>
-        </w:trPr>
-        <w:tc>
-          <w:tcPr>
-            <w:cnfStyle w:val="001000000000" w:firstRow="0" w:lastRow="0" w:firstColumn="1" w:lastColumn="0" w:oddVBand="0" w:evenVBand="0" w:oddHBand="0" w:evenHBand="0" w:firstRowFirstColumn="0" w:firstRowLastColumn="0" w:lastRowFirstColumn="0" w:lastRowLastColumn="0"/>
-            <w:tcW w:w="2500" w:type="pct"/>
-            <w:tcBorders>
-              <w:top w:val="single" w:sz="4" w:space="0" w:color="auto"/>
-              <w:left w:val="single" w:sz="4" w:space="0" w:color="auto"/>
-              <w:bottom w:val="single" w:sz="4" w:space="0" w:color="auto"/>
-              <w:right w:val="single" w:sz="4" w:space="0" w:color="auto"/>
-            </w:tcBorders>
-            <w:shd w:val="clear" w:color="auto" w:fill="FFFFFF" w:themeFill="background1"/>
-            <w:noWrap/>
-            <w:vAlign w:val="center"/>
-          </w:tcPr>
-          <w:p>
-            <w:pPr>
-              <w:rPr>
-                <w:rFonts w:ascii="Calibri" w:eastAsia="Times New Roman" w:hAnsi="Calibri" w:cs="Calibri"/>
-                <w:color w:val="000000"/>
-                <w:sz w:val="22"/>
-                <w:szCs w:val="22"/>
-                <w:lang w:val="en-US"/>
-              </w:rPr>
-            </w:pPr>
-            <w:r>
-              <w:rPr>
-                <w:rFonts w:ascii="Segoe UI" w:eastAsia="Times New Roman" w:hAnsi="Segoe UI" w:cs="Segoe UI"/>
-                <w:lang w:val="en-US" w:eastAsia="it-IT"/>
-              </w:rPr>
-              <w:t>[USERNAME2]</w:t>
-            </w:r>
-          </w:p>
-        </w:tc>
-        <w:tc>
-          <w:tcPr>
-            <w:tcW w:w="2500" w:type="pct"/>
-            <w:tcBorders>
-              <w:top w:val="single" w:sz="4" w:space="0" w:color="auto"/>
-              <w:left w:val="single" w:sz="4" w:space="0" w:color="auto"/>
-              <w:bottom w:val="single" w:sz="4" w:space="0" w:color="auto"/>
-              <w:right w:val="single" w:sz="4" w:space="0" w:color="auto"/>
-            </w:tcBorders>
-            <w:shd w:val="clear" w:color="auto" w:fill="FFFFFF" w:themeFill="background1"/>
-            <w:noWrap/>
-            <w:vAlign w:val="center"/>
-          </w:tcPr>
-          <w:p>
-            <w:pPr>
-              <w:keepNext/>
-              <w:cnfStyle w:val="000000000000" w:firstRow="0" w:lastRow="0" w:firstColumn="0" w:lastColumn="0" w:oddVBand="0" w:evenVBand="0" w:oddHBand="0" w:evenHBand="0" w:firstRowFirstColumn="0" w:firstRowLastColumn="0" w:lastRowFirstColumn="0" w:lastRowLastColumn="0"/>
-              <w:rPr>
-                <w:rFonts w:ascii="Calibri" w:eastAsia="Times New Roman" w:hAnsi="Calibri" w:cs="Calibri"/>
-                <w:color w:val="000000"/>
-                <w:sz w:val="22"/>
-                <w:szCs w:val="22"/>
-                <w:lang w:val="en-US"/>
-              </w:rPr>
-            </w:pPr>
+              <w:t>{</w:t>
+            </w:r>
             <w:r>
               <w:rPr>
                 <w:rFonts w:ascii="Segoe UI" w:eastAsia="Times New Roman" w:hAnsi="Segoe UI" w:cs="Segoe UI"/>
@@ -5359,7 +5139,7 @@
                 <w:bCs/>
                 <w:lang w:val="en-US" w:eastAsia="it-IT"/>
               </w:rPr>
-              <w:t>[USERNAME</w:t>
+              <w:t>description</w:t>
             </w:r>
             <w:r>
               <w:rPr>
@@ -5368,7 +5148,7 @@
                 <w:bCs/>
                 <w:lang w:val="en-US" w:eastAsia="it-IT"/>
               </w:rPr>
-              <w:t>2</w:t>
+              <w:t>}{</w:t>
             </w:r>
             <w:r>
               <w:rPr>
@@ -5377,7 +5157,16 @@
                 <w:bCs/>
                 <w:lang w:val="en-US" w:eastAsia="it-IT"/>
               </w:rPr>
-              <w:t xml:space="preserve"> DESCRIPTION]</w:t>
+              <w:t>/</w:t>
+            </w:r>
+            <w:r>
+              <w:rPr>
+                <w:rFonts w:ascii="Segoe UI" w:eastAsia="Times New Roman" w:hAnsi="Segoe UI" w:cs="Segoe UI"/>
+                <w:b/>
+                <w:bCs/>
+                <w:lang w:val="en-US" w:eastAsia="it-IT"/>
+              </w:rPr>
+              <w:t>credentials}</w:t>
             </w:r>
           </w:p>
         </w:tc>
@@ -5416,14 +5205,9 @@
         <w:t xml:space="preserve">: </w:t>
       </w:r>
       <w:r>
-        <w:t xml:space="preserve">Utenze utilizzate per l’attività di </w:t>
-      </w:r>
-      <w:proofErr w:type="spellStart"/>
-      <w:r>
-        <w:t>assessment</w:t>
+        <w:t>Utenze utilizzate per l’attività di assessment</w:t>
       </w:r>
       <w:bookmarkEnd w:id="21"/>
-      <w:proofErr w:type="spellEnd"/>
     </w:p>
     <w:p>
       <w:pPr>
@@ -5488,21 +5272,7 @@
         <w:rPr>
           <w:lang w:eastAsia="it-IT"/>
         </w:rPr>
-        <w:t xml:space="preserve">del presente </w:t>
-      </w:r>
-      <w:proofErr w:type="spellStart"/>
-      <w:r>
-        <w:rPr>
-          <w:lang w:eastAsia="it-IT"/>
-        </w:rPr>
-        <w:t>Penetration</w:t>
-      </w:r>
-      <w:proofErr w:type="spellEnd"/>
-      <w:r>
-        <w:rPr>
-          <w:lang w:eastAsia="it-IT"/>
-        </w:rPr>
-        <w:t xml:space="preserve"> Test:</w:t>
+        <w:t>del presente Penetration Test:</w:t>
       </w:r>
     </w:p>
     <w:p>
@@ -5519,23 +5289,13 @@
         </w:rPr>
         <w:t>Attacchi che mirano a provocare disservizi all’applicazione o ad utenti (</w:t>
       </w:r>
-      <w:proofErr w:type="spellStart"/>
       <w:r>
         <w:rPr>
           <w:i/>
           <w:iCs/>
           <w:lang w:val="it-IT" w:eastAsia="it-IT"/>
         </w:rPr>
-        <w:t>Denial</w:t>
-      </w:r>
-      <w:proofErr w:type="spellEnd"/>
-      <w:r>
-        <w:rPr>
-          <w:i/>
-          <w:iCs/>
-          <w:lang w:val="it-IT" w:eastAsia="it-IT"/>
-        </w:rPr>
-        <w:t xml:space="preserve"> of Service</w:t>
+        <w:t>Denial of Service</w:t>
       </w:r>
       <w:r>
         <w:rPr>
@@ -5558,28 +5318,12 @@
           <w:lang w:eastAsia="it-IT"/>
         </w:rPr>
       </w:pPr>
-      <w:proofErr w:type="spellStart"/>
       <w:r>
         <w:rPr>
           <w:lang w:eastAsia="it-IT"/>
         </w:rPr>
-        <w:t>Attività</w:t>
-      </w:r>
-      <w:proofErr w:type="spellEnd"/>
-      <w:r>
-        <w:rPr>
-          <w:lang w:eastAsia="it-IT"/>
-        </w:rPr>
-        <w:t xml:space="preserve"> di </w:t>
-      </w:r>
-      <w:proofErr w:type="spellStart"/>
-      <w:r>
-        <w:rPr>
-          <w:lang w:eastAsia="it-IT"/>
-        </w:rPr>
-        <w:t>rimedio</w:t>
-      </w:r>
-      <w:proofErr w:type="spellEnd"/>
+        <w:t>Attività di rimedio</w:t>
+      </w:r>
       <w:r>
         <w:rPr>
           <w:lang w:eastAsia="it-IT"/>
@@ -5634,7 +5378,13 @@
         <w:t xml:space="preserve">effettuate e dei risultati ottenuti, </w:t>
       </w:r>
       <w:r>
-        <w:t xml:space="preserve">[TESTING COMPANY NAME] </w:t>
+        <w:rPr>
+          <w:i/>
+        </w:rPr>
+        <w:t>{testing_company_name}</w:t>
+      </w:r>
+      <w:r>
+        <w:t xml:space="preserve"> </w:t>
       </w:r>
       <w:r>
         <w:t xml:space="preserve">segnala che l’infrastruttura tecnologica </w:t>
@@ -5643,30 +5393,33 @@
         <w:t xml:space="preserve">e il livello di sicurezza dell’applicativo </w:t>
       </w:r>
       <w:r>
-        <w:t>[TARGET</w:t>
-      </w:r>
-      <w:r>
-        <w:t>1 NAME</w:t>
-      </w:r>
-      <w:r>
-        <w:t>]</w:t>
-      </w:r>
-      <w:r>
-        <w:t xml:space="preserve"> </w:t>
+        <w:t>{#target</w:t>
+      </w:r>
+      <w:r>
+        <w:t>s</w:t>
+      </w:r>
+      <w:r>
+        <w:t>} {name} {/target</w:t>
+      </w:r>
+      <w:r>
+        <w:t>s</w:t>
+      </w:r>
+      <w:r>
+        <w:t xml:space="preserve">} </w:t>
       </w:r>
       <w:r>
         <w:t xml:space="preserve">di </w:t>
       </w:r>
       <w:r>
-        <w:t>[</w:t>
-      </w:r>
-      <w:r>
         <w:rPr>
-          <w:b/>
+          <w:i/>
         </w:rPr>
-        <w:t>CLIENT]</w:t>
-      </w:r>
-      <w:r>
+        <w:t>{client_name}</w:t>
+      </w:r>
+      <w:r>
+        <w:rPr>
+          <w:i/>
+        </w:rPr>
         <w:t xml:space="preserve"> </w:t>
       </w:r>
       <w:r>
@@ -5690,7 +5443,10 @@
         <w:pStyle w:val="IntelleraBodyPT"/>
       </w:pPr>
       <w:r>
-        <w:t>Dalle attività di verifica è emersa, attraverso la funzionalità del framework applicativo di salvare gli stati della sessione utente, la possibilità di iniettare codice arbitrario all’interno di oggetti Java. Questo viene eseguito quando viene interpretato dal server.</w:t>
+        <w:t>{executive_summary}</w:t>
+      </w:r>
+      <w:r>
+        <w:t>.</w:t>
       </w:r>
     </w:p>
     <w:p>
@@ -5698,72 +5454,7 @@
         <w:pStyle w:val="IntelleraBodyPT"/>
       </w:pPr>
       <w:r>
-        <w:t>Un eventuale attaccante autenticato alla piattaforma potrebbe sfruttare tale vulnerabilità per accedere al Sistema ed eseguire codice remoto arbitrario direttamente sul server, minando la sicurezza dell’intera organizzazione.</w:t>
-      </w:r>
-    </w:p>
-    <w:p>
-      <w:pPr>
-        <w:pStyle w:val="IntelleraBodyPT"/>
-      </w:pPr>
-      <w:r>
-        <w:t xml:space="preserve">Attraverso i test condotti è emersa, attraverso la funzione di login, la possibilità di effettuare un attacco di tipo </w:t>
-      </w:r>
-      <w:proofErr w:type="spellStart"/>
-      <w:r>
-        <w:rPr>
-          <w:i/>
-          <w:iCs/>
-        </w:rPr>
-        <w:t>Reflected</w:t>
-      </w:r>
-      <w:proofErr w:type="spellEnd"/>
-      <w:r>
-        <w:rPr>
-          <w:i/>
-          <w:iCs/>
-        </w:rPr>
-        <w:t xml:space="preserve"> Cross-site scripting</w:t>
-      </w:r>
-      <w:r>
-        <w:t>.</w:t>
-      </w:r>
-    </w:p>
-    <w:p>
-      <w:pPr>
-        <w:pStyle w:val="IntelleraBodyPT"/>
-      </w:pPr>
-      <w:r>
-        <w:t>Questo permetterebbe ad un attaccante di creare un link che</w:t>
-      </w:r>
-      <w:r>
-        <w:t>,</w:t>
-      </w:r>
-      <w:r>
-        <w:t xml:space="preserve"> una volta visitato da un utente utilizzatore della piattaforma, gli permetterebbe di rubare i cookie di sessione e di conseguenza di impersonarlo. Ciò gli faciliterebbe l’attuazione di azioni malevole in larga scala verso utilizzatori della piattaforma e dipendenti, ponendo a rischio il business.</w:t>
-      </w:r>
-    </w:p>
-    <w:p>
-      <w:pPr>
-        <w:pStyle w:val="IntelleraBodyPT"/>
-      </w:pPr>
-      <w:r>
-        <w:t>Infine, sono state rilevate vulnerabilità di impatto minore legate a comuni errori di configurazione o di sanitizzazione messi in atto dall’applicazione, come la possibilità di caricare file di estensione arbitraria potenzialmente pericolosi, la presenza di componenti obsoleti e pagine di default e l’assenza di alcuni attributi a protezione dei cookie di sessione dell’applicazione.</w:t>
-      </w:r>
-    </w:p>
-    <w:p>
-      <w:pPr>
-        <w:pStyle w:val="IntelleraBodyPT"/>
-      </w:pPr>
-      <w:r>
-        <w:t xml:space="preserve">In particolare, il prospetto riassuntivo del livello di </w:t>
-      </w:r>
-      <w:proofErr w:type="spellStart"/>
-      <w:r>
-        <w:t>severity</w:t>
-      </w:r>
-      <w:proofErr w:type="spellEnd"/>
-      <w:r>
-        <w:t xml:space="preserve"> risulta essere il seguente:</w:t>
+        <w:t>In particolare, il prospetto riassuntivo del livello di severity risulta essere il seguente:</w:t>
       </w:r>
     </w:p>
     <w:p>
@@ -5807,7 +5498,6 @@
                 <w:szCs w:val="22"/>
               </w:rPr>
             </w:pPr>
-            <w:proofErr w:type="spellStart"/>
             <w:r>
               <w:rPr>
                 <w:rFonts w:ascii="Segoe UI" w:eastAsiaTheme="minorEastAsia" w:hAnsi="Segoe UI" w:cs="Segoe UI"/>
@@ -5817,7 +5507,6 @@
               </w:rPr>
               <w:t>Applicazione</w:t>
             </w:r>
-            <w:proofErr w:type="spellEnd"/>
           </w:p>
         </w:tc>
         <w:tc>
@@ -5842,7 +5531,6 @@
                 <w:szCs w:val="22"/>
               </w:rPr>
             </w:pPr>
-            <w:proofErr w:type="spellStart"/>
             <w:r>
               <w:rPr>
                 <w:rFonts w:ascii="Segoe UI" w:hAnsi="Segoe UI" w:cs="Segoe UI"/>
@@ -5852,7 +5540,6 @@
               </w:rPr>
               <w:t>Severità</w:t>
             </w:r>
-            <w:proofErr w:type="spellEnd"/>
           </w:p>
         </w:tc>
       </w:tr>
@@ -5879,19 +5566,30 @@
           <w:p>
             <w:pPr>
               <w:rPr>
-                <w:rFonts w:ascii="Calibri" w:eastAsia="Times New Roman" w:hAnsi="Calibri" w:cs="Calibri"/>
-                <w:color w:val="000000"/>
-                <w:sz w:val="22"/>
-                <w:szCs w:val="22"/>
-                <w:lang w:val="en-US"/>
-              </w:rPr>
-            </w:pPr>
-            <w:r>
-              <w:rPr>
                 <w:rFonts w:ascii="Segoe UI" w:eastAsia="Times New Roman" w:hAnsi="Segoe UI" w:cs="Segoe UI"/>
                 <w:lang w:val="it-IT" w:eastAsia="it-IT"/>
               </w:rPr>
-              <w:t>[TARGET1 NAME]</w:t>
+            </w:pPr>
+            <w:r>
+              <w:rPr>
+                <w:rFonts w:ascii="Segoe UI" w:eastAsia="Times New Roman" w:hAnsi="Segoe UI" w:cs="Segoe UI"/>
+                <w:lang w:val="it-IT" w:eastAsia="it-IT"/>
+              </w:rPr>
+              <w:t>{#target</w:t>
+            </w:r>
+            <w:r>
+              <w:rPr>
+                <w:rFonts w:ascii="Segoe UI" w:eastAsia="Times New Roman" w:hAnsi="Segoe UI" w:cs="Segoe UI"/>
+                <w:lang w:val="it-IT" w:eastAsia="it-IT"/>
+              </w:rPr>
+              <w:t>s</w:t>
+            </w:r>
+            <w:r>
+              <w:rPr>
+                <w:rFonts w:ascii="Segoe UI" w:eastAsia="Times New Roman" w:hAnsi="Segoe UI" w:cs="Segoe UI"/>
+                <w:lang w:val="it-IT" w:eastAsia="it-IT"/>
+              </w:rPr>
+              <w:t>}{name}</w:t>
             </w:r>
           </w:p>
         </w:tc>
@@ -5914,22 +5612,12 @@
               <w:keepNext/>
               <w:cnfStyle w:val="000000100000" w:firstRow="0" w:lastRow="0" w:firstColumn="0" w:lastColumn="0" w:oddVBand="0" w:evenVBand="0" w:oddHBand="1" w:evenHBand="0" w:firstRowFirstColumn="0" w:firstRowLastColumn="0" w:lastRowFirstColumn="0" w:lastRowLastColumn="0"/>
               <w:rPr>
-                <w:rFonts w:ascii="Calibri" w:eastAsia="Times New Roman" w:hAnsi="Calibri" w:cs="Calibri"/>
-                <w:color w:val="000000"/>
-                <w:sz w:val="22"/>
-                <w:szCs w:val="22"/>
-                <w:lang w:val="en-US"/>
-              </w:rPr>
-            </w:pPr>
-            <w:r>
-              <w:rPr>
                 <w:rFonts w:ascii="Segoe UI" w:eastAsia="Times New Roman" w:hAnsi="Segoe UI" w:cs="Segoe UI"/>
                 <w:b/>
                 <w:bCs/>
                 <w:lang w:val="it-IT" w:eastAsia="it-IT"/>
               </w:rPr>
-              <w:t xml:space="preserve">[TARGET1 </w:t>
-            </w:r>
+            </w:pPr>
             <w:r>
               <w:rPr>
                 <w:rFonts w:ascii="Segoe UI" w:eastAsia="Times New Roman" w:hAnsi="Segoe UI" w:cs="Segoe UI"/>
@@ -5937,7 +5625,7 @@
                 <w:bCs/>
                 <w:lang w:val="it-IT" w:eastAsia="it-IT"/>
               </w:rPr>
-              <w:t>SEVERITY</w:t>
+              <w:t>{</w:t>
             </w:r>
             <w:r>
               <w:rPr>
@@ -5946,116 +5634,34 @@
                 <w:bCs/>
                 <w:lang w:val="it-IT" w:eastAsia="it-IT"/>
               </w:rPr>
-              <w:t>]</w:t>
-            </w:r>
-          </w:p>
-        </w:tc>
-      </w:tr>
-      <w:tr>
-        <w:trPr>
-          <w:trHeight w:val="288"/>
-        </w:trPr>
-        <w:tc>
-          <w:tcPr>
-            <w:cnfStyle w:val="001000000000" w:firstRow="0" w:lastRow="0" w:firstColumn="1" w:lastColumn="0" w:oddVBand="0" w:evenVBand="0" w:oddHBand="0" w:evenHBand="0" w:firstRowFirstColumn="0" w:firstRowLastColumn="0" w:lastRowFirstColumn="0" w:lastRowLastColumn="0"/>
-            <w:tcW w:w="2500" w:type="pct"/>
-            <w:tcBorders>
-              <w:top w:val="single" w:sz="4" w:space="0" w:color="auto"/>
-              <w:left w:val="single" w:sz="4" w:space="0" w:color="auto"/>
-              <w:bottom w:val="single" w:sz="4" w:space="0" w:color="auto"/>
-              <w:right w:val="single" w:sz="4" w:space="0" w:color="auto"/>
-            </w:tcBorders>
-            <w:shd w:val="clear" w:color="auto" w:fill="FFFFFF" w:themeFill="background1"/>
-            <w:noWrap/>
-            <w:vAlign w:val="center"/>
-          </w:tcPr>
-          <w:p>
-            <w:pPr>
-              <w:rPr>
-                <w:rFonts w:ascii="Calibri" w:eastAsia="Times New Roman" w:hAnsi="Calibri" w:cs="Calibri"/>
-                <w:color w:val="000000"/>
-                <w:sz w:val="22"/>
-                <w:szCs w:val="22"/>
-                <w:lang w:val="en-US"/>
-              </w:rPr>
-            </w:pPr>
-            <w:r>
-              <w:rPr>
-                <w:rFonts w:ascii="Segoe UI" w:eastAsia="Times New Roman" w:hAnsi="Segoe UI" w:cs="Segoe UI"/>
-                <w:lang w:val="it-IT" w:eastAsia="it-IT"/>
-              </w:rPr>
-              <w:t>[TARGET</w:t>
-            </w:r>
-            <w:r>
-              <w:rPr>
-                <w:rFonts w:ascii="Segoe UI" w:eastAsia="Times New Roman" w:hAnsi="Segoe UI" w:cs="Segoe UI"/>
-                <w:lang w:val="it-IT" w:eastAsia="it-IT"/>
-              </w:rPr>
-              <w:t>2</w:t>
-            </w:r>
-            <w:r>
-              <w:rPr>
-                <w:rFonts w:ascii="Segoe UI" w:eastAsia="Times New Roman" w:hAnsi="Segoe UI" w:cs="Segoe UI"/>
-                <w:lang w:val="it-IT" w:eastAsia="it-IT"/>
-              </w:rPr>
-              <w:t xml:space="preserve"> NAME]</w:t>
-            </w:r>
-          </w:p>
-        </w:tc>
-        <w:tc>
-          <w:tcPr>
-            <w:tcW w:w="2500" w:type="pct"/>
-            <w:tcBorders>
-              <w:top w:val="single" w:sz="4" w:space="0" w:color="auto"/>
-              <w:left w:val="single" w:sz="4" w:space="0" w:color="auto"/>
-              <w:bottom w:val="single" w:sz="4" w:space="0" w:color="auto"/>
-              <w:right w:val="single" w:sz="4" w:space="0" w:color="auto"/>
-            </w:tcBorders>
-            <w:shd w:val="clear" w:color="auto" w:fill="FFFFFF" w:themeFill="background1"/>
-            <w:noWrap/>
-            <w:vAlign w:val="center"/>
-          </w:tcPr>
-          <w:p>
-            <w:pPr>
-              <w:keepNext/>
-              <w:cnfStyle w:val="000000000000" w:firstRow="0" w:lastRow="0" w:firstColumn="0" w:lastColumn="0" w:oddVBand="0" w:evenVBand="0" w:oddHBand="0" w:evenHBand="0" w:firstRowFirstColumn="0" w:firstRowLastColumn="0" w:lastRowFirstColumn="0" w:lastRowLastColumn="0"/>
-              <w:rPr>
-                <w:rFonts w:ascii="Calibri" w:eastAsia="Times New Roman" w:hAnsi="Calibri" w:cs="Calibri"/>
-                <w:color w:val="000000"/>
-                <w:sz w:val="22"/>
-                <w:szCs w:val="22"/>
-                <w:lang w:val="en-US"/>
-              </w:rPr>
-            </w:pPr>
+              <w:t>severity</w:t>
+            </w:r>
             <w:r>
               <w:rPr>
                 <w:rFonts w:ascii="Segoe UI" w:eastAsia="Times New Roman" w:hAnsi="Segoe UI" w:cs="Segoe UI"/>
                 <w:b/>
                 <w:bCs/>
-                <w:color w:val="FF0000"/>
                 <w:lang w:val="it-IT" w:eastAsia="it-IT"/>
               </w:rPr>
-              <w:t>[TARGET</w:t>
+              <w:t>}{/target</w:t>
             </w:r>
             <w:r>
               <w:rPr>
                 <w:rFonts w:ascii="Segoe UI" w:eastAsia="Times New Roman" w:hAnsi="Segoe UI" w:cs="Segoe UI"/>
                 <w:b/>
                 <w:bCs/>
-                <w:color w:val="FF0000"/>
                 <w:lang w:val="it-IT" w:eastAsia="it-IT"/>
               </w:rPr>
-              <w:t>2</w:t>
+              <w:t>s</w:t>
             </w:r>
             <w:r>
               <w:rPr>
                 <w:rFonts w:ascii="Segoe UI" w:eastAsia="Times New Roman" w:hAnsi="Segoe UI" w:cs="Segoe UI"/>
                 <w:b/>
                 <w:bCs/>
-                <w:color w:val="FF0000"/>
                 <w:lang w:val="it-IT" w:eastAsia="it-IT"/>
               </w:rPr>
-              <w:t xml:space="preserve"> SEVERITY]</w:t>
+              <w:t>}</w:t>
             </w:r>
           </w:p>
         </w:tc>
@@ -6202,15 +5808,7 @@
         <w:pStyle w:val="IntelleraBodyPT"/>
       </w:pPr>
       <w:r>
-        <w:t xml:space="preserve">Questa sezione contiene una descrizione dettagliata di tutte le vulnerabilità riscontrate durante le attività di </w:t>
-      </w:r>
-      <w:proofErr w:type="spellStart"/>
-      <w:r>
-        <w:t>assessment</w:t>
-      </w:r>
-      <w:proofErr w:type="spellEnd"/>
-      <w:r>
-        <w:t xml:space="preserve">, dove per vulnerabilità si intende: “Qualsiasi errore od omissione nella progettazione, nello sviluppo o nella configurazione di software e/o sistemi, tale che la loro esecuzione possa violare la </w:t>
+        <w:t xml:space="preserve">Questa sezione contiene una descrizione dettagliata di tutte le vulnerabilità riscontrate durante le attività di assessment, dove per vulnerabilità si intende: “Qualsiasi errore od omissione nella progettazione, nello sviluppo o nella configurazione di software e/o sistemi, tale che la loro esecuzione possa violare la </w:t>
       </w:r>
       <w:r>
         <w:t>Confidenzialità</w:t>
@@ -6297,9 +5895,9 @@
         <w:tblLook w:val="04A0" w:firstRow="1" w:lastRow="0" w:firstColumn="1" w:lastColumn="0" w:noHBand="0" w:noVBand="1"/>
       </w:tblPr>
       <w:tblGrid>
-        <w:gridCol w:w="5571"/>
+        <w:gridCol w:w="5570"/>
         <w:gridCol w:w="2028"/>
-        <w:gridCol w:w="2029"/>
+        <w:gridCol w:w="2030"/>
       </w:tblGrid>
       <w:tr>
         <w:trPr>
@@ -6371,7 +5969,7 @@
         <w:tc>
           <w:tcPr>
             <w:cnfStyle w:val="001000000000" w:firstRow="0" w:lastRow="0" w:firstColumn="1" w:lastColumn="0" w:oddVBand="0" w:evenVBand="0" w:oddHBand="0" w:evenHBand="0" w:firstRowFirstColumn="0" w:firstRowLastColumn="0" w:lastRowFirstColumn="0" w:lastRowLastColumn="0"/>
-            <w:tcW w:w="3386" w:type="pct"/>
+            <w:tcW w:w="2893" w:type="pct"/>
             <w:vMerge w:val="restart"/>
             <w:tcBorders>
               <w:top w:val="single" w:sz="4" w:space="0" w:color="auto"/>
@@ -6407,7 +6005,7 @@
         </w:tc>
         <w:tc>
           <w:tcPr>
-            <w:tcW w:w="1614" w:type="pct"/>
+            <w:tcW w:w="2107" w:type="pct"/>
             <w:gridSpan w:val="2"/>
             <w:tcBorders>
               <w:top w:val="single" w:sz="4" w:space="0" w:color="auto"/>
@@ -6452,7 +6050,7 @@
         <w:tc>
           <w:tcPr>
             <w:cnfStyle w:val="001000000000" w:firstRow="0" w:lastRow="0" w:firstColumn="1" w:lastColumn="0" w:oddVBand="0" w:evenVBand="0" w:oddHBand="0" w:evenHBand="0" w:firstRowFirstColumn="0" w:firstRowLastColumn="0" w:lastRowFirstColumn="0" w:lastRowLastColumn="0"/>
-            <w:tcW w:w="3386" w:type="pct"/>
+            <w:tcW w:w="2893" w:type="pct"/>
             <w:vMerge/>
             <w:tcBorders>
               <w:top w:val="single" w:sz="4" w:space="0" w:color="auto"/>
@@ -6478,7 +6076,7 @@
         </w:tc>
         <w:tc>
           <w:tcPr>
-            <w:tcW w:w="807" w:type="pct"/>
+            <w:tcW w:w="1053" w:type="pct"/>
             <w:tcBorders>
               <w:top w:val="single" w:sz="4" w:space="0" w:color="auto"/>
               <w:left w:val="single" w:sz="4" w:space="0" w:color="auto"/>
@@ -6515,7 +6113,7 @@
         </w:tc>
         <w:tc>
           <w:tcPr>
-            <w:tcW w:w="807" w:type="pct"/>
+            <w:tcW w:w="1054" w:type="pct"/>
             <w:tcBorders>
               <w:top w:val="single" w:sz="4" w:space="0" w:color="auto"/>
               <w:left w:val="single" w:sz="4" w:space="0" w:color="auto"/>
@@ -6560,7 +6158,7 @@
         <w:tc>
           <w:tcPr>
             <w:cnfStyle w:val="001000000000" w:firstRow="0" w:lastRow="0" w:firstColumn="1" w:lastColumn="0" w:oddVBand="0" w:evenVBand="0" w:oddHBand="0" w:evenHBand="0" w:firstRowFirstColumn="0" w:firstRowLastColumn="0" w:lastRowFirstColumn="0" w:lastRowLastColumn="0"/>
-            <w:tcW w:w="3386" w:type="pct"/>
+            <w:tcW w:w="2893" w:type="pct"/>
             <w:tcBorders>
               <w:top w:val="single" w:sz="4" w:space="0" w:color="auto"/>
               <w:left w:val="single" w:sz="4" w:space="0" w:color="auto"/>
@@ -6574,26 +6172,88 @@
               <w:rPr>
                 <w:rFonts w:ascii="Segoe UI" w:hAnsi="Segoe UI" w:cs="Segoe UI"/>
                 <w:b w:val="0"/>
-                <w:sz w:val="20"/>
-                <w:szCs w:val="20"/>
-                <w:lang w:val="en-US"/>
-              </w:rPr>
-            </w:pPr>
-            <w:r>
-              <w:rPr>
-                <w:rFonts w:ascii="Segoe UI" w:hAnsi="Segoe UI" w:cs="Segoe UI"/>
+                <w:bCs w:val="0"/>
                 <w:color w:val="000000"/>
                 <w:sz w:val="20"/>
                 <w:szCs w:val="20"/>
                 <w:lang w:val="en-US"/>
               </w:rPr>
-              <w:t>[VULNERABILITY1 NAME]</w:t>
+            </w:pPr>
+            <w:r>
+              <w:rPr>
+                <w:rFonts w:ascii="Segoe UI" w:hAnsi="Segoe UI" w:cs="Segoe UI"/>
+                <w:color w:val="000000"/>
+                <w:sz w:val="20"/>
+                <w:szCs w:val="20"/>
+                <w:lang w:val="en-US"/>
+              </w:rPr>
+              <w:t>{#</w:t>
+            </w:r>
+            <w:r>
+              <w:rPr>
+                <w:rFonts w:ascii="Segoe UI" w:hAnsi="Segoe UI" w:cs="Segoe UI"/>
+                <w:color w:val="000000"/>
+                <w:sz w:val="20"/>
+                <w:szCs w:val="20"/>
+                <w:lang w:val="en-US"/>
+              </w:rPr>
+              <w:t>vulnerabilit</w:t>
+            </w:r>
+            <w:r>
+              <w:rPr>
+                <w:rFonts w:ascii="Segoe UI" w:hAnsi="Segoe UI" w:cs="Segoe UI"/>
+                <w:color w:val="000000"/>
+                <w:sz w:val="20"/>
+                <w:szCs w:val="20"/>
+                <w:lang w:val="en-US"/>
+              </w:rPr>
+              <w:t>ies</w:t>
+            </w:r>
+            <w:r>
+              <w:rPr>
+                <w:rFonts w:ascii="Segoe UI" w:hAnsi="Segoe UI" w:cs="Segoe UI"/>
+                <w:color w:val="000000"/>
+                <w:sz w:val="20"/>
+                <w:szCs w:val="20"/>
+                <w:lang w:val="en-US"/>
+              </w:rPr>
+              <w:t>}</w:t>
+            </w:r>
+            <w:r>
+              <w:rPr>
+                <w:rFonts w:ascii="Segoe UI" w:hAnsi="Segoe UI" w:cs="Segoe UI"/>
+                <w:color w:val="000000"/>
+                <w:sz w:val="20"/>
+                <w:szCs w:val="20"/>
+                <w:lang w:val="en-US"/>
+              </w:rPr>
+              <w:t xml:space="preserve"> </w:t>
+            </w:r>
+            <w:r>
+              <w:rPr>
+                <w:rFonts w:ascii="Segoe UI" w:hAnsi="Segoe UI" w:cs="Segoe UI"/>
+                <w:color w:val="000000"/>
+                <w:sz w:val="20"/>
+                <w:szCs w:val="20"/>
+                <w:lang w:val="en-US"/>
+              </w:rPr>
+              <w:t>{</w:t>
+            </w:r>
+            <w:r>
+              <w:rPr>
+                <w:rFonts w:ascii="Segoe UI" w:hAnsi="Segoe UI" w:cs="Segoe UI"/>
+                <w:color w:val="000000"/>
+                <w:sz w:val="20"/>
+                <w:szCs w:val="20"/>
+                <w:lang w:val="en-US"/>
+              </w:rPr>
+              <w:t>name}</w:t>
             </w:r>
           </w:p>
         </w:tc>
         <w:tc>
           <w:tcPr>
-            <w:tcW w:w="807" w:type="pct"/>
+            <w:tcW w:w="1053" w:type="pct"/>
             <w:tcBorders>
               <w:top w:val="single" w:sz="4" w:space="0" w:color="auto"/>
               <w:left w:val="nil"/>
@@ -6622,31 +6282,13 @@
                 <w:bCs/>
                 <w:lang w:val="en-US" w:eastAsia="it-IT"/>
               </w:rPr>
-              <w:t xml:space="preserve">[VULNERABILITY1 </w:t>
-            </w:r>
-            <w:r>
-              <w:rPr>
-                <w:rFonts w:ascii="Segoe UI" w:eastAsia="Times New Roman" w:hAnsi="Segoe UI" w:cs="Segoe UI"/>
-                <w:b/>
-                <w:bCs/>
-                <w:lang w:val="en-US" w:eastAsia="it-IT"/>
-              </w:rPr>
-              <w:t>SEVERITY</w:t>
-            </w:r>
-            <w:r>
-              <w:rPr>
-                <w:rFonts w:ascii="Segoe UI" w:eastAsia="Times New Roman" w:hAnsi="Segoe UI" w:cs="Segoe UI"/>
-                <w:b/>
-                <w:bCs/>
-                <w:lang w:val="en-US" w:eastAsia="it-IT"/>
-              </w:rPr>
-              <w:t>]</w:t>
+              <w:t>{severity}</w:t>
             </w:r>
           </w:p>
         </w:tc>
         <w:tc>
           <w:tcPr>
-            <w:tcW w:w="807" w:type="pct"/>
+            <w:tcW w:w="1054" w:type="pct"/>
             <w:tcBorders>
               <w:top w:val="single" w:sz="4" w:space="0" w:color="auto"/>
               <w:left w:val="nil"/>
@@ -6675,7 +6317,7 @@
                 <w:bCs/>
                 <w:lang w:val="en-US" w:eastAsia="it-IT"/>
               </w:rPr>
-              <w:t xml:space="preserve">[VULNERABILITY1 </w:t>
+              <w:t>{priority}</w:t>
             </w:r>
             <w:r>
               <w:rPr>
@@ -6684,7 +6326,7 @@
                 <w:bCs/>
                 <w:lang w:val="en-US" w:eastAsia="it-IT"/>
               </w:rPr>
-              <w:t>PRIORITY</w:t>
+              <w:t xml:space="preserve"> </w:t>
             </w:r>
             <w:r>
               <w:rPr>
@@ -6693,94 +6335,8 @@
                 <w:bCs/>
                 <w:lang w:val="en-US" w:eastAsia="it-IT"/>
               </w:rPr>
-              <w:t>]</w:t>
-            </w:r>
-          </w:p>
-        </w:tc>
-      </w:tr>
-      <w:tr>
-        <w:trPr>
-          <w:trHeight w:val="353"/>
-          <w:jc w:val="center"/>
-        </w:trPr>
-        <w:tc>
-          <w:tcPr>
-            <w:cnfStyle w:val="001000000000" w:firstRow="0" w:lastRow="0" w:firstColumn="1" w:lastColumn="0" w:oddVBand="0" w:evenVBand="0" w:oddHBand="0" w:evenHBand="0" w:firstRowFirstColumn="0" w:firstRowLastColumn="0" w:lastRowFirstColumn="0" w:lastRowLastColumn="0"/>
-            <w:tcW w:w="3386" w:type="pct"/>
-            <w:tcBorders>
-              <w:top w:val="single" w:sz="4" w:space="0" w:color="FFDC9A" w:themeColor="accent4" w:themeTint="99"/>
-              <w:left w:val="single" w:sz="4" w:space="0" w:color="auto"/>
-              <w:bottom w:val="single" w:sz="4" w:space="0" w:color="FFDC9A" w:themeColor="accent4" w:themeTint="99"/>
-              <w:right w:val="nil"/>
-            </w:tcBorders>
-            <w:vAlign w:val="center"/>
-          </w:tcPr>
-          <w:p>
-            <w:pPr>
-              <w:rPr>
-                <w:rFonts w:ascii="Segoe UI" w:hAnsi="Segoe UI" w:cs="Segoe UI"/>
-                <w:color w:val="000000"/>
-                <w:sz w:val="20"/>
-                <w:szCs w:val="20"/>
-                <w:lang w:val="en-US"/>
-              </w:rPr>
-            </w:pPr>
-            <w:r>
-              <w:rPr>
-                <w:rFonts w:ascii="Segoe UI" w:hAnsi="Segoe UI" w:cs="Segoe UI"/>
-                <w:color w:val="000000"/>
-                <w:sz w:val="20"/>
-                <w:szCs w:val="20"/>
-                <w:lang w:val="en-US"/>
-              </w:rPr>
-              <w:t>[VULNERABILITY</w:t>
-            </w:r>
-            <w:r>
-              <w:rPr>
-                <w:rFonts w:ascii="Segoe UI" w:hAnsi="Segoe UI" w:cs="Segoe UI"/>
-                <w:color w:val="000000"/>
-                <w:sz w:val="20"/>
-                <w:szCs w:val="20"/>
-                <w:lang w:val="en-US"/>
-              </w:rPr>
-              <w:t>2</w:t>
-            </w:r>
-            <w:r>
-              <w:rPr>
-                <w:rFonts w:ascii="Segoe UI" w:hAnsi="Segoe UI" w:cs="Segoe UI"/>
-                <w:color w:val="000000"/>
-                <w:sz w:val="20"/>
-                <w:szCs w:val="20"/>
-                <w:lang w:val="en-US"/>
-              </w:rPr>
-              <w:t xml:space="preserve"> NAME]</w:t>
-            </w:r>
-          </w:p>
-        </w:tc>
-        <w:tc>
-          <w:tcPr>
-            <w:tcW w:w="807" w:type="pct"/>
-            <w:tcBorders>
-              <w:top w:val="single" w:sz="4" w:space="0" w:color="FFDC9A" w:themeColor="accent4" w:themeTint="99"/>
-              <w:left w:val="nil"/>
-              <w:bottom w:val="single" w:sz="4" w:space="0" w:color="FFDC9A" w:themeColor="accent4" w:themeTint="99"/>
-              <w:right w:val="nil"/>
-            </w:tcBorders>
-            <w:vAlign w:val="center"/>
-          </w:tcPr>
-          <w:p>
-            <w:pPr>
-              <w:spacing w:line="271" w:lineRule="exact"/>
-              <w:ind w:left="26"/>
-              <w:jc w:val="center"/>
-              <w:cnfStyle w:val="000000000000" w:firstRow="0" w:lastRow="0" w:firstColumn="0" w:lastColumn="0" w:oddVBand="0" w:evenVBand="0" w:oddHBand="0" w:evenHBand="0" w:firstRowFirstColumn="0" w:firstRowLastColumn="0" w:lastRowFirstColumn="0" w:lastRowLastColumn="0"/>
-              <w:rPr>
-                <w:rFonts w:ascii="Segoe UI" w:hAnsi="Segoe UI" w:cs="Segoe UI"/>
-                <w:b/>
-                <w:sz w:val="20"/>
-                <w:szCs w:val="20"/>
-              </w:rPr>
-            </w:pPr>
+              <w:t>{</w:t>
+            </w:r>
             <w:r>
               <w:rPr>
                 <w:rFonts w:ascii="Segoe UI" w:eastAsia="Times New Roman" w:hAnsi="Segoe UI" w:cs="Segoe UI"/>
@@ -6788,7 +6344,7 @@
                 <w:bCs/>
                 <w:lang w:val="en-US" w:eastAsia="it-IT"/>
               </w:rPr>
-              <w:t>[VULNERABILITY</w:t>
+              <w:t>/</w:t>
             </w:r>
             <w:r>
               <w:rPr>
@@ -6797,7 +6353,7 @@
                 <w:bCs/>
                 <w:lang w:val="en-US" w:eastAsia="it-IT"/>
               </w:rPr>
-              <w:t xml:space="preserve">2 </w:t>
+              <w:t>vulnerabilit</w:t>
             </w:r>
             <w:r>
               <w:rPr>
@@ -6806,35 +6362,8 @@
                 <w:bCs/>
                 <w:lang w:val="en-US" w:eastAsia="it-IT"/>
               </w:rPr>
-              <w:t>SEVERITY]</w:t>
-            </w:r>
-          </w:p>
-        </w:tc>
-        <w:tc>
-          <w:tcPr>
-            <w:tcW w:w="807" w:type="pct"/>
-            <w:tcBorders>
-              <w:top w:val="single" w:sz="4" w:space="0" w:color="FFDC9A" w:themeColor="accent4" w:themeTint="99"/>
-              <w:left w:val="nil"/>
-              <w:bottom w:val="single" w:sz="4" w:space="0" w:color="FFDC9A" w:themeColor="accent4" w:themeTint="99"/>
-              <w:right w:val="single" w:sz="4" w:space="0" w:color="auto"/>
-            </w:tcBorders>
-            <w:vAlign w:val="center"/>
-          </w:tcPr>
-          <w:p>
-            <w:pPr>
-              <w:spacing w:line="271" w:lineRule="exact"/>
-              <w:ind w:right="27"/>
-              <w:jc w:val="center"/>
-              <w:cnfStyle w:val="000000000000" w:firstRow="0" w:lastRow="0" w:firstColumn="0" w:lastColumn="0" w:oddVBand="0" w:evenVBand="0" w:oddHBand="0" w:evenHBand="0" w:firstRowFirstColumn="0" w:firstRowLastColumn="0" w:lastRowFirstColumn="0" w:lastRowLastColumn="0"/>
-              <w:rPr>
-                <w:rFonts w:ascii="Segoe UI" w:hAnsi="Segoe UI" w:cs="Segoe UI"/>
-                <w:b/>
-                <w:color w:val="000000"/>
-                <w:sz w:val="20"/>
-                <w:szCs w:val="20"/>
-              </w:rPr>
-            </w:pPr>
+              <w:t>ies</w:t>
+            </w:r>
             <w:r>
               <w:rPr>
                 <w:rFonts w:ascii="Segoe UI" w:eastAsia="Times New Roman" w:hAnsi="Segoe UI" w:cs="Segoe UI"/>
@@ -6842,25 +6371,7 @@
                 <w:bCs/>
                 <w:lang w:val="en-US" w:eastAsia="it-IT"/>
               </w:rPr>
-              <w:t>[VULNERABILITY</w:t>
-            </w:r>
-            <w:r>
-              <w:rPr>
-                <w:rFonts w:ascii="Segoe UI" w:eastAsia="Times New Roman" w:hAnsi="Segoe UI" w:cs="Segoe UI"/>
-                <w:b/>
-                <w:bCs/>
-                <w:lang w:val="en-US" w:eastAsia="it-IT"/>
-              </w:rPr>
-              <w:t>2</w:t>
-            </w:r>
-            <w:r>
-              <w:rPr>
-                <w:rFonts w:ascii="Segoe UI" w:eastAsia="Times New Roman" w:hAnsi="Segoe UI" w:cs="Segoe UI"/>
-                <w:b/>
-                <w:bCs/>
-                <w:lang w:val="en-US" w:eastAsia="it-IT"/>
-              </w:rPr>
-              <w:t xml:space="preserve"> PRIORITY]</w:t>
+              <w:t>}</w:t>
             </w:r>
           </w:p>
         </w:tc>
@@ -6975,29 +6486,7 @@
                 <w:sz w:val="22"/>
                 <w:szCs w:val="22"/>
               </w:rPr>
-              <w:t xml:space="preserve">Classe </w:t>
-            </w:r>
-            <w:proofErr w:type="spellStart"/>
-            <w:r>
-              <w:rPr>
-                <w:rFonts w:ascii="Segoe UI" w:hAnsi="Segoe UI" w:cs="Segoe UI"/>
-                <w:bCs w:val="0"/>
-                <w:color w:val="FFFFFF" w:themeColor="background1"/>
-                <w:sz w:val="22"/>
-                <w:szCs w:val="22"/>
-              </w:rPr>
-              <w:t>vulnerabilità</w:t>
-            </w:r>
-            <w:proofErr w:type="spellEnd"/>
-            <w:r>
-              <w:rPr>
-                <w:rFonts w:ascii="Segoe UI" w:hAnsi="Segoe UI" w:cs="Segoe UI"/>
-                <w:bCs w:val="0"/>
-                <w:color w:val="FFFFFF" w:themeColor="background1"/>
-                <w:sz w:val="22"/>
-                <w:szCs w:val="22"/>
-              </w:rPr>
-              <w:t xml:space="preserve"> OWASP Top </w:t>
+              <w:t xml:space="preserve">Classe vulnerabilità OWASP Top </w:t>
             </w:r>
             <w:r>
               <w:rPr>
@@ -7044,7 +6533,6 @@
                 <w:szCs w:val="22"/>
               </w:rPr>
             </w:pPr>
-            <w:proofErr w:type="spellStart"/>
             <w:r>
               <w:rPr>
                 <w:rFonts w:ascii="Segoe UI" w:hAnsi="Segoe UI" w:cs="Segoe UI"/>
@@ -7055,7 +6543,6 @@
               </w:rPr>
               <w:t>Esito</w:t>
             </w:r>
-            <w:proofErr w:type="spellEnd"/>
           </w:p>
         </w:tc>
       </w:tr>
@@ -7116,7 +6603,6 @@
                 <w:lang w:val="en-US"/>
               </w:rPr>
             </w:pPr>
-            <w:proofErr w:type="spellStart"/>
             <w:r>
               <w:rPr>
                 <w:rFonts w:ascii="Segoe UI" w:hAnsi="Segoe UI" w:cs="Segoe UI"/>
@@ -7126,7 +6612,6 @@
               </w:rPr>
               <w:t>Negativo</w:t>
             </w:r>
-            <w:proofErr w:type="spellEnd"/>
           </w:p>
         </w:tc>
       </w:tr>
@@ -7182,7 +6667,6 @@
                 <w:lang w:val="en-US"/>
               </w:rPr>
             </w:pPr>
-            <w:proofErr w:type="spellStart"/>
             <w:r>
               <w:rPr>
                 <w:rFonts w:ascii="Segoe UI" w:hAnsi="Segoe UI" w:cs="Segoe UI"/>
@@ -7192,7 +6676,6 @@
               </w:rPr>
               <w:t>Negativo</w:t>
             </w:r>
-            <w:proofErr w:type="spellEnd"/>
           </w:p>
         </w:tc>
       </w:tr>
@@ -7311,7 +6794,6 @@
                 <w:lang w:val="en-US" w:eastAsia="it-IT"/>
               </w:rPr>
             </w:pPr>
-            <w:proofErr w:type="spellStart"/>
             <w:r>
               <w:rPr>
                 <w:rFonts w:ascii="Segoe UI" w:hAnsi="Segoe UI" w:cs="Segoe UI"/>
@@ -7321,7 +6803,6 @@
               </w:rPr>
               <w:t>Negativo</w:t>
             </w:r>
-            <w:proofErr w:type="spellEnd"/>
           </w:p>
         </w:tc>
       </w:tr>
@@ -7377,7 +6858,6 @@
                 <w:szCs w:val="22"/>
               </w:rPr>
             </w:pPr>
-            <w:proofErr w:type="spellStart"/>
             <w:r>
               <w:rPr>
                 <w:rFonts w:ascii="Segoe UI" w:hAnsi="Segoe UI" w:cs="Segoe UI"/>
@@ -7387,7 +6867,6 @@
               </w:rPr>
               <w:t>Negativo</w:t>
             </w:r>
-            <w:proofErr w:type="spellEnd"/>
           </w:p>
         </w:tc>
       </w:tr>
@@ -7442,7 +6921,6 @@
                 <w:szCs w:val="22"/>
               </w:rPr>
             </w:pPr>
-            <w:proofErr w:type="spellStart"/>
             <w:r>
               <w:rPr>
                 <w:rFonts w:ascii="Segoe UI" w:hAnsi="Segoe UI" w:cs="Segoe UI"/>
@@ -7452,7 +6930,6 @@
               </w:rPr>
               <w:t>Negativo</w:t>
             </w:r>
-            <w:proofErr w:type="spellEnd"/>
           </w:p>
         </w:tc>
       </w:tr>
@@ -7508,7 +6985,6 @@
                 <w:szCs w:val="22"/>
               </w:rPr>
             </w:pPr>
-            <w:proofErr w:type="spellStart"/>
             <w:r>
               <w:rPr>
                 <w:rFonts w:ascii="Segoe UI" w:hAnsi="Segoe UI" w:cs="Segoe UI"/>
@@ -7518,7 +6994,6 @@
               </w:rPr>
               <w:t>Negativo</w:t>
             </w:r>
-            <w:proofErr w:type="spellEnd"/>
           </w:p>
         </w:tc>
       </w:tr>
@@ -7788,10 +7263,13 @@
         <w:pStyle w:val="Heading3"/>
       </w:pPr>
       <w:r>
-        <w:rPr>
-          <w:lang w:val="it-IT"/>
-        </w:rPr>
-        <w:t>[VULNERABILITY1 NAME]</w:t>
+        <w:t>{#vulnerabilit</w:t>
+      </w:r>
+      <w:r>
+        <w:t>ies</w:t>
+      </w:r>
+      <w:r>
+        <w:t>}{name}</w:t>
       </w:r>
     </w:p>
     <w:tbl>
@@ -7843,7 +7321,7 @@
                 <w:szCs w:val="22"/>
                 <w:lang w:val="en-US"/>
               </w:rPr>
-              <w:t>[VULNERABILITY1 NAME]</w:t>
+              <w:t>{name}</w:t>
             </w:r>
           </w:p>
         </w:tc>
@@ -7903,7 +7381,7 @@
                 <w:szCs w:val="20"/>
                 <w:lang w:val="en-US"/>
               </w:rPr>
-              <w:t>[VULNERABILITY1 SEVERITY]</w:t>
+              <w:t>{severity}</w:t>
             </w:r>
           </w:p>
         </w:tc>
@@ -7961,7 +7439,7 @@
                 <w:szCs w:val="20"/>
                 <w:lang w:val="en-US"/>
               </w:rPr>
-              <w:t>[VULNERABILITY1 PRIORITY]</w:t>
+              <w:t>{priority}</w:t>
             </w:r>
           </w:p>
         </w:tc>
@@ -8017,7 +7495,7 @@
                 <w:sz w:val="20"/>
                 <w:szCs w:val="20"/>
               </w:rPr>
-              <w:t>[CVSS VULN1]</w:t>
+              <w:t>{cvss_score}</w:t>
             </w:r>
           </w:p>
         </w:tc>
@@ -8059,7 +7537,6 @@
               </w:rPr>
               <w:t xml:space="preserve"> </w:t>
             </w:r>
-            <w:proofErr w:type="spellStart"/>
             <w:r>
               <w:rPr>
                 <w:rFonts w:ascii="Segoe UI" w:hAnsi="Segoe UI" w:cs="Segoe UI"/>
@@ -8069,7 +7546,6 @@
               </w:rPr>
               <w:t>Vector</w:t>
             </w:r>
-            <w:proofErr w:type="spellEnd"/>
           </w:p>
         </w:tc>
         <w:tc>
@@ -8094,25 +7570,7 @@
                 <w:szCs w:val="20"/>
                 <w:lang w:val="en-GB"/>
               </w:rPr>
-              <w:t>[CVSS VECTOR</w:t>
-            </w:r>
-            <w:r>
-              <w:rPr>
-                <w:rFonts w:ascii="Segoe UI" w:hAnsi="Segoe UI" w:cs="Segoe UI"/>
-                <w:sz w:val="20"/>
-                <w:szCs w:val="20"/>
-                <w:lang w:val="en-GB"/>
-              </w:rPr>
-              <w:t xml:space="preserve"> VULN1</w:t>
-            </w:r>
-            <w:r>
-              <w:rPr>
-                <w:rFonts w:ascii="Segoe UI" w:hAnsi="Segoe UI" w:cs="Segoe UI"/>
-                <w:sz w:val="20"/>
-                <w:szCs w:val="20"/>
-                <w:lang w:val="en-GB"/>
-              </w:rPr>
-              <w:t>]</w:t>
+              <w:t>{cvss_vector}</w:t>
             </w:r>
           </w:p>
         </w:tc>
@@ -8157,7 +7615,7 @@
               <w:pStyle w:val="IntelleraContenutoTabellaVulnPT"/>
             </w:pPr>
             <w:r>
-              <w:t>[VULN1 DESCRIPTION]</w:t>
+              <w:t>{description}</w:t>
             </w:r>
           </w:p>
         </w:tc>
@@ -8204,7 +7662,13 @@
               <w:pStyle w:val="IntelleraContenutoTabellaVulnPT"/>
             </w:pPr>
             <w:r>
-              <w:t>[VULN1 IMPACT]</w:t>
+              <w:t>{</w:t>
+            </w:r>
+            <w:r>
+              <w:t>impact</w:t>
+            </w:r>
+            <w:r>
+              <w:t>}</w:t>
             </w:r>
           </w:p>
         </w:tc>
@@ -8251,15 +7715,15 @@
         <w:tblLook w:val="04A0" w:firstRow="1" w:lastRow="0" w:firstColumn="1" w:lastColumn="0" w:noHBand="0" w:noVBand="1"/>
       </w:tblPr>
       <w:tblGrid>
-        <w:gridCol w:w="1061"/>
-        <w:gridCol w:w="1037"/>
-        <w:gridCol w:w="6049"/>
-        <w:gridCol w:w="1481"/>
+        <w:gridCol w:w="2050"/>
+        <w:gridCol w:w="1593"/>
+        <w:gridCol w:w="3655"/>
+        <w:gridCol w:w="2330"/>
       </w:tblGrid>
       <w:tr>
         <w:tc>
           <w:tcPr>
-            <w:tcW w:w="374" w:type="pct"/>
+            <w:tcW w:w="551" w:type="pct"/>
             <w:shd w:val="clear" w:color="auto" w:fill="004C45" w:themeFill="accent1"/>
             <w:vAlign w:val="center"/>
           </w:tcPr>
@@ -8274,7 +7738,6 @@
                 <w:szCs w:val="22"/>
               </w:rPr>
             </w:pPr>
-            <w:commentRangeStart w:id="33"/>
             <w:r>
               <w:rPr>
                 <w:rFonts w:ascii="Segoe UI" w:hAnsi="Segoe UI" w:cs="Segoe UI"/>
@@ -8284,14 +7747,6 @@
                 <w:szCs w:val="22"/>
               </w:rPr>
               <w:t>ID</w:t>
-            </w:r>
-            <w:commentRangeEnd w:id="33"/>
-            <w:r>
-              <w:rPr>
-                <w:rStyle w:val="CommentReference"/>
-                <w:rFonts w:eastAsiaTheme="minorEastAsia"/>
-              </w:rPr>
-              <w:commentReference w:id="33"/>
             </w:r>
           </w:p>
         </w:tc>
@@ -8326,7 +7781,7 @@
         </w:tc>
         <w:tc>
           <w:tcPr>
-            <w:tcW w:w="3410" w:type="pct"/>
+            <w:tcW w:w="3141" w:type="pct"/>
             <w:shd w:val="clear" w:color="auto" w:fill="004C45" w:themeFill="accent1"/>
             <w:vAlign w:val="center"/>
           </w:tcPr>
@@ -8355,7 +7810,7 @@
         </w:tc>
         <w:tc>
           <w:tcPr>
-            <w:tcW w:w="677" w:type="pct"/>
+            <w:tcW w:w="769" w:type="pct"/>
             <w:shd w:val="clear" w:color="auto" w:fill="004C45" w:themeFill="accent1"/>
             <w:vAlign w:val="center"/>
           </w:tcPr>
@@ -8399,7 +7854,7 @@
         </w:trPr>
         <w:tc>
           <w:tcPr>
-            <w:tcW w:w="374" w:type="pct"/>
+            <w:tcW w:w="551" w:type="pct"/>
           </w:tcPr>
           <w:p>
             <w:pPr>
@@ -8420,7 +7875,7 @@
                 <w:szCs w:val="20"/>
                 <w:lang w:eastAsia="it-IT"/>
               </w:rPr>
-              <w:t xml:space="preserve">[VULN1 </w:t>
+              <w:t>{#</w:t>
             </w:r>
             <w:r>
               <w:rPr>
@@ -8429,7 +7884,7 @@
                 <w:szCs w:val="20"/>
                 <w:lang w:eastAsia="it-IT"/>
               </w:rPr>
-              <w:t>INDEX</w:t>
+              <w:t>endpoints</w:t>
             </w:r>
             <w:r>
               <w:rPr>
@@ -8438,7 +7893,16 @@
                 <w:szCs w:val="20"/>
                 <w:lang w:eastAsia="it-IT"/>
               </w:rPr>
-              <w:t>1]</w:t>
+              <w:t>}</w:t>
+            </w:r>
+            <w:r>
+              <w:rPr>
+                <w:rFonts w:ascii="Segoe UI" w:hAnsi="Segoe UI" w:cs="Segoe UI"/>
+                <w:sz w:val="20"/>
+                <w:szCs w:val="20"/>
+                <w:lang w:eastAsia="it-IT"/>
+              </w:rPr>
+              <w:t>{index}</w:t>
             </w:r>
           </w:p>
         </w:tc>
@@ -8464,13 +7928,13 @@
                 <w:szCs w:val="20"/>
                 <w:lang w:eastAsia="it-IT"/>
               </w:rPr>
-              <w:t>[VULN1 MET1]</w:t>
+              <w:t>{http_method}</w:t>
             </w:r>
           </w:p>
         </w:tc>
         <w:tc>
           <w:tcPr>
-            <w:tcW w:w="3410" w:type="pct"/>
+            <w:tcW w:w="3141" w:type="pct"/>
           </w:tcPr>
           <w:p>
             <w:pPr>
@@ -8489,31 +7953,13 @@
                 <w:szCs w:val="20"/>
                 <w:lang w:eastAsia="it-IT"/>
               </w:rPr>
-              <w:t xml:space="preserve">[VULN1 </w:t>
-            </w:r>
-            <w:r>
-              <w:rPr>
-                <w:rFonts w:ascii="Segoe UI" w:hAnsi="Segoe UI" w:cs="Segoe UI"/>
-                <w:sz w:val="20"/>
-                <w:szCs w:val="20"/>
-                <w:lang w:eastAsia="it-IT"/>
-              </w:rPr>
-              <w:t>TARGET1</w:t>
-            </w:r>
-            <w:r>
-              <w:rPr>
-                <w:rFonts w:ascii="Segoe UI" w:hAnsi="Segoe UI" w:cs="Segoe UI"/>
-                <w:sz w:val="20"/>
-                <w:szCs w:val="20"/>
-                <w:lang w:eastAsia="it-IT"/>
-              </w:rPr>
-              <w:t>]</w:t>
+              <w:t>{path}</w:t>
             </w:r>
           </w:p>
         </w:tc>
         <w:tc>
           <w:tcPr>
-            <w:tcW w:w="677" w:type="pct"/>
+            <w:tcW w:w="769" w:type="pct"/>
           </w:tcPr>
           <w:p>
             <w:pPr>
@@ -8530,124 +7976,31 @@
                 <w:sz w:val="20"/>
                 <w:szCs w:val="20"/>
               </w:rPr>
-              <w:t>[VULN1 PARAMETER1]</w:t>
-            </w:r>
-          </w:p>
-        </w:tc>
-      </w:tr>
-      <w:tr>
-        <w:tblPrEx>
-          <w:tblBorders>
-            <w:top w:val="single" w:sz="4" w:space="0" w:color="auto"/>
-            <w:left w:val="single" w:sz="4" w:space="0" w:color="auto"/>
-            <w:bottom w:val="single" w:sz="4" w:space="0" w:color="auto"/>
-            <w:right w:val="single" w:sz="4" w:space="0" w:color="auto"/>
-            <w:insideH w:val="single" w:sz="4" w:space="0" w:color="auto"/>
-            <w:insideV w:val="single" w:sz="4" w:space="0" w:color="auto"/>
-          </w:tblBorders>
-        </w:tblPrEx>
-        <w:trPr>
-          <w:trHeight w:val="292"/>
-        </w:trPr>
-        <w:tc>
-          <w:tcPr>
-            <w:tcW w:w="374" w:type="pct"/>
-          </w:tcPr>
-          <w:p>
-            <w:pPr>
-              <w:spacing w:before="2" w:line="271" w:lineRule="exact"/>
-              <w:ind w:left="114"/>
-              <w:jc w:val="center"/>
+              <w:t>{parameter}</w:t>
+            </w:r>
+            <w:r>
               <w:rPr>
                 <w:rFonts w:ascii="Segoe UI" w:hAnsi="Segoe UI" w:cs="Segoe UI"/>
                 <w:sz w:val="20"/>
                 <w:szCs w:val="20"/>
-                <w:lang w:eastAsia="it-IT"/>
-              </w:rPr>
-            </w:pPr>
+              </w:rPr>
+              <w:t>{/</w:t>
+            </w:r>
             <w:r>
               <w:rPr>
                 <w:rFonts w:ascii="Segoe UI" w:hAnsi="Segoe UI" w:cs="Segoe UI"/>
                 <w:sz w:val="20"/>
                 <w:szCs w:val="20"/>
-                <w:lang w:eastAsia="it-IT"/>
-              </w:rPr>
-              <w:t>[VULN1 INDEX1]</w:t>
-            </w:r>
-          </w:p>
-        </w:tc>
-        <w:tc>
-          <w:tcPr>
-            <w:tcW w:w="539" w:type="pct"/>
-          </w:tcPr>
-          <w:p>
-            <w:pPr>
-              <w:spacing w:before="2" w:line="271" w:lineRule="exact"/>
-              <w:ind w:left="114"/>
+              </w:rPr>
+              <w:t>endpoints</w:t>
+            </w:r>
+            <w:r>
               <w:rPr>
                 <w:rFonts w:ascii="Segoe UI" w:hAnsi="Segoe UI" w:cs="Segoe UI"/>
                 <w:sz w:val="20"/>
                 <w:szCs w:val="20"/>
-                <w:lang w:eastAsia="it-IT"/>
-              </w:rPr>
-            </w:pPr>
-            <w:r>
-              <w:rPr>
-                <w:rFonts w:ascii="Segoe UI" w:hAnsi="Segoe UI" w:cs="Segoe UI"/>
-                <w:sz w:val="20"/>
-                <w:szCs w:val="20"/>
-                <w:lang w:eastAsia="it-IT"/>
-              </w:rPr>
-              <w:t>[VULN1 MET1]</w:t>
-            </w:r>
-          </w:p>
-        </w:tc>
-        <w:tc>
-          <w:tcPr>
-            <w:tcW w:w="3410" w:type="pct"/>
-          </w:tcPr>
-          <w:p>
-            <w:pPr>
-              <w:spacing w:before="2" w:line="271" w:lineRule="exact"/>
-              <w:ind w:left="114"/>
-              <w:rPr>
-                <w:rFonts w:ascii="Segoe UI" w:hAnsi="Segoe UI" w:cs="Segoe UI"/>
-                <w:sz w:val="20"/>
-                <w:szCs w:val="20"/>
-                <w:lang w:eastAsia="it-IT"/>
-              </w:rPr>
-            </w:pPr>
-            <w:r>
-              <w:rPr>
-                <w:rFonts w:ascii="Segoe UI" w:hAnsi="Segoe UI" w:cs="Segoe UI"/>
-                <w:sz w:val="20"/>
-                <w:szCs w:val="20"/>
-                <w:lang w:eastAsia="it-IT"/>
-              </w:rPr>
-              <w:t>[VULN1 TARGET2]</w:t>
-            </w:r>
-          </w:p>
-        </w:tc>
-        <w:tc>
-          <w:tcPr>
-            <w:tcW w:w="677" w:type="pct"/>
-          </w:tcPr>
-          <w:p>
-            <w:pPr>
-              <w:spacing w:before="2" w:line="271" w:lineRule="exact"/>
-              <w:rPr>
-                <w:rFonts w:ascii="Segoe UI" w:hAnsi="Segoe UI" w:cs="Segoe UI"/>
-                <w:sz w:val="20"/>
-                <w:szCs w:val="20"/>
-              </w:rPr>
-            </w:pPr>
-            <w:r>
-              <w:rPr>
-                <w:rFonts w:ascii="Segoe UI" w:hAnsi="Segoe UI" w:cs="Segoe UI"/>
-                <w:sz w:val="20"/>
-                <w:szCs w:val="20"/>
-              </w:rPr>
-              <w:t>[VULN2 PARAMTER2]</w:t>
+              </w:rPr>
+              <w:t>}</w:t>
             </w:r>
           </w:p>
         </w:tc>
@@ -8664,7 +8017,7 @@
           <w:szCs w:val="20"/>
         </w:rPr>
       </w:pPr>
-      <w:bookmarkStart w:id="34" w:name="_Toc220866007"/>
+      <w:bookmarkStart w:id="33" w:name="_Toc220866007"/>
       <w:r>
         <w:t xml:space="preserve">Tabella </w:t>
       </w:r>
@@ -8692,7 +8045,7 @@
       <w:r>
         <w:t>: Endpoint vulnerabili</w:t>
       </w:r>
-      <w:bookmarkEnd w:id="34"/>
+      <w:bookmarkEnd w:id="33"/>
     </w:p>
     <w:p>
       <w:pPr>
@@ -8704,98 +8057,311 @@
     </w:p>
     <w:p>
       <w:pPr>
-        <w:pStyle w:val="IntelleraBodyPT"/>
-      </w:pPr>
-      <w:r>
-        <w:t xml:space="preserve">[VULN1 </w:t>
-      </w:r>
-      <w:r>
-        <w:t>DESCRIPTION1</w:t>
-      </w:r>
-      <w:r>
-        <w:t>]</w:t>
+        <w:pStyle w:val="BodySubtitle"/>
+        <w:rPr>
+          <w:b w:val="0"/>
+          <w:bCs w:val="0"/>
+        </w:rPr>
+      </w:pPr>
+      <w:r>
+        <w:rPr>
+          <w:b w:val="0"/>
+          <w:bCs w:val="0"/>
+        </w:rPr>
+        <w:t xml:space="preserve">{#attacks} </w:t>
       </w:r>
     </w:p>
     <w:p>
       <w:pPr>
-        <w:pStyle w:val="IntelleraBodyPT"/>
-      </w:pPr>
-      <w:r>
-        <w:t>[VULN1 IMAGE1]</w:t>
+        <w:pStyle w:val="BodySubtitle"/>
+        <w:rPr>
+          <w:b w:val="0"/>
+          <w:bCs w:val="0"/>
+        </w:rPr>
+      </w:pPr>
+      <w:r>
+        <w:rPr>
+          <w:b w:val="0"/>
+          <w:bCs w:val="0"/>
+        </w:rPr>
+        <w:t>{#type ==</w:t>
+      </w:r>
+      <w:r>
+        <w:rPr>
+          <w:b w:val="0"/>
+          <w:bCs w:val="0"/>
+        </w:rPr>
+        <w:t xml:space="preserve"> </w:t>
+      </w:r>
+      <w:r>
+        <w:rPr>
+          <w:b w:val="0"/>
+          <w:bCs w:val="0"/>
+        </w:rPr>
+        <w:t>"</w:t>
+      </w:r>
+      <w:r>
+        <w:rPr>
+          <w:b w:val="0"/>
+          <w:bCs w:val="0"/>
+        </w:rPr>
+        <w:t>text</w:t>
+      </w:r>
+      <w:r>
+        <w:rPr>
+          <w:b w:val="0"/>
+          <w:bCs w:val="0"/>
+        </w:rPr>
+        <w:t>"}</w:t>
       </w:r>
     </w:p>
     <w:p>
       <w:pPr>
-        <w:pStyle w:val="IntelleraBodyPT"/>
-      </w:pPr>
-      <w:r>
-        <w:t>[VULN1 DESCRIPTION</w:t>
-      </w:r>
-      <w:r>
-        <w:t>2</w:t>
-      </w:r>
-      <w:r>
-        <w:t>]</w:t>
+        <w:pStyle w:val="BodySubtitle"/>
+        <w:rPr>
+          <w:b w:val="0"/>
+          <w:bCs w:val="0"/>
+        </w:rPr>
+      </w:pPr>
+      <w:r>
+        <w:rPr>
+          <w:b w:val="0"/>
+          <w:bCs w:val="0"/>
+        </w:rPr>
+        <w:t xml:space="preserve">{text} </w:t>
       </w:r>
     </w:p>
     <w:p>
       <w:pPr>
-        <w:pStyle w:val="IntelleraBodyPT"/>
-      </w:pPr>
-      <w:r>
-        <w:t>[VULN1 IMAGE</w:t>
-      </w:r>
-      <w:r>
-        <w:t>2</w:t>
-      </w:r>
-      <w:r>
-        <w:t>]</w:t>
+        <w:pStyle w:val="BodySubtitle"/>
+        <w:rPr>
+          <w:b w:val="0"/>
+          <w:bCs w:val="0"/>
+        </w:rPr>
+      </w:pPr>
+      <w:r>
+        <w:rPr>
+          <w:b w:val="0"/>
+          <w:bCs w:val="0"/>
+        </w:rPr>
+        <w:t>{</w:t>
+      </w:r>
+      <w:r>
+        <w:rPr>
+          <w:b w:val="0"/>
+          <w:bCs w:val="0"/>
+        </w:rPr>
+        <w:t>/</w:t>
+      </w:r>
+      <w:r>
+        <w:rPr>
+          <w:b w:val="0"/>
+          <w:bCs w:val="0"/>
+        </w:rPr>
+        <w:t>type == "text"}</w:t>
       </w:r>
     </w:p>
     <w:p>
       <w:pPr>
-        <w:pStyle w:val="IntelleraBodyPT"/>
-      </w:pPr>
+        <w:pStyle w:val="BodySubtitle"/>
+        <w:rPr>
+          <w:b w:val="0"/>
+          <w:bCs w:val="0"/>
+          <w:lang w:val="en-US"/>
+        </w:rPr>
+      </w:pPr>
+      <w:r>
+        <w:rPr>
+          <w:b w:val="0"/>
+          <w:bCs w:val="0"/>
+          <w:lang w:val="en-US"/>
+        </w:rPr>
+        <w:t>{#type == "image"}</w:t>
+      </w:r>
     </w:p>
     <w:p>
       <w:pPr>
-        <w:pStyle w:val="IntelleraBodyPT"/>
-      </w:pPr>
+        <w:pStyle w:val="BodySubtitle"/>
+        <w:rPr>
+          <w:b w:val="0"/>
+          <w:bCs w:val="0"/>
+          <w:lang w:val="en-US"/>
+        </w:rPr>
+      </w:pPr>
+      <w:r>
+        <w:rPr>
+          <w:b w:val="0"/>
+          <w:bCs w:val="0"/>
+          <w:lang w:val="en-US"/>
+        </w:rPr>
+        <w:t>{</w:t>
+      </w:r>
+      <w:r>
+        <w:rPr>
+          <w:b w:val="0"/>
+          <w:bCs w:val="0"/>
+          <w:lang w:val="en-US"/>
+        </w:rPr>
+        <w:t>%</w:t>
+      </w:r>
+      <w:r>
+        <w:rPr>
+          <w:b w:val="0"/>
+          <w:bCs w:val="0"/>
+          <w:lang w:val="en-US"/>
+        </w:rPr>
+        <w:t xml:space="preserve">image} </w:t>
+      </w:r>
     </w:p>
     <w:p>
       <w:pPr>
         <w:pStyle w:val="BodySubtitle"/>
-      </w:pPr>
-      <w:r>
-        <w:lastRenderedPageBreak/>
-        <w:t>Soluzione:</w:t>
+        <w:rPr>
+          <w:b w:val="0"/>
+          <w:bCs w:val="0"/>
+          <w:lang w:val="en-US"/>
+        </w:rPr>
+      </w:pPr>
+      <w:r>
+        <w:rPr>
+          <w:b w:val="0"/>
+          <w:bCs w:val="0"/>
+          <w:lang w:val="en-US"/>
+        </w:rPr>
+        <w:t xml:space="preserve">{caption} </w:t>
       </w:r>
     </w:p>
     <w:p>
       <w:pPr>
-        <w:pStyle w:val="IntelleraBodyPT"/>
-      </w:pPr>
-      <w:r>
-        <w:t>[VULN1 REMEDIETION]</w:t>
-      </w:r>
-      <w:r>
-        <w:br w:type="page"/>
+        <w:pStyle w:val="BodySubtitle"/>
+        <w:rPr>
+          <w:b w:val="0"/>
+          <w:bCs w:val="0"/>
+          <w:lang w:val="en-US"/>
+        </w:rPr>
+      </w:pPr>
+      <w:r>
+        <w:rPr>
+          <w:b w:val="0"/>
+          <w:bCs w:val="0"/>
+          <w:lang w:val="en-US"/>
+        </w:rPr>
+        <w:lastRenderedPageBreak/>
+        <w:t>{</w:t>
+      </w:r>
+      <w:r>
+        <w:rPr>
+          <w:b w:val="0"/>
+          <w:bCs w:val="0"/>
+          <w:lang w:val="en-US"/>
+        </w:rPr>
+        <w:t>/</w:t>
+      </w:r>
+      <w:r>
+        <w:rPr>
+          <w:b w:val="0"/>
+          <w:bCs w:val="0"/>
+          <w:lang w:val="en-US"/>
+        </w:rPr>
+        <w:t>type == "image"}</w:t>
       </w:r>
     </w:p>
     <w:p>
       <w:pPr>
+        <w:pStyle w:val="BodySubtitle"/>
+        <w:rPr>
+          <w:b w:val="0"/>
+          <w:bCs w:val="0"/>
+          <w:lang w:val="en-US"/>
+        </w:rPr>
+      </w:pPr>
+      <w:r>
+        <w:rPr>
+          <w:b w:val="0"/>
+          <w:bCs w:val="0"/>
+          <w:lang w:val="en-US"/>
+        </w:rPr>
+        <w:t>{/attacks}</w:t>
+      </w:r>
+    </w:p>
+    <w:p>
+      <w:pPr>
+        <w:pStyle w:val="BodySubtitle"/>
+        <w:rPr>
+          <w:lang w:val="en-US"/>
+        </w:rPr>
+      </w:pPr>
+      <w:r>
+        <w:rPr>
+          <w:lang w:val="en-US"/>
+        </w:rPr>
+        <w:t>Soluzione:</w:t>
+      </w:r>
+    </w:p>
+    <w:p>
+      <w:pPr>
+        <w:pStyle w:val="IntelleraBodyPT"/>
+        <w:rPr>
+          <w:lang w:val="en-US"/>
+        </w:rPr>
+      </w:pPr>
+      <w:r>
+        <w:rPr>
+          <w:lang w:val="en-US"/>
+        </w:rPr>
+        <w:t xml:space="preserve">{remediation} </w:t>
+      </w:r>
+    </w:p>
+    <w:p>
+      <w:pPr>
+        <w:pStyle w:val="IntelleraBodyPT"/>
+        <w:rPr>
+          <w:lang w:val="en-US"/>
+        </w:rPr>
+      </w:pPr>
+    </w:p>
+    <w:p>
+      <w:pPr>
+        <w:pStyle w:val="IntelleraBodyPT"/>
+        <w:rPr>
+          <w:lang w:val="en-US"/>
+        </w:rPr>
+      </w:pPr>
+      <w:r>
+        <w:rPr>
+          <w:lang w:val="en-US"/>
+        </w:rPr>
+        <w:t>{/vulnerabilities}</w:t>
+      </w:r>
+    </w:p>
+    <w:p>
+      <w:pPr>
+        <w:pStyle w:val="IntelleraBodyPT"/>
+        <w:rPr>
+          <w:lang w:val="en-US"/>
+        </w:rPr>
+      </w:pPr>
+      <w:r>
+        <w:rPr>
+          <w:lang w:val="en-US"/>
+        </w:rPr>
+        <w:br w:type="page"/>
+      </w:r>
+    </w:p>
+    <w:p>
+      <w:pPr>
         <w:pStyle w:val="Heading1"/>
       </w:pPr>
-      <w:bookmarkStart w:id="35" w:name="_Toc132300601"/>
-      <w:bookmarkStart w:id="36" w:name="_Toc132301434"/>
-      <w:bookmarkStart w:id="37" w:name="_Toc172822163"/>
+      <w:bookmarkStart w:id="34" w:name="_Toc132300601"/>
+      <w:bookmarkStart w:id="35" w:name="_Toc132301434"/>
+      <w:bookmarkStart w:id="36" w:name="_Toc172822163"/>
       <w:r>
         <w:lastRenderedPageBreak/>
         <w:t>Indice Figure</w:t>
       </w:r>
+      <w:bookmarkEnd w:id="34"/>
       <w:bookmarkEnd w:id="35"/>
       <w:bookmarkEnd w:id="36"/>
-      <w:bookmarkEnd w:id="37"/>
     </w:p>
     <w:p>
       <w:pPr>
@@ -8997,16 +8563,16 @@
       <w:pPr>
         <w:pStyle w:val="Heading1"/>
       </w:pPr>
-      <w:bookmarkStart w:id="38" w:name="_Toc132300602"/>
-      <w:bookmarkStart w:id="39" w:name="_Toc132301435"/>
-      <w:bookmarkStart w:id="40" w:name="_Toc172822164"/>
+      <w:bookmarkStart w:id="37" w:name="_Toc132300602"/>
+      <w:bookmarkStart w:id="38" w:name="_Toc132301435"/>
+      <w:bookmarkStart w:id="39" w:name="_Toc172822164"/>
       <w:r>
         <w:lastRenderedPageBreak/>
         <w:t>Indice Tabelle</w:t>
       </w:r>
+      <w:bookmarkEnd w:id="37"/>
       <w:bookmarkEnd w:id="38"/>
       <w:bookmarkEnd w:id="39"/>
-      <w:bookmarkEnd w:id="40"/>
     </w:p>
     <w:p>
       <w:pPr>
@@ -9565,9 +9131,9 @@
       </w:pPr>
     </w:p>
     <w:sectPr>
-      <w:headerReference w:type="default" r:id="rId18"/>
-      <w:footerReference w:type="default" r:id="rId19"/>
-      <w:headerReference w:type="first" r:id="rId20"/>
+      <w:headerReference w:type="default" r:id="rId15"/>
+      <w:footerReference w:type="default" r:id="rId16"/>
+      <w:headerReference w:type="first" r:id="rId17"/>
       <w:pgSz w:w="11906" w:h="16838" w:code="9"/>
       <w:pgMar w:top="1134" w:right="1134" w:bottom="2694" w:left="1134" w:header="454" w:footer="142" w:gutter="0"/>
       <w:cols w:space="708"/>
@@ -9576,39 +9142,6 @@
     </w:sectPr>
   </w:body>
 </w:document>
-</file>
-
-<file path=word/comments.xml><?xml version="1.0" encoding="utf-8"?>
-<w:comments xmlns:wpc="http://schemas.microsoft.com/office/word/2010/wordprocessingCanvas" xmlns:cx="http://schemas.microsoft.com/office/drawing/2014/chartex" xmlns:cx1="http://schemas.microsoft.com/office/drawing/2015/9/8/chartex" xmlns:cx2="http://schemas.microsoft.com/office/drawing/2015/10/21/chartex" xmlns:cx3="http://schemas.microsoft.com/office/drawing/2016/5/9/chartex" xmlns:cx4="http://schemas.microsoft.com/office/drawing/2016/5/10/chartex" xmlns:cx5="http://schemas.microsoft.com/office/drawing/2016/5/11/chartex" xmlns:cx6="http://schemas.microsoft.com/office/drawing/2016/5/12/chartex" xmlns:cx7="http://schemas.microsoft.com/office/drawing/2016/5/13/chartex" xmlns:cx8="http://schemas.microsoft.com/office/drawing/2016/5/14/chartex" xmlns:mc="http://schemas.openxmlformats.org/markup-compatibility/2006" xmlns:aink="http://schemas.microsoft.com/office/drawing/2016/ink" xmlns:am3d="http://schemas.microsoft.com/office/drawing/2017/model3d" xmlns:o="urn:schemas-microsoft-com:office:office" xmlns:oel="http://schemas.microsoft.com/office/2019/extlst" xmlns:r="http://schemas.openxmlformats.org/officeDocument/2006/relationships" xmlns:m="http://schemas.openxmlformats.org/officeDocument/2006/math" xmlns:v="urn:schemas-microsoft-com:vml" xmlns:wp14="http://schemas.microsoft.com/office/word/2010/wordprocessingDrawing" xmlns:wp="http://schemas.openxmlformats.org/drawingml/2006/wordprocessingDrawing" xmlns:w10="urn:schemas-microsoft-com:office:word" xmlns:w="http://schemas.openxmlformats.org/wordprocessingml/2006/main" xmlns:w14="http://schemas.microsoft.com/office/word/2010/wordml" xmlns:w15="http://schemas.microsoft.com/office/word/2012/wordml" xmlns:w16cex="http://schemas.microsoft.com/office/word/2018/wordml/cex" xmlns:w16cid="http://schemas.microsoft.com/office/word/2016/wordml/cid" xmlns:w16="http://schemas.microsoft.com/office/word/2018/wordml" xmlns:w16du="http://schemas.microsoft.com/office/word/2023/wordml/word16du" xmlns:w16sdtdh="http://schemas.microsoft.com/office/word/2020/wordml/sdtdatahash" xmlns:w16sdtfl="http://schemas.microsoft.com/office/word/2024/wordml/sdtformatlock" xmlns:w16se="http://schemas.microsoft.com/office/word/2015/wordml/symex" xmlns:wpg="http://schemas.microsoft.com/office/word/2010/wordprocessingGroup" xmlns:wpi="http://schemas.microsoft.com/office/word/2010/wordprocessingInk" xmlns:wne="http://schemas.microsoft.com/office/word/2006/wordml" xmlns:wps="http://schemas.microsoft.com/office/word/2010/wordprocessingShape" mc:Ignorable="w14 w15 w16se w16cid w16 w16cex w16sdtdh w16sdtfl w16du wp14">
-  <w:comment w:id="33" w:author="Author" w:initials="A">
-    <w:p>
-      <w:pPr>
-        <w:pStyle w:val="CommentText"/>
-      </w:pPr>
-      <w:r>
-        <w:rPr>
-          <w:rStyle w:val="CommentReference"/>
-        </w:rPr>
-        <w:annotationRef/>
-      </w:r>
-      <w:r>
-        <w:t>Utilizzare l’ID quando sono troppi gli endpoint, così da riferirsi nel testo, e.g. “Per il Target #1, si è osservato come..”</w:t>
-      </w:r>
-    </w:p>
-  </w:comment>
-</w:comments>
-</file>
-
-<file path=word/commentsExtended.xml><?xml version="1.0" encoding="utf-8"?>
-<w15:commentsEx xmlns:wpc="http://schemas.microsoft.com/office/word/2010/wordprocessingCanvas" xmlns:cx="http://schemas.microsoft.com/office/drawing/2014/chartex" xmlns:cx1="http://schemas.microsoft.com/office/drawing/2015/9/8/chartex" xmlns:cx2="http://schemas.microsoft.com/office/drawing/2015/10/21/chartex" xmlns:cx3="http://schemas.microsoft.com/office/drawing/2016/5/9/chartex" xmlns:cx4="http://schemas.microsoft.com/office/drawing/2016/5/10/chartex" xmlns:cx5="http://schemas.microsoft.com/office/drawing/2016/5/11/chartex" xmlns:cx6="http://schemas.microsoft.com/office/drawing/2016/5/12/chartex" xmlns:cx7="http://schemas.microsoft.com/office/drawing/2016/5/13/chartex" xmlns:cx8="http://schemas.microsoft.com/office/drawing/2016/5/14/chartex" xmlns:mc="http://schemas.openxmlformats.org/markup-compatibility/2006" xmlns:aink="http://schemas.microsoft.com/office/drawing/2016/ink" xmlns:am3d="http://schemas.microsoft.com/office/drawing/2017/model3d" xmlns:o="urn:schemas-microsoft-com:office:office" xmlns:oel="http://schemas.microsoft.com/office/2019/extlst" xmlns:r="http://schemas.openxmlformats.org/officeDocument/2006/relationships" xmlns:m="http://schemas.openxmlformats.org/officeDocument/2006/math" xmlns:v="urn:schemas-microsoft-com:vml" xmlns:wp14="http://schemas.microsoft.com/office/word/2010/wordprocessingDrawing" xmlns:wp="http://schemas.openxmlformats.org/drawingml/2006/wordprocessingDrawing" xmlns:w10="urn:schemas-microsoft-com:office:word" xmlns:w="http://schemas.openxmlformats.org/wordprocessingml/2006/main" xmlns:w14="http://schemas.microsoft.com/office/word/2010/wordml" xmlns:w15="http://schemas.microsoft.com/office/word/2012/wordml" xmlns:w16cex="http://schemas.microsoft.com/office/word/2018/wordml/cex" xmlns:w16cid="http://schemas.microsoft.com/office/word/2016/wordml/cid" xmlns:w16="http://schemas.microsoft.com/office/word/2018/wordml" xmlns:w16du="http://schemas.microsoft.com/office/word/2023/wordml/word16du" xmlns:w16sdtdh="http://schemas.microsoft.com/office/word/2020/wordml/sdtdatahash" xmlns:w16sdtfl="http://schemas.microsoft.com/office/word/2024/wordml/sdtformatlock" xmlns:w16se="http://schemas.microsoft.com/office/word/2015/wordml/symex" xmlns:wpg="http://schemas.microsoft.com/office/word/2010/wordprocessingGroup" xmlns:wpi="http://schemas.microsoft.com/office/word/2010/wordprocessingInk" xmlns:wne="http://schemas.microsoft.com/office/word/2006/wordml" xmlns:wps="http://schemas.microsoft.com/office/word/2010/wordprocessingShape" mc:Ignorable="w14 w15 w16se w16cid w16 w16cex w16sdtdh w16sdtfl w16du wp14">
-  <w15:commentEx w15:paraId="344965D2" w15:done="0"/>
-</w15:commentsEx>
-</file>
-
-<file path=word/commentsIds.xml><?xml version="1.0" encoding="utf-8"?>
-<w16cid:commentsIds xmlns:wpc="http://schemas.microsoft.com/office/word/2010/wordprocessingCanvas" xmlns:cx="http://schemas.microsoft.com/office/drawing/2014/chartex" xmlns:cx1="http://schemas.microsoft.com/office/drawing/2015/9/8/chartex" xmlns:cx2="http://schemas.microsoft.com/office/drawing/2015/10/21/chartex" xmlns:cx3="http://schemas.microsoft.com/office/drawing/2016/5/9/chartex" xmlns:cx4="http://schemas.microsoft.com/office/drawing/2016/5/10/chartex" xmlns:cx5="http://schemas.microsoft.com/office/drawing/2016/5/11/chartex" xmlns:cx6="http://schemas.microsoft.com/office/drawing/2016/5/12/chartex" xmlns:cx7="http://schemas.microsoft.com/office/drawing/2016/5/13/chartex" xmlns:cx8="http://schemas.microsoft.com/office/drawing/2016/5/14/chartex" xmlns:mc="http://schemas.openxmlformats.org/markup-compatibility/2006" xmlns:aink="http://schemas.microsoft.com/office/drawing/2016/ink" xmlns:am3d="http://schemas.microsoft.com/office/drawing/2017/model3d" xmlns:o="urn:schemas-microsoft-com:office:office" xmlns:oel="http://schemas.microsoft.com/office/2019/extlst" xmlns:r="http://schemas.openxmlformats.org/officeDocument/2006/relationships" xmlns:m="http://schemas.openxmlformats.org/officeDocument/2006/math" xmlns:v="urn:schemas-microsoft-com:vml" xmlns:wp14="http://schemas.microsoft.com/office/word/2010/wordprocessingDrawing" xmlns:wp="http://schemas.openxmlformats.org/drawingml/2006/wordprocessingDrawing" xmlns:w10="urn:schemas-microsoft-com:office:word" xmlns:w="http://schemas.openxmlformats.org/wordprocessingml/2006/main" xmlns:w14="http://schemas.microsoft.com/office/word/2010/wordml" xmlns:w15="http://schemas.microsoft.com/office/word/2012/wordml" xmlns:w16cex="http://schemas.microsoft.com/office/word/2018/wordml/cex" xmlns:w16cid="http://schemas.microsoft.com/office/word/2016/wordml/cid" xmlns:w16="http://schemas.microsoft.com/office/word/2018/wordml" xmlns:w16du="http://schemas.microsoft.com/office/word/2023/wordml/word16du" xmlns:w16sdtdh="http://schemas.microsoft.com/office/word/2020/wordml/sdtdatahash" xmlns:w16sdtfl="http://schemas.microsoft.com/office/word/2024/wordml/sdtformatlock" xmlns:w16se="http://schemas.microsoft.com/office/word/2015/wordml/symex" xmlns:wpg="http://schemas.microsoft.com/office/word/2010/wordprocessingGroup" xmlns:wpi="http://schemas.microsoft.com/office/word/2010/wordprocessingInk" xmlns:wne="http://schemas.microsoft.com/office/word/2006/wordml" xmlns:wps="http://schemas.microsoft.com/office/word/2010/wordprocessingShape" mc:Ignorable="w14 w15 w16se w16cid w16 w16cex w16sdtdh w16sdtfl w16du wp14">
-  <w16cid:commentId w16cid:paraId="344965D2" w16cid:durableId="4DD51605"/>
-</w16cid:commentsIds>
 </file>
 
 <file path=word/endnotes.xml><?xml version="1.0" encoding="utf-8"?>
@@ -10222,18 +9755,8 @@
         <w:sz w:val="18"/>
         <w:szCs w:val="18"/>
       </w:rPr>
-      <w:t xml:space="preserve">Note di </w:t>
+      <w:t>Note di riservatezza</w:t>
     </w:r>
-    <w:proofErr w:type="gramStart"/>
-    <w:r>
-      <w:rPr>
-        <w:iCs/>
-        <w:sz w:val="18"/>
-        <w:szCs w:val="18"/>
-      </w:rPr>
-      <w:t>riservatezza</w:t>
-    </w:r>
-    <w:proofErr w:type="gramEnd"/>
     <w:r>
       <w:rPr>
         <w:sz w:val="18"/>
@@ -10255,7 +9778,23 @@
         <w:sz w:val="18"/>
         <w:szCs w:val="18"/>
       </w:rPr>
-      <w:t>[CLIENT]</w:t>
+      <w:t>{</w:t>
+    </w:r>
+    <w:r>
+      <w:rPr>
+        <w:i/>
+        <w:sz w:val="18"/>
+        <w:szCs w:val="18"/>
+      </w:rPr>
+      <w:t>client_name</w:t>
+    </w:r>
+    <w:r>
+      <w:rPr>
+        <w:i/>
+        <w:sz w:val="18"/>
+        <w:szCs w:val="18"/>
+      </w:rPr>
+      <w:t>}</w:t>
     </w:r>
   </w:p>
   <w:p/>
@@ -13708,6 +13247,7 @@
   <w:style w:type="character" w:default="1" w:styleId="DefaultParagraphFont">
     <w:name w:val="Default Paragraph Font"/>
     <w:uiPriority w:val="1"/>
+    <w:semiHidden/>
     <w:unhideWhenUsed/>
   </w:style>
   <w:style w:type="table" w:default="1" w:styleId="TableNormal">

</xml_diff>

<commit_message>
Removed langage constraints in the values and the creation of seperate folder for each vulnerability
</commit_message>
<xml_diff>
--- a/templates/WAPT_template.docx
+++ b/templates/WAPT_template.docx
@@ -2365,7 +2365,21 @@
         <w:rPr>
           <w:i/>
         </w:rPr>
-        <w:t>{testing_company_name}</w:t>
+        <w:t>{</w:t>
+      </w:r>
+      <w:proofErr w:type="spellStart"/>
+      <w:r>
+        <w:rPr>
+          <w:i/>
+        </w:rPr>
+        <w:t>testing_company_name</w:t>
+      </w:r>
+      <w:proofErr w:type="spellEnd"/>
+      <w:r>
+        <w:rPr>
+          <w:i/>
+        </w:rPr>
+        <w:t>}</w:t>
       </w:r>
       <w:r>
         <w:rPr>
@@ -2671,7 +2685,21 @@
               <w:rPr>
                 <w:rFonts w:ascii="Segoe UI" w:hAnsi="Segoe UI" w:cs="Segoe UI"/>
               </w:rPr>
-              <w:t>{approver_name}</w:t>
+              <w:t>{</w:t>
+            </w:r>
+            <w:proofErr w:type="spellStart"/>
+            <w:r>
+              <w:rPr>
+                <w:rFonts w:ascii="Segoe UI" w:hAnsi="Segoe UI" w:cs="Segoe UI"/>
+              </w:rPr>
+              <w:t>approver_name</w:t>
+            </w:r>
+            <w:proofErr w:type="spellEnd"/>
+            <w:r>
+              <w:rPr>
+                <w:rFonts w:ascii="Segoe UI" w:hAnsi="Segoe UI" w:cs="Segoe UI"/>
+              </w:rPr>
+              <w:t>}</w:t>
             </w:r>
           </w:p>
         </w:tc>
@@ -2690,7 +2718,21 @@
               <w:rPr>
                 <w:rFonts w:ascii="Segoe UI" w:hAnsi="Segoe UI" w:cs="Segoe UI"/>
               </w:rPr>
-              <w:t>{approver_date}</w:t>
+              <w:t>{</w:t>
+            </w:r>
+            <w:proofErr w:type="spellStart"/>
+            <w:r>
+              <w:rPr>
+                <w:rFonts w:ascii="Segoe UI" w:hAnsi="Segoe UI" w:cs="Segoe UI"/>
+              </w:rPr>
+              <w:t>approver_date</w:t>
+            </w:r>
+            <w:proofErr w:type="spellEnd"/>
+            <w:r>
+              <w:rPr>
+                <w:rFonts w:ascii="Segoe UI" w:hAnsi="Segoe UI" w:cs="Segoe UI"/>
+              </w:rPr>
+              <w:t>}</w:t>
             </w:r>
           </w:p>
         </w:tc>
@@ -2853,7 +2895,25 @@
                 <w:sz w:val="20"/>
                 <w:szCs w:val="20"/>
               </w:rPr>
-              <w:t>{role}</w:t>
+              <w:t>{</w:t>
+            </w:r>
+            <w:proofErr w:type="spellStart"/>
+            <w:r>
+              <w:rPr>
+                <w:rFonts w:ascii="Segoe UI" w:hAnsi="Segoe UI" w:cs="Segoe UI"/>
+                <w:sz w:val="20"/>
+                <w:szCs w:val="20"/>
+              </w:rPr>
+              <w:t>role</w:t>
+            </w:r>
+            <w:proofErr w:type="spellEnd"/>
+            <w:r>
+              <w:rPr>
+                <w:rFonts w:ascii="Segoe UI" w:hAnsi="Segoe UI" w:cs="Segoe UI"/>
+                <w:sz w:val="20"/>
+                <w:szCs w:val="20"/>
+              </w:rPr>
+              <w:t>}</w:t>
             </w:r>
           </w:p>
         </w:tc>
@@ -2990,7 +3050,25 @@
                 <w:sz w:val="20"/>
                 <w:szCs w:val="20"/>
               </w:rPr>
-              <w:t>{revisioner_name}</w:t>
+              <w:t>{</w:t>
+            </w:r>
+            <w:proofErr w:type="spellStart"/>
+            <w:r>
+              <w:rPr>
+                <w:rFonts w:ascii="Segoe UI" w:hAnsi="Segoe UI" w:cs="Segoe UI"/>
+                <w:sz w:val="20"/>
+                <w:szCs w:val="20"/>
+              </w:rPr>
+              <w:t>revisioner_name</w:t>
+            </w:r>
+            <w:proofErr w:type="spellEnd"/>
+            <w:r>
+              <w:rPr>
+                <w:rFonts w:ascii="Segoe UI" w:hAnsi="Segoe UI" w:cs="Segoe UI"/>
+                <w:sz w:val="20"/>
+                <w:szCs w:val="20"/>
+              </w:rPr>
+              <w:t>}</w:t>
             </w:r>
           </w:p>
         </w:tc>
@@ -3039,7 +3117,25 @@
                 <w:sz w:val="20"/>
                 <w:szCs w:val="20"/>
               </w:rPr>
-              <w:t>{revisioner_role}</w:t>
+              <w:t>{</w:t>
+            </w:r>
+            <w:proofErr w:type="spellStart"/>
+            <w:r>
+              <w:rPr>
+                <w:rFonts w:ascii="Segoe UI" w:hAnsi="Segoe UI" w:cs="Segoe UI"/>
+                <w:sz w:val="20"/>
+                <w:szCs w:val="20"/>
+              </w:rPr>
+              <w:t>revisioner_role</w:t>
+            </w:r>
+            <w:proofErr w:type="spellEnd"/>
+            <w:r>
+              <w:rPr>
+                <w:rFonts w:ascii="Segoe UI" w:hAnsi="Segoe UI" w:cs="Segoe UI"/>
+                <w:sz w:val="20"/>
+                <w:szCs w:val="20"/>
+              </w:rPr>
+              <w:t>}</w:t>
             </w:r>
           </w:p>
         </w:tc>
@@ -3086,7 +3182,21 @@
               <w:rPr>
                 <w:rFonts w:ascii="Segoe UI" w:hAnsi="Segoe UI" w:cs="Segoe UI"/>
               </w:rPr>
-              <w:t>{revisioner_date}</w:t>
+              <w:t>{</w:t>
+            </w:r>
+            <w:proofErr w:type="spellStart"/>
+            <w:r>
+              <w:rPr>
+                <w:rFonts w:ascii="Segoe UI" w:hAnsi="Segoe UI" w:cs="Segoe UI"/>
+              </w:rPr>
+              <w:t>revisioner_date</w:t>
+            </w:r>
+            <w:proofErr w:type="spellEnd"/>
+            <w:r>
+              <w:rPr>
+                <w:rFonts w:ascii="Segoe UI" w:hAnsi="Segoe UI" w:cs="Segoe UI"/>
+              </w:rPr>
+              <w:t>}</w:t>
             </w:r>
           </w:p>
         </w:tc>
@@ -3146,120 +3256,198 @@
       </w:pPr>
       <w:r>
         <w:rPr>
+          <w:iCs/>
+        </w:rPr>
+        <w:t>{</w:t>
+      </w:r>
+      <w:proofErr w:type="spellStart"/>
+      <w:r>
+        <w:rPr>
+          <w:iCs/>
+        </w:rPr>
+        <w:t>testing_company_name</w:t>
+      </w:r>
+      <w:proofErr w:type="spellEnd"/>
+      <w:r>
+        <w:rPr>
+          <w:iCs/>
+        </w:rPr>
+        <w:t>}</w:t>
+      </w:r>
+      <w:r>
+        <w:t xml:space="preserve"> </w:t>
+      </w:r>
+      <w:r>
+        <w:t xml:space="preserve">è stata ingaggiata da </w:t>
+      </w:r>
+      <w:r>
+        <w:rPr>
+          <w:iCs/>
+        </w:rPr>
+        <w:t>{</w:t>
+      </w:r>
+      <w:proofErr w:type="spellStart"/>
+      <w:r>
+        <w:rPr>
+          <w:iCs/>
+        </w:rPr>
+        <w:t>client_name</w:t>
+      </w:r>
+      <w:proofErr w:type="spellEnd"/>
+      <w:r>
+        <w:rPr>
+          <w:iCs/>
+        </w:rPr>
+        <w:t>}</w:t>
+      </w:r>
+      <w:r>
+        <w:t xml:space="preserve"> per condurre attività di Web Application </w:t>
+      </w:r>
+      <w:proofErr w:type="spellStart"/>
+      <w:r>
+        <w:t>Penetration</w:t>
+      </w:r>
+      <w:proofErr w:type="spellEnd"/>
+      <w:r>
+        <w:t xml:space="preserve"> Test sulle sue applicazioni in esecuzione all'interno/esterno della rete del Cliente. </w:t>
+      </w:r>
+      <w:r>
+        <w:t xml:space="preserve">Le attività tecniche </w:t>
+      </w:r>
+      <w:r>
+        <w:t xml:space="preserve">hanno avuto inizio il giorno </w:t>
+      </w:r>
+      <w:r>
+        <w:t>{</w:t>
+      </w:r>
+      <w:proofErr w:type="spellStart"/>
+      <w:r>
+        <w:t>testing_</w:t>
+      </w:r>
+      <w:r>
+        <w:t>start_date</w:t>
+      </w:r>
+      <w:proofErr w:type="spellEnd"/>
+      <w:r>
+        <w:t xml:space="preserve">} </w:t>
+      </w:r>
+      <w:r>
+        <w:t xml:space="preserve">e hanno coinvolto le risorse di </w:t>
+      </w:r>
+      <w:r>
+        <w:rPr>
           <w:i/>
         </w:rPr>
         <w:t>{</w:t>
       </w:r>
+      <w:proofErr w:type="spellStart"/>
       <w:r>
         <w:rPr>
           <w:i/>
         </w:rPr>
-        <w:t>testing_company</w:t>
-      </w:r>
+        <w:t>testing_company_name</w:t>
+      </w:r>
+      <w:proofErr w:type="spellEnd"/>
       <w:r>
         <w:rPr>
           <w:i/>
         </w:rPr>
-        <w:t>_name}</w:t>
+        <w:t>}</w:t>
       </w:r>
       <w:r>
         <w:t xml:space="preserve"> </w:t>
       </w:r>
       <w:r>
-        <w:t xml:space="preserve">è stata ingaggiata da </w:t>
+        <w:t xml:space="preserve">per una durata di </w:t>
+      </w:r>
+      <w:r>
+        <w:t>{</w:t>
+      </w:r>
+      <w:proofErr w:type="spellStart"/>
+      <w:r>
+        <w:t>testing_duration</w:t>
+      </w:r>
+      <w:proofErr w:type="spellEnd"/>
+      <w:r>
+        <w:t>}</w:t>
+      </w:r>
+      <w:r>
+        <w:t xml:space="preserve"> giorni lavorativi </w:t>
+      </w:r>
+      <w:r>
+        <w:t>durante il</w:t>
+      </w:r>
+      <w:r>
+        <w:t xml:space="preserve"> periodo </w:t>
+      </w:r>
+      <w:r>
+        <w:t xml:space="preserve">compreso tra il </w:t>
+      </w:r>
+      <w:r>
+        <w:t>{</w:t>
+      </w:r>
+      <w:proofErr w:type="spellStart"/>
+      <w:r>
+        <w:t>testing_</w:t>
+      </w:r>
+      <w:r>
+        <w:t>start_date</w:t>
+      </w:r>
+      <w:proofErr w:type="spellEnd"/>
+      <w:r>
+        <w:t xml:space="preserve">} </w:t>
+      </w:r>
+      <w:r>
+        <w:t>e il</w:t>
+      </w:r>
+      <w:r>
+        <w:t xml:space="preserve"> </w:t>
+      </w:r>
+      <w:r>
+        <w:t>{</w:t>
+      </w:r>
+      <w:proofErr w:type="spellStart"/>
+      <w:r>
+        <w:t>testing_end_date</w:t>
+      </w:r>
+      <w:proofErr w:type="spellEnd"/>
+      <w:r>
+        <w:t>}</w:t>
+      </w:r>
+      <w:r>
+        <w:t xml:space="preserve">. I test sono stati condotti </w:t>
+      </w:r>
+      <w:r>
+        <w:t>da</w:t>
+      </w:r>
+      <w:r>
+        <w:t xml:space="preserve"> remoto </w:t>
+      </w:r>
+      <w:r>
+        <w:t xml:space="preserve">presso la </w:t>
+      </w:r>
+      <w:r>
+        <w:t xml:space="preserve">sede di </w:t>
       </w:r>
       <w:r>
         <w:rPr>
           <w:i/>
         </w:rPr>
-        <w:t>{client_name}</w:t>
-      </w:r>
-      <w:r>
-        <w:t xml:space="preserve"> per condurre attività di Web Application Penetration Test sulle sue applicazioni in esecuzione all'interno/esterno della rete del Cliente. </w:t>
-      </w:r>
-      <w:r>
-        <w:t xml:space="preserve">Le attività tecniche </w:t>
-      </w:r>
-      <w:r>
-        <w:t xml:space="preserve">hanno avuto inizio il giorno </w:t>
-      </w:r>
-      <w:r>
         <w:t>{</w:t>
       </w:r>
-      <w:r>
-        <w:t>testing_</w:t>
-      </w:r>
-      <w:r>
-        <w:t xml:space="preserve">start_date} </w:t>
-      </w:r>
-      <w:r>
-        <w:t xml:space="preserve">e hanno coinvolto le risorse di </w:t>
-      </w:r>
+      <w:proofErr w:type="spellStart"/>
       <w:r>
         <w:rPr>
           <w:i/>
         </w:rPr>
-        <w:t>{testing_company_name}</w:t>
-      </w:r>
-      <w:r>
-        <w:t xml:space="preserve"> </w:t>
-      </w:r>
-      <w:r>
-        <w:t xml:space="preserve">per una durata di </w:t>
-      </w:r>
-      <w:r>
-        <w:t>{testing_duration}</w:t>
-      </w:r>
-      <w:r>
-        <w:t xml:space="preserve"> giorni lavorativi </w:t>
-      </w:r>
-      <w:r>
-        <w:t>durante il</w:t>
-      </w:r>
-      <w:r>
-        <w:t xml:space="preserve"> periodo </w:t>
-      </w:r>
-      <w:r>
-        <w:t xml:space="preserve">compreso tra il </w:t>
-      </w:r>
-      <w:r>
-        <w:t>{</w:t>
-      </w:r>
-      <w:r>
-        <w:t>testing_</w:t>
-      </w:r>
-      <w:r>
-        <w:t xml:space="preserve">start_date} </w:t>
-      </w:r>
-      <w:r>
-        <w:t>e il</w:t>
-      </w:r>
-      <w:r>
-        <w:t xml:space="preserve"> </w:t>
-      </w:r>
-      <w:r>
-        <w:t>{testing_end_date}</w:t>
-      </w:r>
-      <w:r>
-        <w:t xml:space="preserve">. I test sono stati condotti </w:t>
-      </w:r>
-      <w:r>
-        <w:t>da</w:t>
-      </w:r>
-      <w:r>
-        <w:t xml:space="preserve"> remoto </w:t>
-      </w:r>
-      <w:r>
-        <w:t xml:space="preserve">presso la </w:t>
-      </w:r>
-      <w:r>
-        <w:t xml:space="preserve">sede di </w:t>
-      </w:r>
+        <w:t>testing_company_name</w:t>
+      </w:r>
+      <w:proofErr w:type="spellEnd"/>
       <w:r>
         <w:rPr>
           <w:i/>
         </w:rPr>
-        <w:t>{testing_company_name}</w:t>
+        <w:t>}</w:t>
       </w:r>
       <w:r>
         <w:t xml:space="preserve"> </w:t>
@@ -3271,13 +3459,35 @@
         <w:t xml:space="preserve">. </w:t>
       </w:r>
       <w:r>
-        <w:t xml:space="preserve">L’attività di Penetration Test è stata effettuata in modalità </w:t>
+        <w:t xml:space="preserve">L’attività di </w:t>
+      </w:r>
+      <w:proofErr w:type="spellStart"/>
+      <w:r>
+        <w:t>Penetration</w:t>
+      </w:r>
+      <w:proofErr w:type="spellEnd"/>
+      <w:r>
+        <w:t xml:space="preserve"> Test è stata effettuata in modalità </w:t>
       </w:r>
       <w:r>
         <w:rPr>
           <w:b/>
         </w:rPr>
-        <w:t>{testing_mode}</w:t>
+        <w:t>{</w:t>
+      </w:r>
+      <w:proofErr w:type="spellStart"/>
+      <w:r>
+        <w:rPr>
+          <w:b/>
+        </w:rPr>
+        <w:t>testing_mode</w:t>
+      </w:r>
+      <w:proofErr w:type="spellEnd"/>
+      <w:r>
+        <w:rPr>
+          <w:b/>
+        </w:rPr>
+        <w:t>}</w:t>
       </w:r>
       <w:r>
         <w:rPr>
@@ -3312,7 +3522,21 @@
         <w:rPr>
           <w:i/>
         </w:rPr>
-        <w:t>{testing_company_name}</w:t>
+        <w:t>{</w:t>
+      </w:r>
+      <w:proofErr w:type="spellStart"/>
+      <w:r>
+        <w:rPr>
+          <w:i/>
+        </w:rPr>
+        <w:t>testing_company_name</w:t>
+      </w:r>
+      <w:proofErr w:type="spellEnd"/>
+      <w:r>
+        <w:rPr>
+          <w:i/>
+        </w:rPr>
+        <w:t>}</w:t>
       </w:r>
       <w:r>
         <w:t xml:space="preserve"> per il rientro allo stato di conformità con le best practices in ambito di IT Security</w:t>
@@ -3512,8 +3736,13 @@
         <w:pStyle w:val="BodySubtitle"/>
       </w:pPr>
       <w:r>
-        <w:t>Step 1: Reconnaissance</w:t>
-      </w:r>
+        <w:t xml:space="preserve">Step 1: </w:t>
+      </w:r>
+      <w:proofErr w:type="spellStart"/>
+      <w:r>
+        <w:t>Reconnaissance</w:t>
+      </w:r>
+      <w:proofErr w:type="spellEnd"/>
     </w:p>
     <w:p>
       <w:pPr>
@@ -3521,13 +3750,31 @@
       </w:pPr>
       <w:r>
         <w:lastRenderedPageBreak/>
-        <w:t xml:space="preserve">La prima fase del penetration testing è denominata </w:t>
-      </w:r>
+        <w:t xml:space="preserve">La prima fase del </w:t>
+      </w:r>
+      <w:proofErr w:type="spellStart"/>
+      <w:r>
+        <w:t>penetration</w:t>
+      </w:r>
+      <w:proofErr w:type="spellEnd"/>
+      <w:r>
+        <w:t xml:space="preserve"> testing è denominata </w:t>
+      </w:r>
+      <w:proofErr w:type="spellStart"/>
       <w:r>
         <w:t>reconnaissance</w:t>
       </w:r>
-      <w:r>
-        <w:t xml:space="preserve">. Durante questa fase, il penetration tester raccoglie informazioni sul sistema target, come informazioni sulla topologia della rete, sui sistemi operativi e sulle applicazioni, sugli account utente. L'obiettivo è raccogliere il maggior numero di dati possibile, in modo </w:t>
+      <w:proofErr w:type="spellEnd"/>
+      <w:r>
+        <w:t xml:space="preserve">. Durante questa fase, il </w:t>
+      </w:r>
+      <w:proofErr w:type="spellStart"/>
+      <w:r>
+        <w:t>penetration</w:t>
+      </w:r>
+      <w:proofErr w:type="spellEnd"/>
+      <w:r>
+        <w:t xml:space="preserve"> tester raccoglie informazioni sul sistema target, come informazioni sulla topologia della rete, sui sistemi operativi e sulle applicazioni, sugli account utente. L'obiettivo è raccogliere il maggior numero di dati possibile, in modo </w:t>
       </w:r>
       <w:r>
         <w:t xml:space="preserve">da </w:t>
@@ -3549,9 +3796,11 @@
       <w:r>
         <w:t xml:space="preserve">La fase di </w:t>
       </w:r>
+      <w:proofErr w:type="spellStart"/>
       <w:r>
         <w:t>reconnaissance</w:t>
       </w:r>
+      <w:proofErr w:type="spellEnd"/>
       <w:r>
         <w:t xml:space="preserve"> </w:t>
       </w:r>
@@ -3564,9 +3813,11 @@
       <w:r>
         <w:t xml:space="preserve"> metodi utilizzati per recuperare le informazioni. La </w:t>
       </w:r>
+      <w:proofErr w:type="spellStart"/>
       <w:r>
         <w:t>reconnaissance</w:t>
       </w:r>
+      <w:proofErr w:type="spellEnd"/>
       <w:r>
         <w:t xml:space="preserve"> </w:t>
       </w:r>
@@ -3579,9 +3830,11 @@
       <w:r>
         <w:t xml:space="preserve"> informazioni da risorse già pubblicamente disponibili, mentre la </w:t>
       </w:r>
+      <w:proofErr w:type="spellStart"/>
       <w:r>
         <w:t>reconnaissance</w:t>
       </w:r>
+      <w:proofErr w:type="spellEnd"/>
       <w:r>
         <w:t xml:space="preserve"> </w:t>
       </w:r>
@@ -3589,7 +3842,15 @@
         <w:t>attiva prevede l'interazione diretta con il sistema target</w:t>
       </w:r>
       <w:r>
-        <w:t xml:space="preserve"> per il collezionamento dei dati</w:t>
+        <w:t xml:space="preserve"> per il </w:t>
+      </w:r>
+      <w:proofErr w:type="spellStart"/>
+      <w:r>
+        <w:t>collezionamento</w:t>
+      </w:r>
+      <w:proofErr w:type="spellEnd"/>
+      <w:r>
+        <w:t xml:space="preserve"> dei dati</w:t>
       </w:r>
       <w:r>
         <w:t xml:space="preserve">. </w:t>
@@ -3631,9 +3892,11 @@
       <w:r>
         <w:t xml:space="preserve">fase di </w:t>
       </w:r>
+      <w:proofErr w:type="spellStart"/>
       <w:r>
         <w:t>reconnaissance</w:t>
       </w:r>
+      <w:proofErr w:type="spellEnd"/>
       <w:r>
         <w:t>, il passo successivo consiste nell'eseguire l</w:t>
       </w:r>
@@ -3647,7 +3910,15 @@
         <w:t>scanning</w:t>
       </w:r>
       <w:r>
-        <w:t xml:space="preserve">. In questa fase, il penetration tester utilizza vari strumenti </w:t>
+        <w:t xml:space="preserve">. In questa fase, il </w:t>
+      </w:r>
+      <w:proofErr w:type="spellStart"/>
+      <w:r>
+        <w:t>penetration</w:t>
+      </w:r>
+      <w:proofErr w:type="spellEnd"/>
+      <w:r>
+        <w:t xml:space="preserve"> tester utilizza vari strumenti </w:t>
       </w:r>
       <w:r>
         <w:t>al fine di</w:t>
@@ -3678,9 +3949,19 @@
       <w:r>
         <w:t xml:space="preserve">Questa fase può anche essere eseguita come attività indipendente; in questi casi, viene definita semplicemente </w:t>
       </w:r>
-      <w:r>
-        <w:t>vulnerability assessment</w:t>
-      </w:r>
+      <w:proofErr w:type="spellStart"/>
+      <w:r>
+        <w:t>vulnerability</w:t>
+      </w:r>
+      <w:proofErr w:type="spellEnd"/>
+      <w:r>
+        <w:t xml:space="preserve"> </w:t>
+      </w:r>
+      <w:proofErr w:type="spellStart"/>
+      <w:r>
+        <w:t>assessment</w:t>
+      </w:r>
+      <w:proofErr w:type="spellEnd"/>
       <w:r>
         <w:t xml:space="preserve"> e viene eseguita</w:t>
       </w:r>
@@ -3751,7 +4032,15 @@
         <w:t xml:space="preserve">sia essenziale per la sicurezza informatica, per raggiungere il suo pieno potenziale ha bisogno dell'intervento </w:t>
       </w:r>
       <w:r>
-        <w:t>analitico di penetration tester</w:t>
+        <w:t xml:space="preserve">analitico di </w:t>
+      </w:r>
+      <w:proofErr w:type="spellStart"/>
+      <w:r>
+        <w:t>penetration</w:t>
+      </w:r>
+      <w:proofErr w:type="spellEnd"/>
+      <w:r>
+        <w:t xml:space="preserve"> tester</w:t>
       </w:r>
       <w:r>
         <w:t>.</w:t>
@@ -3762,28 +4051,69 @@
         <w:pStyle w:val="BodySubtitle"/>
       </w:pPr>
       <w:r>
-        <w:t>Step 3: Vulnerability Assessment</w:t>
-      </w:r>
+        <w:t xml:space="preserve">Step 3: </w:t>
+      </w:r>
+      <w:proofErr w:type="spellStart"/>
+      <w:r>
+        <w:t>Vulnerability</w:t>
+      </w:r>
+      <w:proofErr w:type="spellEnd"/>
+      <w:r>
+        <w:t xml:space="preserve"> </w:t>
+      </w:r>
+      <w:proofErr w:type="spellStart"/>
+      <w:r>
+        <w:t>Assessment</w:t>
+      </w:r>
+      <w:proofErr w:type="spellEnd"/>
     </w:p>
     <w:p>
       <w:pPr>
         <w:pStyle w:val="IntelleraBodyPT"/>
       </w:pPr>
       <w:r>
-        <w:t xml:space="preserve">La terza fase del penetration testing è </w:t>
+        <w:t xml:space="preserve">La terza fase del </w:t>
+      </w:r>
+      <w:proofErr w:type="spellStart"/>
+      <w:r>
+        <w:t>penetration</w:t>
+      </w:r>
+      <w:proofErr w:type="spellEnd"/>
+      <w:r>
+        <w:t xml:space="preserve"> testing è </w:t>
       </w:r>
       <w:r>
         <w:t xml:space="preserve">il </w:t>
       </w:r>
-      <w:r>
-        <w:t>Vulnerability Assessment</w:t>
-      </w:r>
-      <w:r>
-        <w:t xml:space="preserve">. In questa fase, il penetration tester utilizza tutti i dati raccolti nelle fasi di </w:t>
-      </w:r>
+      <w:proofErr w:type="spellStart"/>
+      <w:r>
+        <w:t>Vulnerability</w:t>
+      </w:r>
+      <w:proofErr w:type="spellEnd"/>
+      <w:r>
+        <w:t xml:space="preserve"> </w:t>
+      </w:r>
+      <w:proofErr w:type="spellStart"/>
+      <w:r>
+        <w:t>Assessment</w:t>
+      </w:r>
+      <w:proofErr w:type="spellEnd"/>
+      <w:r>
+        <w:t xml:space="preserve">. In questa fase, il </w:t>
+      </w:r>
+      <w:proofErr w:type="spellStart"/>
+      <w:r>
+        <w:t>penetration</w:t>
+      </w:r>
+      <w:proofErr w:type="spellEnd"/>
+      <w:r>
+        <w:t xml:space="preserve"> tester utilizza tutti i dati raccolti nelle fasi di </w:t>
+      </w:r>
+      <w:proofErr w:type="spellStart"/>
       <w:r>
         <w:t>reconnaissance</w:t>
       </w:r>
+      <w:proofErr w:type="spellEnd"/>
       <w:r>
         <w:t xml:space="preserve"> </w:t>
       </w:r>
@@ -3797,8 +4127,13 @@
         <w:t xml:space="preserve"> per identificare le potenziali vulnerabilità</w:t>
       </w:r>
       <w:r>
-        <w:t>, comprenderne l’impatto e l’effettiva sfruttabilità</w:t>
-      </w:r>
+        <w:t xml:space="preserve">, comprenderne l’impatto e l’effettiva </w:t>
+      </w:r>
+      <w:proofErr w:type="spellStart"/>
+      <w:r>
+        <w:t>sfruttabilità</w:t>
+      </w:r>
+      <w:proofErr w:type="spellEnd"/>
       <w:r>
         <w:t xml:space="preserve">. </w:t>
       </w:r>
@@ -3823,7 +4158,15 @@
         <w:t>rilevate</w:t>
       </w:r>
       <w:r>
-        <w:t xml:space="preserve"> in questa fase, i penetration tester </w:t>
+        <w:t xml:space="preserve"> in questa fase, i </w:t>
+      </w:r>
+      <w:proofErr w:type="spellStart"/>
+      <w:r>
+        <w:t>penetration</w:t>
+      </w:r>
+      <w:proofErr w:type="spellEnd"/>
+      <w:r>
+        <w:t xml:space="preserve"> tester </w:t>
       </w:r>
       <w:r>
         <w:t>attingere a diverse risorse</w:t>
@@ -3832,14 +4175,35 @@
         <w:t xml:space="preserve">. Una di queste è il </w:t>
       </w:r>
       <w:r>
-        <w:t>National Vulnerability Database</w:t>
+        <w:t xml:space="preserve">National </w:t>
+      </w:r>
+      <w:proofErr w:type="spellStart"/>
+      <w:r>
+        <w:t>Vulnerability</w:t>
+      </w:r>
+      <w:proofErr w:type="spellEnd"/>
+      <w:r>
+        <w:t xml:space="preserve"> Database</w:t>
       </w:r>
       <w:r>
         <w:t xml:space="preserve"> (NVD), un archivio di dati sulla gestione delle vulnerabilità creato e mantenuto dal governo degli Stati Uniti che analizza le vulnerabilità del software pubblicate nel database </w:t>
       </w:r>
       <w:r>
-        <w:t>Common Vulnerabilities and Exposures</w:t>
-      </w:r>
+        <w:t xml:space="preserve">Common </w:t>
+      </w:r>
+      <w:proofErr w:type="spellStart"/>
+      <w:r>
+        <w:t>Vulnerabilities</w:t>
+      </w:r>
+      <w:proofErr w:type="spellEnd"/>
+      <w:r>
+        <w:t xml:space="preserve"> and </w:t>
+      </w:r>
+      <w:proofErr w:type="spellStart"/>
+      <w:r>
+        <w:t>Exposures</w:t>
+      </w:r>
+      <w:proofErr w:type="spellEnd"/>
       <w:r>
         <w:t xml:space="preserve"> (CVE). L'NVD valuta la gravità delle vulnerabilità </w:t>
       </w:r>
@@ -3856,7 +4220,15 @@
         <w:t xml:space="preserve"> </w:t>
       </w:r>
       <w:r>
-        <w:t xml:space="preserve">Common Vulnerability Scoring System </w:t>
+        <w:t xml:space="preserve">Common </w:t>
+      </w:r>
+      <w:proofErr w:type="spellStart"/>
+      <w:r>
+        <w:t>Vulnerability</w:t>
+      </w:r>
+      <w:proofErr w:type="spellEnd"/>
+      <w:r>
+        <w:t xml:space="preserve"> Scoring System </w:t>
       </w:r>
       <w:r>
         <w:t xml:space="preserve">(CVSS), attraverso il quale è possibile </w:t>
@@ -3903,11 +4275,21 @@
         <w:t>exploitation</w:t>
       </w:r>
       <w:r>
-        <w:t xml:space="preserve">. In questa fase, il penetration tester tenta di accedere al sistema target e di sfruttare le vulnerabilità identificate. Ciò avviene utilizzando strumenti automatizzati come </w:t>
-      </w:r>
+        <w:t xml:space="preserve">. In questa fase, il </w:t>
+      </w:r>
+      <w:proofErr w:type="spellStart"/>
+      <w:r>
+        <w:t>penetration</w:t>
+      </w:r>
+      <w:proofErr w:type="spellEnd"/>
+      <w:r>
+        <w:t xml:space="preserve"> tester tenta di accedere al sistema target e di sfruttare le vulnerabilità identificate. Ciò avviene utilizzando strumenti automatizzati come </w:t>
+      </w:r>
+      <w:proofErr w:type="spellStart"/>
       <w:r>
         <w:t>Metasploit</w:t>
       </w:r>
+      <w:proofErr w:type="spellEnd"/>
       <w:r>
         <w:t xml:space="preserve"> combinati con attività manuali, </w:t>
       </w:r>
@@ -3929,7 +4311,15 @@
         <w:t xml:space="preserve">più delicata </w:t>
       </w:r>
       <w:r>
-        <w:t>nell’esecuzione di un penetration test</w:t>
+        <w:t xml:space="preserve">nell’esecuzione di un </w:t>
+      </w:r>
+      <w:proofErr w:type="spellStart"/>
+      <w:r>
+        <w:t>penetration</w:t>
+      </w:r>
+      <w:proofErr w:type="spellEnd"/>
+      <w:r>
+        <w:t xml:space="preserve"> test</w:t>
       </w:r>
       <w:r>
         <w:t xml:space="preserve">, </w:t>
@@ -4035,7 +4425,15 @@
         <w:t>exploitation</w:t>
       </w:r>
       <w:r>
-        <w:t xml:space="preserve">, i penetration tester preparano </w:t>
+        <w:t xml:space="preserve">, i </w:t>
+      </w:r>
+      <w:proofErr w:type="spellStart"/>
+      <w:r>
+        <w:t>penetration</w:t>
+      </w:r>
+      <w:proofErr w:type="spellEnd"/>
+      <w:r>
+        <w:t xml:space="preserve"> tester preparano </w:t>
       </w:r>
       <w:r>
         <w:t>la</w:t>
@@ -4059,7 +4457,15 @@
         <w:t xml:space="preserve">report </w:t>
       </w:r>
       <w:r>
-        <w:t xml:space="preserve">generato in questa fase finale di penetration testing </w:t>
+        <w:t xml:space="preserve">generato in questa fase finale di </w:t>
+      </w:r>
+      <w:proofErr w:type="spellStart"/>
+      <w:r>
+        <w:t>penetration</w:t>
+      </w:r>
+      <w:proofErr w:type="spellEnd"/>
+      <w:r>
+        <w:t xml:space="preserve"> testing </w:t>
       </w:r>
       <w:r>
         <w:t xml:space="preserve">è finalizzato a guidare l’organizzazione nel </w:t>
@@ -4091,7 +4497,15 @@
         <w:t xml:space="preserve">report </w:t>
       </w:r>
       <w:r>
-        <w:t xml:space="preserve">di penetration test </w:t>
+        <w:t xml:space="preserve">di </w:t>
+      </w:r>
+      <w:proofErr w:type="spellStart"/>
+      <w:r>
+        <w:t>penetration</w:t>
+      </w:r>
+      <w:proofErr w:type="spellEnd"/>
+      <w:r>
+        <w:t xml:space="preserve"> test </w:t>
       </w:r>
       <w:r>
         <w:t>prevede la</w:t>
@@ -4166,6 +4580,7 @@
       <w:r>
         <w:t xml:space="preserve">La descrizione di ogni problema di sicurezza individuato è composta da un </w:t>
       </w:r>
+      <w:proofErr w:type="spellStart"/>
       <w:r>
         <w:rPr>
           <w:i/>
@@ -4173,6 +4588,7 @@
         </w:rPr>
         <w:t>finding</w:t>
       </w:r>
+      <w:proofErr w:type="spellEnd"/>
       <w:r>
         <w:t xml:space="preserve">, dall’impatto della criticità rilevata, dalla semplicità di esecuzione dell’attacco da parte di un utente malintenzionato e da un suggerimento sulle contromisure da </w:t>
       </w:r>
@@ -4201,7 +4617,23 @@
           <w:i/>
           <w:iCs/>
         </w:rPr>
-        <w:t>Common Vulnerability Scoring System</w:t>
+        <w:t xml:space="preserve">Common </w:t>
+      </w:r>
+      <w:proofErr w:type="spellStart"/>
+      <w:r>
+        <w:rPr>
+          <w:i/>
+          <w:iCs/>
+        </w:rPr>
+        <w:t>Vulnerability</w:t>
+      </w:r>
+      <w:proofErr w:type="spellEnd"/>
+      <w:r>
+        <w:rPr>
+          <w:i/>
+          <w:iCs/>
+        </w:rPr>
+        <w:t xml:space="preserve"> Scoring System</w:t>
       </w:r>
       <w:r>
         <w:t xml:space="preserve"> (CVSS</w:t>
@@ -4289,6 +4721,7 @@
                 <w:b w:val="0"/>
               </w:rPr>
             </w:pPr>
+            <w:proofErr w:type="spellStart"/>
             <w:r>
               <w:rPr>
                 <w:rFonts w:ascii="Segoe UI" w:hAnsi="Segoe UI" w:cs="Segoe UI"/>
@@ -4296,6 +4729,7 @@
               </w:rPr>
               <w:t>Severità</w:t>
             </w:r>
+            <w:proofErr w:type="spellEnd"/>
           </w:p>
         </w:tc>
         <w:tc>
@@ -4346,6 +4780,7 @@
                 <w:rFonts w:ascii="Segoe UI" w:eastAsia="Times New Roman" w:hAnsi="Segoe UI" w:cs="Segoe UI"/>
               </w:rPr>
             </w:pPr>
+            <w:proofErr w:type="spellStart"/>
             <w:r>
               <w:rPr>
                 <w:rFonts w:ascii="Segoe UI" w:eastAsia="Times New Roman" w:hAnsi="Segoe UI" w:cs="Segoe UI"/>
@@ -4353,6 +4788,7 @@
               </w:rPr>
               <w:t>Nessuna</w:t>
             </w:r>
+            <w:proofErr w:type="spellEnd"/>
           </w:p>
         </w:tc>
         <w:tc>
@@ -4548,12 +4984,14 @@
                 <w:color w:val="FFFFFF" w:themeColor="background1"/>
               </w:rPr>
             </w:pPr>
+            <w:proofErr w:type="spellStart"/>
             <w:r>
               <w:rPr>
                 <w:rFonts w:ascii="Segoe UI" w:hAnsi="Segoe UI" w:cs="Segoe UI"/>
               </w:rPr>
               <w:t>Critica</w:t>
             </w:r>
+            <w:proofErr w:type="spellEnd"/>
           </w:p>
         </w:tc>
         <w:tc>
@@ -4704,6 +5142,7 @@
                 <w:szCs w:val="22"/>
               </w:rPr>
             </w:pPr>
+            <w:proofErr w:type="spellStart"/>
             <w:r>
               <w:rPr>
                 <w:rFonts w:ascii="Segoe UI" w:eastAsiaTheme="minorEastAsia" w:hAnsi="Segoe UI" w:cs="Segoe UI"/>
@@ -4713,6 +5152,7 @@
               </w:rPr>
               <w:t>Applicazione</w:t>
             </w:r>
+            <w:proofErr w:type="spellEnd"/>
           </w:p>
         </w:tc>
         <w:tc>
@@ -4833,6 +5273,7 @@
               </w:rPr>
               <w:t>{</w:t>
             </w:r>
+            <w:proofErr w:type="spellStart"/>
             <w:r>
               <w:rPr>
                 <w:rFonts w:ascii="Segoe UI" w:eastAsia="Times New Roman" w:hAnsi="Segoe UI" w:cs="Segoe UI"/>
@@ -4842,6 +5283,7 @@
               </w:rPr>
               <w:t>url</w:t>
             </w:r>
+            <w:proofErr w:type="spellEnd"/>
             <w:r>
               <w:rPr>
                 <w:rFonts w:ascii="Segoe UI" w:eastAsia="Times New Roman" w:hAnsi="Segoe UI" w:cs="Segoe UI"/>
@@ -4954,7 +5396,21 @@
         <w:rPr>
           <w:lang w:eastAsia="it-IT"/>
         </w:rPr>
-        <w:t>tilizzate per condurre l’assessment di sicurezza:</w:t>
+        <w:t>tilizzate per condurre l’</w:t>
+      </w:r>
+      <w:proofErr w:type="spellStart"/>
+      <w:r>
+        <w:rPr>
+          <w:lang w:eastAsia="it-IT"/>
+        </w:rPr>
+        <w:t>assessment</w:t>
+      </w:r>
+      <w:proofErr w:type="spellEnd"/>
+      <w:r>
+        <w:rPr>
+          <w:lang w:eastAsia="it-IT"/>
+        </w:rPr>
+        <w:t xml:space="preserve"> di sicurezza:</w:t>
       </w:r>
     </w:p>
     <w:tbl>
@@ -4993,6 +5449,7 @@
                 <w:szCs w:val="22"/>
               </w:rPr>
             </w:pPr>
+            <w:proofErr w:type="spellStart"/>
             <w:r>
               <w:rPr>
                 <w:rFonts w:ascii="Segoe UI" w:eastAsiaTheme="minorEastAsia" w:hAnsi="Segoe UI" w:cs="Segoe UI"/>
@@ -5002,6 +5459,7 @@
               </w:rPr>
               <w:t>Utenza</w:t>
             </w:r>
+            <w:proofErr w:type="spellEnd"/>
           </w:p>
         </w:tc>
         <w:tc>
@@ -5026,6 +5484,7 @@
                 <w:szCs w:val="22"/>
               </w:rPr>
             </w:pPr>
+            <w:proofErr w:type="spellStart"/>
             <w:r>
               <w:rPr>
                 <w:rFonts w:ascii="Segoe UI" w:hAnsi="Segoe UI" w:cs="Segoe UI"/>
@@ -5035,6 +5494,7 @@
               </w:rPr>
               <w:t>Descrizione</w:t>
             </w:r>
+            <w:proofErr w:type="spellEnd"/>
           </w:p>
         </w:tc>
       </w:tr>
@@ -5205,9 +5665,14 @@
         <w:t xml:space="preserve">: </w:t>
       </w:r>
       <w:r>
-        <w:t>Utenze utilizzate per l’attività di assessment</w:t>
+        <w:t xml:space="preserve">Utenze utilizzate per l’attività di </w:t>
+      </w:r>
+      <w:proofErr w:type="spellStart"/>
+      <w:r>
+        <w:t>assessment</w:t>
       </w:r>
       <w:bookmarkEnd w:id="21"/>
+      <w:proofErr w:type="spellEnd"/>
     </w:p>
     <w:p>
       <w:pPr>
@@ -5272,7 +5737,21 @@
         <w:rPr>
           <w:lang w:eastAsia="it-IT"/>
         </w:rPr>
-        <w:t>del presente Penetration Test:</w:t>
+        <w:t xml:space="preserve">del presente </w:t>
+      </w:r>
+      <w:proofErr w:type="spellStart"/>
+      <w:r>
+        <w:rPr>
+          <w:lang w:eastAsia="it-IT"/>
+        </w:rPr>
+        <w:t>Penetration</w:t>
+      </w:r>
+      <w:proofErr w:type="spellEnd"/>
+      <w:r>
+        <w:rPr>
+          <w:lang w:eastAsia="it-IT"/>
+        </w:rPr>
+        <w:t xml:space="preserve"> Test:</w:t>
       </w:r>
     </w:p>
     <w:p>
@@ -5289,13 +5768,23 @@
         </w:rPr>
         <w:t>Attacchi che mirano a provocare disservizi all’applicazione o ad utenti (</w:t>
       </w:r>
+      <w:proofErr w:type="spellStart"/>
       <w:r>
         <w:rPr>
           <w:i/>
           <w:iCs/>
           <w:lang w:val="it-IT" w:eastAsia="it-IT"/>
         </w:rPr>
-        <w:t>Denial of Service</w:t>
+        <w:t>Denial</w:t>
+      </w:r>
+      <w:proofErr w:type="spellEnd"/>
+      <w:r>
+        <w:rPr>
+          <w:i/>
+          <w:iCs/>
+          <w:lang w:val="it-IT" w:eastAsia="it-IT"/>
+        </w:rPr>
+        <w:t xml:space="preserve"> of Service</w:t>
       </w:r>
       <w:r>
         <w:rPr>
@@ -5318,12 +5807,28 @@
           <w:lang w:eastAsia="it-IT"/>
         </w:rPr>
       </w:pPr>
+      <w:proofErr w:type="spellStart"/>
       <w:r>
         <w:rPr>
           <w:lang w:eastAsia="it-IT"/>
         </w:rPr>
-        <w:t>Attività di rimedio</w:t>
-      </w:r>
+        <w:t>Attività</w:t>
+      </w:r>
+      <w:proofErr w:type="spellEnd"/>
+      <w:r>
+        <w:rPr>
+          <w:lang w:eastAsia="it-IT"/>
+        </w:rPr>
+        <w:t xml:space="preserve"> di </w:t>
+      </w:r>
+      <w:proofErr w:type="spellStart"/>
+      <w:r>
+        <w:rPr>
+          <w:lang w:eastAsia="it-IT"/>
+        </w:rPr>
+        <w:t>rimedio</w:t>
+      </w:r>
+      <w:proofErr w:type="spellEnd"/>
       <w:r>
         <w:rPr>
           <w:lang w:eastAsia="it-IT"/>
@@ -5381,40 +5886,68 @@
         <w:rPr>
           <w:i/>
         </w:rPr>
-        <w:t>{testing_company_name}</w:t>
-      </w:r>
-      <w:r>
-        <w:t xml:space="preserve"> </w:t>
-      </w:r>
-      <w:r>
-        <w:t xml:space="preserve">segnala che l’infrastruttura tecnologica </w:t>
-      </w:r>
-      <w:r>
-        <w:t xml:space="preserve">e il livello di sicurezza dell’applicativo </w:t>
-      </w:r>
-      <w:r>
-        <w:t>{#target</w:t>
-      </w:r>
-      <w:r>
-        <w:t>s</w:t>
-      </w:r>
-      <w:r>
-        <w:t>} {name} {/target</w:t>
-      </w:r>
-      <w:r>
-        <w:t>s</w:t>
-      </w:r>
-      <w:r>
-        <w:t xml:space="preserve">} </w:t>
-      </w:r>
-      <w:r>
-        <w:t xml:space="preserve">di </w:t>
-      </w:r>
+        <w:t>{</w:t>
+      </w:r>
+      <w:proofErr w:type="spellStart"/>
       <w:r>
         <w:rPr>
           <w:i/>
         </w:rPr>
-        <w:t>{client_name}</w:t>
+        <w:t>testing_company_name</w:t>
+      </w:r>
+      <w:proofErr w:type="spellEnd"/>
+      <w:r>
+        <w:rPr>
+          <w:i/>
+        </w:rPr>
+        <w:t>}</w:t>
+      </w:r>
+      <w:r>
+        <w:t xml:space="preserve"> </w:t>
+      </w:r>
+      <w:r>
+        <w:t xml:space="preserve">segnala che l’infrastruttura tecnologica </w:t>
+      </w:r>
+      <w:r>
+        <w:t xml:space="preserve">e il livello di sicurezza dell’applicativo </w:t>
+      </w:r>
+      <w:r>
+        <w:t>{#target</w:t>
+      </w:r>
+      <w:r>
+        <w:t>s</w:t>
+      </w:r>
+      <w:r>
+        <w:t>} {name} {/target</w:t>
+      </w:r>
+      <w:r>
+        <w:t>s</w:t>
+      </w:r>
+      <w:r>
+        <w:t xml:space="preserve">} </w:t>
+      </w:r>
+      <w:r>
+        <w:t xml:space="preserve">di </w:t>
+      </w:r>
+      <w:r>
+        <w:rPr>
+          <w:i/>
+        </w:rPr>
+        <w:t>{</w:t>
+      </w:r>
+      <w:proofErr w:type="spellStart"/>
+      <w:r>
+        <w:rPr>
+          <w:i/>
+        </w:rPr>
+        <w:t>client_name</w:t>
+      </w:r>
+      <w:proofErr w:type="spellEnd"/>
+      <w:r>
+        <w:rPr>
+          <w:i/>
+        </w:rPr>
+        <w:t>}</w:t>
       </w:r>
       <w:r>
         <w:rPr>
@@ -5443,7 +5976,15 @@
         <w:pStyle w:val="IntelleraBodyPT"/>
       </w:pPr>
       <w:r>
-        <w:t>{executive_summary}</w:t>
+        <w:t>{</w:t>
+      </w:r>
+      <w:proofErr w:type="spellStart"/>
+      <w:r>
+        <w:t>executive_summary</w:t>
+      </w:r>
+      <w:proofErr w:type="spellEnd"/>
+      <w:r>
+        <w:t>}</w:t>
       </w:r>
       <w:r>
         <w:t>.</w:t>
@@ -5454,7 +5995,15 @@
         <w:pStyle w:val="IntelleraBodyPT"/>
       </w:pPr>
       <w:r>
-        <w:t>In particolare, il prospetto riassuntivo del livello di severity risulta essere il seguente:</w:t>
+        <w:t xml:space="preserve">In particolare, il prospetto riassuntivo del livello di </w:t>
+      </w:r>
+      <w:proofErr w:type="spellStart"/>
+      <w:r>
+        <w:t>severity</w:t>
+      </w:r>
+      <w:proofErr w:type="spellEnd"/>
+      <w:r>
+        <w:t xml:space="preserve"> risulta essere il seguente:</w:t>
       </w:r>
     </w:p>
     <w:p>
@@ -5498,6 +6047,7 @@
                 <w:szCs w:val="22"/>
               </w:rPr>
             </w:pPr>
+            <w:proofErr w:type="spellStart"/>
             <w:r>
               <w:rPr>
                 <w:rFonts w:ascii="Segoe UI" w:eastAsiaTheme="minorEastAsia" w:hAnsi="Segoe UI" w:cs="Segoe UI"/>
@@ -5507,6 +6057,7 @@
               </w:rPr>
               <w:t>Applicazione</w:t>
             </w:r>
+            <w:proofErr w:type="spellEnd"/>
           </w:p>
         </w:tc>
         <w:tc>
@@ -5531,6 +6082,7 @@
                 <w:szCs w:val="22"/>
               </w:rPr>
             </w:pPr>
+            <w:proofErr w:type="spellStart"/>
             <w:r>
               <w:rPr>
                 <w:rFonts w:ascii="Segoe UI" w:hAnsi="Segoe UI" w:cs="Segoe UI"/>
@@ -5540,6 +6092,7 @@
               </w:rPr>
               <w:t>Severità</w:t>
             </w:r>
+            <w:proofErr w:type="spellEnd"/>
           </w:p>
         </w:tc>
       </w:tr>
@@ -5627,6 +6180,7 @@
               </w:rPr>
               <w:t>{</w:t>
             </w:r>
+            <w:proofErr w:type="spellStart"/>
             <w:r>
               <w:rPr>
                 <w:rFonts w:ascii="Segoe UI" w:eastAsia="Times New Roman" w:hAnsi="Segoe UI" w:cs="Segoe UI"/>
@@ -5636,6 +6190,7 @@
               </w:rPr>
               <w:t>severity</w:t>
             </w:r>
+            <w:proofErr w:type="spellEnd"/>
             <w:r>
               <w:rPr>
                 <w:rFonts w:ascii="Segoe UI" w:eastAsia="Times New Roman" w:hAnsi="Segoe UI" w:cs="Segoe UI"/>
@@ -5808,7 +6363,15 @@
         <w:pStyle w:val="IntelleraBodyPT"/>
       </w:pPr>
       <w:r>
-        <w:t xml:space="preserve">Questa sezione contiene una descrizione dettagliata di tutte le vulnerabilità riscontrate durante le attività di assessment, dove per vulnerabilità si intende: “Qualsiasi errore od omissione nella progettazione, nello sviluppo o nella configurazione di software e/o sistemi, tale che la loro esecuzione possa violare la </w:t>
+        <w:t xml:space="preserve">Questa sezione contiene una descrizione dettagliata di tutte le vulnerabilità riscontrate durante le attività di </w:t>
+      </w:r>
+      <w:proofErr w:type="spellStart"/>
+      <w:r>
+        <w:t>assessment</w:t>
+      </w:r>
+      <w:proofErr w:type="spellEnd"/>
+      <w:r>
+        <w:t xml:space="preserve">, dove per vulnerabilità si intende: “Qualsiasi errore od omissione nella progettazione, nello sviluppo o nella configurazione di software e/o sistemi, tale che la loro esecuzione possa violare la </w:t>
       </w:r>
       <w:r>
         <w:t>Confidenzialità</w:t>
@@ -6486,7 +7049,29 @@
                 <w:sz w:val="22"/>
                 <w:szCs w:val="22"/>
               </w:rPr>
-              <w:t xml:space="preserve">Classe vulnerabilità OWASP Top </w:t>
+              <w:t xml:space="preserve">Classe </w:t>
+            </w:r>
+            <w:proofErr w:type="spellStart"/>
+            <w:r>
+              <w:rPr>
+                <w:rFonts w:ascii="Segoe UI" w:hAnsi="Segoe UI" w:cs="Segoe UI"/>
+                <w:bCs w:val="0"/>
+                <w:color w:val="FFFFFF" w:themeColor="background1"/>
+                <w:sz w:val="22"/>
+                <w:szCs w:val="22"/>
+              </w:rPr>
+              <w:t>vulnerabilità</w:t>
+            </w:r>
+            <w:proofErr w:type="spellEnd"/>
+            <w:r>
+              <w:rPr>
+                <w:rFonts w:ascii="Segoe UI" w:hAnsi="Segoe UI" w:cs="Segoe UI"/>
+                <w:bCs w:val="0"/>
+                <w:color w:val="FFFFFF" w:themeColor="background1"/>
+                <w:sz w:val="22"/>
+                <w:szCs w:val="22"/>
+              </w:rPr>
+              <w:t xml:space="preserve"> OWASP Top </w:t>
             </w:r>
             <w:r>
               <w:rPr>
@@ -6533,6 +7118,7 @@
                 <w:szCs w:val="22"/>
               </w:rPr>
             </w:pPr>
+            <w:proofErr w:type="spellStart"/>
             <w:r>
               <w:rPr>
                 <w:rFonts w:ascii="Segoe UI" w:hAnsi="Segoe UI" w:cs="Segoe UI"/>
@@ -6543,6 +7129,7 @@
               </w:rPr>
               <w:t>Esito</w:t>
             </w:r>
+            <w:proofErr w:type="spellEnd"/>
           </w:p>
         </w:tc>
       </w:tr>
@@ -6603,6 +7190,7 @@
                 <w:lang w:val="en-US"/>
               </w:rPr>
             </w:pPr>
+            <w:proofErr w:type="spellStart"/>
             <w:r>
               <w:rPr>
                 <w:rFonts w:ascii="Segoe UI" w:hAnsi="Segoe UI" w:cs="Segoe UI"/>
@@ -6612,6 +7200,7 @@
               </w:rPr>
               <w:t>Negativo</w:t>
             </w:r>
+            <w:proofErr w:type="spellEnd"/>
           </w:p>
         </w:tc>
       </w:tr>
@@ -6667,6 +7256,7 @@
                 <w:lang w:val="en-US"/>
               </w:rPr>
             </w:pPr>
+            <w:proofErr w:type="spellStart"/>
             <w:r>
               <w:rPr>
                 <w:rFonts w:ascii="Segoe UI" w:hAnsi="Segoe UI" w:cs="Segoe UI"/>
@@ -6676,6 +7266,7 @@
               </w:rPr>
               <w:t>Negativo</w:t>
             </w:r>
+            <w:proofErr w:type="spellEnd"/>
           </w:p>
         </w:tc>
       </w:tr>
@@ -6731,6 +7322,7 @@
                 <w:lang w:val="en-US" w:eastAsia="it-IT"/>
               </w:rPr>
             </w:pPr>
+            <w:proofErr w:type="spellStart"/>
             <w:r>
               <w:rPr>
                 <w:rFonts w:ascii="Segoe UI" w:hAnsi="Segoe UI" w:cs="Segoe UI"/>
@@ -6740,6 +7332,7 @@
               </w:rPr>
               <w:t>Negativo</w:t>
             </w:r>
+            <w:proofErr w:type="spellEnd"/>
           </w:p>
         </w:tc>
       </w:tr>
@@ -6794,6 +7387,7 @@
                 <w:lang w:val="en-US" w:eastAsia="it-IT"/>
               </w:rPr>
             </w:pPr>
+            <w:proofErr w:type="spellStart"/>
             <w:r>
               <w:rPr>
                 <w:rFonts w:ascii="Segoe UI" w:hAnsi="Segoe UI" w:cs="Segoe UI"/>
@@ -6803,6 +7397,7 @@
               </w:rPr>
               <w:t>Negativo</w:t>
             </w:r>
+            <w:proofErr w:type="spellEnd"/>
           </w:p>
         </w:tc>
       </w:tr>
@@ -6858,6 +7453,7 @@
                 <w:szCs w:val="22"/>
               </w:rPr>
             </w:pPr>
+            <w:proofErr w:type="spellStart"/>
             <w:r>
               <w:rPr>
                 <w:rFonts w:ascii="Segoe UI" w:hAnsi="Segoe UI" w:cs="Segoe UI"/>
@@ -6867,6 +7463,7 @@
               </w:rPr>
               <w:t>Negativo</w:t>
             </w:r>
+            <w:proofErr w:type="spellEnd"/>
           </w:p>
         </w:tc>
       </w:tr>
@@ -6921,6 +7518,7 @@
                 <w:szCs w:val="22"/>
               </w:rPr>
             </w:pPr>
+            <w:proofErr w:type="spellStart"/>
             <w:r>
               <w:rPr>
                 <w:rFonts w:ascii="Segoe UI" w:hAnsi="Segoe UI" w:cs="Segoe UI"/>
@@ -6930,6 +7528,7 @@
               </w:rPr>
               <w:t>Negativo</w:t>
             </w:r>
+            <w:proofErr w:type="spellEnd"/>
           </w:p>
         </w:tc>
       </w:tr>
@@ -6985,6 +7584,7 @@
                 <w:szCs w:val="22"/>
               </w:rPr>
             </w:pPr>
+            <w:proofErr w:type="spellStart"/>
             <w:r>
               <w:rPr>
                 <w:rFonts w:ascii="Segoe UI" w:hAnsi="Segoe UI" w:cs="Segoe UI"/>
@@ -6994,6 +7594,7 @@
               </w:rPr>
               <w:t>Negativo</w:t>
             </w:r>
+            <w:proofErr w:type="spellEnd"/>
           </w:p>
         </w:tc>
       </w:tr>
@@ -7048,6 +7649,7 @@
                 <w:szCs w:val="22"/>
               </w:rPr>
             </w:pPr>
+            <w:proofErr w:type="spellStart"/>
             <w:r>
               <w:rPr>
                 <w:rFonts w:ascii="Segoe UI" w:hAnsi="Segoe UI" w:cs="Segoe UI"/>
@@ -7057,6 +7659,7 @@
               </w:rPr>
               <w:t>Negativo</w:t>
             </w:r>
+            <w:proofErr w:type="spellEnd"/>
           </w:p>
         </w:tc>
       </w:tr>
@@ -7112,6 +7715,7 @@
                 <w:szCs w:val="22"/>
               </w:rPr>
             </w:pPr>
+            <w:proofErr w:type="spellStart"/>
             <w:r>
               <w:rPr>
                 <w:rFonts w:ascii="Segoe UI" w:hAnsi="Segoe UI" w:cs="Segoe UI"/>
@@ -7121,6 +7725,7 @@
               </w:rPr>
               <w:t>Negativo</w:t>
             </w:r>
+            <w:proofErr w:type="spellEnd"/>
           </w:p>
         </w:tc>
       </w:tr>
@@ -7177,6 +7782,7 @@
                 <w:szCs w:val="22"/>
               </w:rPr>
             </w:pPr>
+            <w:proofErr w:type="spellStart"/>
             <w:r>
               <w:rPr>
                 <w:rFonts w:ascii="Segoe UI" w:hAnsi="Segoe UI" w:cs="Segoe UI"/>
@@ -7186,6 +7792,7 @@
               </w:rPr>
               <w:t>Negativo</w:t>
             </w:r>
+            <w:proofErr w:type="spellEnd"/>
           </w:p>
         </w:tc>
       </w:tr>
@@ -7260,16 +7867,18 @@
     </w:p>
     <w:p>
       <w:pPr>
+        <w:pStyle w:val="IntelleraBodyPT"/>
+      </w:pPr>
+      <w:r>
+        <w:t>{#vulnerabilities}</w:t>
+      </w:r>
+    </w:p>
+    <w:p>
+      <w:pPr>
         <w:pStyle w:val="Heading3"/>
       </w:pPr>
       <w:r>
-        <w:t>{#vulnerabilit</w:t>
-      </w:r>
-      <w:r>
-        <w:t>ies</w:t>
-      </w:r>
-      <w:r>
-        <w:t>}{name}</w:t>
+        <w:t>{name}</w:t>
       </w:r>
     </w:p>
     <w:tbl>
@@ -7495,7 +8104,27 @@
                 <w:sz w:val="20"/>
                 <w:szCs w:val="20"/>
               </w:rPr>
-              <w:t>{cvss_score}</w:t>
+              <w:t>{</w:t>
+            </w:r>
+            <w:proofErr w:type="spellStart"/>
+            <w:r>
+              <w:rPr>
+                <w:rFonts w:ascii="Segoe UI" w:hAnsi="Segoe UI" w:cs="Segoe UI"/>
+                <w:bCs/>
+                <w:sz w:val="20"/>
+                <w:szCs w:val="20"/>
+              </w:rPr>
+              <w:t>cvss_score</w:t>
+            </w:r>
+            <w:proofErr w:type="spellEnd"/>
+            <w:r>
+              <w:rPr>
+                <w:rFonts w:ascii="Segoe UI" w:hAnsi="Segoe UI" w:cs="Segoe UI"/>
+                <w:bCs/>
+                <w:sz w:val="20"/>
+                <w:szCs w:val="20"/>
+              </w:rPr>
+              <w:t>}</w:t>
             </w:r>
           </w:p>
         </w:tc>
@@ -7537,6 +8166,7 @@
               </w:rPr>
               <w:t xml:space="preserve"> </w:t>
             </w:r>
+            <w:proofErr w:type="spellStart"/>
             <w:r>
               <w:rPr>
                 <w:rFonts w:ascii="Segoe UI" w:hAnsi="Segoe UI" w:cs="Segoe UI"/>
@@ -7546,6 +8176,7 @@
               </w:rPr>
               <w:t>Vector</w:t>
             </w:r>
+            <w:proofErr w:type="spellEnd"/>
           </w:p>
         </w:tc>
         <w:tc>
@@ -7570,7 +8201,27 @@
                 <w:szCs w:val="20"/>
                 <w:lang w:val="en-GB"/>
               </w:rPr>
-              <w:t>{cvss_vector}</w:t>
+              <w:t>{</w:t>
+            </w:r>
+            <w:proofErr w:type="spellStart"/>
+            <w:r>
+              <w:rPr>
+                <w:rFonts w:ascii="Segoe UI" w:hAnsi="Segoe UI" w:cs="Segoe UI"/>
+                <w:sz w:val="20"/>
+                <w:szCs w:val="20"/>
+                <w:lang w:val="en-GB"/>
+              </w:rPr>
+              <w:t>cvss_vector</w:t>
+            </w:r>
+            <w:proofErr w:type="spellEnd"/>
+            <w:r>
+              <w:rPr>
+                <w:rFonts w:ascii="Segoe UI" w:hAnsi="Segoe UI" w:cs="Segoe UI"/>
+                <w:sz w:val="20"/>
+                <w:szCs w:val="20"/>
+                <w:lang w:val="en-GB"/>
+              </w:rPr>
+              <w:t>}</w:t>
             </w:r>
           </w:p>
         </w:tc>
@@ -7615,7 +8266,15 @@
               <w:pStyle w:val="IntelleraContenutoTabellaVulnPT"/>
             </w:pPr>
             <w:r>
-              <w:t>{description}</w:t>
+              <w:t>{</w:t>
+            </w:r>
+            <w:proofErr w:type="spellStart"/>
+            <w:r>
+              <w:t>description</w:t>
+            </w:r>
+            <w:proofErr w:type="spellEnd"/>
+            <w:r>
+              <w:t>}</w:t>
             </w:r>
           </w:p>
         </w:tc>
@@ -7928,7 +8587,27 @@
                 <w:szCs w:val="20"/>
                 <w:lang w:eastAsia="it-IT"/>
               </w:rPr>
-              <w:t>{http_method}</w:t>
+              <w:t>{</w:t>
+            </w:r>
+            <w:proofErr w:type="spellStart"/>
+            <w:r>
+              <w:rPr>
+                <w:rFonts w:ascii="Segoe UI" w:hAnsi="Segoe UI" w:cs="Segoe UI"/>
+                <w:sz w:val="20"/>
+                <w:szCs w:val="20"/>
+                <w:lang w:eastAsia="it-IT"/>
+              </w:rPr>
+              <w:t>http_method</w:t>
+            </w:r>
+            <w:proofErr w:type="spellEnd"/>
+            <w:r>
+              <w:rPr>
+                <w:rFonts w:ascii="Segoe UI" w:hAnsi="Segoe UI" w:cs="Segoe UI"/>
+                <w:sz w:val="20"/>
+                <w:szCs w:val="20"/>
+                <w:lang w:eastAsia="it-IT"/>
+              </w:rPr>
+              <w:t>}</w:t>
             </w:r>
           </w:p>
         </w:tc>
@@ -7953,7 +8632,27 @@
                 <w:szCs w:val="20"/>
                 <w:lang w:eastAsia="it-IT"/>
               </w:rPr>
-              <w:t>{path}</w:t>
+              <w:t>{</w:t>
+            </w:r>
+            <w:proofErr w:type="spellStart"/>
+            <w:r>
+              <w:rPr>
+                <w:rFonts w:ascii="Segoe UI" w:hAnsi="Segoe UI" w:cs="Segoe UI"/>
+                <w:sz w:val="20"/>
+                <w:szCs w:val="20"/>
+                <w:lang w:eastAsia="it-IT"/>
+              </w:rPr>
+              <w:t>path</w:t>
+            </w:r>
+            <w:proofErr w:type="spellEnd"/>
+            <w:r>
+              <w:rPr>
+                <w:rFonts w:ascii="Segoe UI" w:hAnsi="Segoe UI" w:cs="Segoe UI"/>
+                <w:sz w:val="20"/>
+                <w:szCs w:val="20"/>
+                <w:lang w:eastAsia="it-IT"/>
+              </w:rPr>
+              <w:t>}</w:t>
             </w:r>
           </w:p>
         </w:tc>
@@ -7976,7 +8675,25 @@
                 <w:sz w:val="20"/>
                 <w:szCs w:val="20"/>
               </w:rPr>
-              <w:t>{parameter}</w:t>
+              <w:t>{</w:t>
+            </w:r>
+            <w:proofErr w:type="spellStart"/>
+            <w:r>
+              <w:rPr>
+                <w:rFonts w:ascii="Segoe UI" w:hAnsi="Segoe UI" w:cs="Segoe UI"/>
+                <w:sz w:val="20"/>
+                <w:szCs w:val="20"/>
+              </w:rPr>
+              <w:t>parameter</w:t>
+            </w:r>
+            <w:proofErr w:type="spellEnd"/>
+            <w:r>
+              <w:rPr>
+                <w:rFonts w:ascii="Segoe UI" w:hAnsi="Segoe UI" w:cs="Segoe UI"/>
+                <w:sz w:val="20"/>
+                <w:szCs w:val="20"/>
+              </w:rPr>
+              <w:t>}</w:t>
             </w:r>
             <w:r>
               <w:rPr>
@@ -8011,8 +8728,6 @@
         <w:pStyle w:val="Caption"/>
         <w:rPr>
           <w:rFonts w:cs="Segoe UI"/>
-          <w:b w:val="0"/>
-          <w:bCs w:val="0"/>
           <w:sz w:val="20"/>
           <w:szCs w:val="20"/>
         </w:rPr>
@@ -8153,12 +8868,21 @@
         </w:rPr>
         <w:t>/</w:t>
       </w:r>
+      <w:proofErr w:type="spellStart"/>
       <w:r>
         <w:rPr>
           <w:b w:val="0"/>
           <w:bCs w:val="0"/>
         </w:rPr>
-        <w:t>type == "text"}</w:t>
+        <w:t>type</w:t>
+      </w:r>
+      <w:proofErr w:type="spellEnd"/>
+      <w:r>
+        <w:rPr>
+          <w:b w:val="0"/>
+          <w:bCs w:val="0"/>
+        </w:rPr>
+        <w:t xml:space="preserve"> == "text"}</w:t>
       </w:r>
     </w:p>
     <w:p>
@@ -8182,6 +8906,7 @@
     <w:p>
       <w:pPr>
         <w:pStyle w:val="BodySubtitle"/>
+        <w:jc w:val="center"/>
         <w:rPr>
           <w:b w:val="0"/>
           <w:bCs w:val="0"/>
@@ -8210,8 +8935,27 @@
           <w:bCs w:val="0"/>
           <w:lang w:val="en-US"/>
         </w:rPr>
-        <w:t xml:space="preserve">image} </w:t>
-      </w:r>
+        <w:t>image}</w:t>
+      </w:r>
+    </w:p>
+    <w:p>
+      <w:pPr>
+        <w:pStyle w:val="Caption"/>
+      </w:pPr>
+      <w:r>
+        <w:lastRenderedPageBreak/>
+        <w:t>{</w:t>
+      </w:r>
+      <w:proofErr w:type="spellStart"/>
+      <w:r>
+        <w:t>caption</w:t>
+      </w:r>
+      <w:proofErr w:type="spellEnd"/>
+      <w:r>
+        <w:t>}</w:t>
+      </w:r>
+      <w:bookmarkStart w:id="34" w:name="fig_vuln"/>
+      <w:bookmarkEnd w:id="34"/>
     </w:p>
     <w:p>
       <w:pPr>
@@ -8228,7 +8972,23 @@
           <w:bCs w:val="0"/>
           <w:lang w:val="en-US"/>
         </w:rPr>
-        <w:t xml:space="preserve">{caption} </w:t>
+        <w:t>{</w:t>
+      </w:r>
+      <w:r>
+        <w:rPr>
+          <w:b w:val="0"/>
+          <w:bCs w:val="0"/>
+          <w:lang w:val="en-US"/>
+        </w:rPr>
+        <w:t>/</w:t>
+      </w:r>
+      <w:r>
+        <w:rPr>
+          <w:b w:val="0"/>
+          <w:bCs w:val="0"/>
+          <w:lang w:val="en-US"/>
+        </w:rPr>
+        <w:t>type == "image"}</w:t>
       </w:r>
     </w:p>
     <w:p>
@@ -8246,41 +9006,6 @@
           <w:bCs w:val="0"/>
           <w:lang w:val="en-US"/>
         </w:rPr>
-        <w:lastRenderedPageBreak/>
-        <w:t>{</w:t>
-      </w:r>
-      <w:r>
-        <w:rPr>
-          <w:b w:val="0"/>
-          <w:bCs w:val="0"/>
-          <w:lang w:val="en-US"/>
-        </w:rPr>
-        <w:t>/</w:t>
-      </w:r>
-      <w:r>
-        <w:rPr>
-          <w:b w:val="0"/>
-          <w:bCs w:val="0"/>
-          <w:lang w:val="en-US"/>
-        </w:rPr>
-        <w:t>type == "image"}</w:t>
-      </w:r>
-    </w:p>
-    <w:p>
-      <w:pPr>
-        <w:pStyle w:val="BodySubtitle"/>
-        <w:rPr>
-          <w:b w:val="0"/>
-          <w:bCs w:val="0"/>
-          <w:lang w:val="en-US"/>
-        </w:rPr>
-      </w:pPr>
-      <w:r>
-        <w:rPr>
-          <w:b w:val="0"/>
-          <w:bCs w:val="0"/>
-          <w:lang w:val="en-US"/>
-        </w:rPr>
         <w:t>{/attacks}</w:t>
       </w:r>
     </w:p>
@@ -8291,11 +9016,19 @@
           <w:lang w:val="en-US"/>
         </w:rPr>
       </w:pPr>
+      <w:proofErr w:type="spellStart"/>
       <w:r>
         <w:rPr>
           <w:lang w:val="en-US"/>
         </w:rPr>
-        <w:t>Soluzione:</w:t>
+        <w:t>Soluzione</w:t>
+      </w:r>
+      <w:proofErr w:type="spellEnd"/>
+      <w:r>
+        <w:rPr>
+          <w:lang w:val="en-US"/>
+        </w:rPr>
+        <w:t>:</w:t>
       </w:r>
     </w:p>
     <w:p>
@@ -8352,16 +9085,16 @@
       <w:pPr>
         <w:pStyle w:val="Heading1"/>
       </w:pPr>
-      <w:bookmarkStart w:id="34" w:name="_Toc132300601"/>
-      <w:bookmarkStart w:id="35" w:name="_Toc132301434"/>
-      <w:bookmarkStart w:id="36" w:name="_Toc172822163"/>
+      <w:bookmarkStart w:id="35" w:name="_Toc132300601"/>
+      <w:bookmarkStart w:id="36" w:name="_Toc132301434"/>
+      <w:bookmarkStart w:id="37" w:name="_Toc172822163"/>
       <w:r>
         <w:lastRenderedPageBreak/>
         <w:t>Indice Figure</w:t>
       </w:r>
-      <w:bookmarkEnd w:id="34"/>
       <w:bookmarkEnd w:id="35"/>
       <w:bookmarkEnd w:id="36"/>
+      <w:bookmarkEnd w:id="37"/>
     </w:p>
     <w:p>
       <w:pPr>
@@ -8563,16 +9296,16 @@
       <w:pPr>
         <w:pStyle w:val="Heading1"/>
       </w:pPr>
-      <w:bookmarkStart w:id="37" w:name="_Toc132300602"/>
-      <w:bookmarkStart w:id="38" w:name="_Toc132301435"/>
-      <w:bookmarkStart w:id="39" w:name="_Toc172822164"/>
+      <w:bookmarkStart w:id="38" w:name="_Toc132300602"/>
+      <w:bookmarkStart w:id="39" w:name="_Toc132301435"/>
+      <w:bookmarkStart w:id="40" w:name="_Toc172822164"/>
       <w:r>
         <w:lastRenderedPageBreak/>
         <w:t>Indice Tabelle</w:t>
       </w:r>
-      <w:bookmarkEnd w:id="37"/>
       <w:bookmarkEnd w:id="38"/>
       <w:bookmarkEnd w:id="39"/>
+      <w:bookmarkEnd w:id="40"/>
     </w:p>
     <w:p>
       <w:pPr>
@@ -9307,7 +10040,7 @@
             </wp:anchor>
           </w:drawing>
         </mc:Choice>
-        <mc:Fallback xmlns:arto="http://schemas.microsoft.com/office/word/2006/arto" xmlns:a14="http://schemas.microsoft.com/office/drawing/2010/main" xmlns:pic="http://schemas.openxmlformats.org/drawingml/2006/picture" xmlns:a="http://schemas.openxmlformats.org/drawingml/2006/main">
+        <mc:Fallback xmlns:a="http://schemas.openxmlformats.org/drawingml/2006/main" xmlns:pic="http://schemas.openxmlformats.org/drawingml/2006/picture" xmlns:a14="http://schemas.microsoft.com/office/drawing/2010/main" xmlns:arto="http://schemas.microsoft.com/office/word/2006/arto">
           <w:pict>
             <v:oval id="Ovale 50" style="position:absolute;margin-left:228.9pt;margin-top:.25pt;width:22.7pt;height:22.7pt;z-index:-251658234;visibility:visible;mso-wrap-style:square;mso-width-percent:0;mso-height-percent:0;mso-wrap-distance-left:9pt;mso-wrap-distance-top:0;mso-wrap-distance-right:9pt;mso-wrap-distance-bottom:0;mso-position-horizontal:absolute;mso-position-horizontal-relative:margin;mso-position-vertical:absolute;mso-position-vertical-relative:text;mso-width-percent:0;mso-height-percent:0;mso-width-relative:margin;mso-height-relative:margin;v-text-anchor:middle" o:spid="_x0000_s1026" fillcolor="#b0b7b9 [3215]" strokecolor="white [3201]" strokeweight="1.5pt" w14:anchorId="56BCA546" o:gfxdata="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">
               <v:stroke joinstyle="miter"/>
@@ -9385,7 +10118,7 @@
             </wp:anchor>
           </w:drawing>
         </mc:Choice>
-        <mc:Fallback xmlns:arto="http://schemas.microsoft.com/office/word/2006/arto" xmlns:a14="http://schemas.microsoft.com/office/drawing/2010/main" xmlns:pic="http://schemas.openxmlformats.org/drawingml/2006/picture" xmlns:a="http://schemas.openxmlformats.org/drawingml/2006/main">
+        <mc:Fallback xmlns:a="http://schemas.openxmlformats.org/drawingml/2006/main" xmlns:pic="http://schemas.openxmlformats.org/drawingml/2006/picture" xmlns:a14="http://schemas.microsoft.com/office/drawing/2010/main" xmlns:arto="http://schemas.microsoft.com/office/word/2006/arto">
           <w:pict>
             <v:oval id="Ovale 49" style="position:absolute;margin-left:168.65pt;margin-top:.25pt;width:22.7pt;height:22.7pt;z-index:-251658235;visibility:visible;mso-wrap-style:square;mso-width-percent:0;mso-height-percent:0;mso-wrap-distance-left:9pt;mso-wrap-distance-top:0;mso-wrap-distance-right:9pt;mso-wrap-distance-bottom:0;mso-position-horizontal:absolute;mso-position-horizontal-relative:text;mso-position-vertical:absolute;mso-position-vertical-relative:text;mso-width-percent:0;mso-height-percent:0;mso-width-relative:margin;mso-height-relative:margin;v-text-anchor:middle" o:spid="_x0000_s1026" fillcolor="#b0b7b9 [3215]" strokecolor="white [3201]" strokeweight="1.5pt" w14:anchorId="5EA5490E" o:gfxdata="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">
               <v:stroke joinstyle="miter"/>
@@ -9450,7 +10183,7 @@
             </wp:anchor>
           </w:drawing>
         </mc:Choice>
-        <mc:Fallback xmlns:arto="http://schemas.microsoft.com/office/word/2006/arto" xmlns:a14="http://schemas.microsoft.com/office/drawing/2010/main" xmlns:pic="http://schemas.openxmlformats.org/drawingml/2006/picture" xmlns:a="http://schemas.openxmlformats.org/drawingml/2006/main">
+        <mc:Fallback xmlns:a="http://schemas.openxmlformats.org/drawingml/2006/main" xmlns:pic="http://schemas.openxmlformats.org/drawingml/2006/picture" xmlns:a14="http://schemas.microsoft.com/office/drawing/2010/main" xmlns:arto="http://schemas.microsoft.com/office/word/2006/arto">
           <w:pict>
             <v:line id="Connettore diritto 48" style="position:absolute;z-index:251658244;visibility:visible;mso-wrap-style:square;mso-wrap-distance-left:9pt;mso-wrap-distance-top:0;mso-wrap-distance-right:9pt;mso-wrap-distance-bottom:0;mso-position-horizontal:absolute;mso-position-horizontal-relative:text;mso-position-vertical:absolute;mso-position-vertical-relative:text" o:spid="_x0000_s1026" strokecolor="#00aca0 [3205]" strokeweight="1pt" from="0,-14.7pt" to="479.5pt,-14.7pt" w14:anchorId="619FA7DF" o:gfxdata="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">
               <v:stroke joinstyle="miter"/>
@@ -9527,7 +10260,7 @@
             </wp:anchor>
           </w:drawing>
         </mc:Choice>
-        <mc:Fallback xmlns:arto="http://schemas.microsoft.com/office/word/2006/arto" xmlns:a14="http://schemas.microsoft.com/office/drawing/2010/main" xmlns:pic="http://schemas.openxmlformats.org/drawingml/2006/picture" xmlns:a="http://schemas.openxmlformats.org/drawingml/2006/main">
+        <mc:Fallback xmlns:a="http://schemas.openxmlformats.org/drawingml/2006/main" xmlns:pic="http://schemas.openxmlformats.org/drawingml/2006/picture" xmlns:a14="http://schemas.microsoft.com/office/drawing/2010/main" xmlns:arto="http://schemas.microsoft.com/office/word/2006/arto">
           <w:pict>
             <v:oval id="Ovale 34" style="position:absolute;margin-left:108.55pt;margin-top:.85pt;width:22.7pt;height:22.7pt;z-index:-251658237;visibility:visible;mso-wrap-style:square;mso-width-percent:0;mso-height-percent:0;mso-wrap-distance-left:9pt;mso-wrap-distance-top:0;mso-wrap-distance-right:9pt;mso-wrap-distance-bottom:0;mso-position-horizontal:absolute;mso-position-horizontal-relative:text;mso-position-vertical:absolute;mso-position-vertical-relative:text;mso-width-percent:0;mso-height-percent:0;mso-width-relative:margin;mso-height-relative:margin;v-text-anchor:middle" o:spid="_x0000_s1026" fillcolor="#b0b7b9 [3215]" strokecolor="white [3201]" strokeweight="1.5pt" w14:anchorId="4C3E4451" o:gfxdata="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">
               <v:stroke joinstyle="miter"/>
@@ -9780,6 +10513,7 @@
       </w:rPr>
       <w:t>{</w:t>
     </w:r>
+    <w:proofErr w:type="spellStart"/>
     <w:r>
       <w:rPr>
         <w:i/>
@@ -9788,6 +10522,7 @@
       </w:rPr>
       <w:t>client_name</w:t>
     </w:r>
+    <w:proofErr w:type="spellEnd"/>
     <w:r>
       <w:rPr>
         <w:i/>
@@ -9905,7 +10640,7 @@
             </wp:anchor>
           </w:drawing>
         </mc:Choice>
-        <mc:Fallback xmlns:arto="http://schemas.microsoft.com/office/word/2006/arto" xmlns:a="http://schemas.openxmlformats.org/drawingml/2006/main">
+        <mc:Fallback xmlns:a="http://schemas.openxmlformats.org/drawingml/2006/main" xmlns:arto="http://schemas.microsoft.com/office/word/2006/arto">
           <w:pict>
             <v:line id="Connettore diritto 42" style="position:absolute;z-index:251658241;visibility:visible;mso-wrap-style:square;mso-width-percent:0;mso-height-percent:0;mso-wrap-distance-left:9pt;mso-wrap-distance-top:0;mso-wrap-distance-right:9pt;mso-wrap-distance-bottom:0;mso-position-horizontal:absolute;mso-position-horizontal-relative:text;mso-position-vertical:absolute;mso-position-vertical-relative:text;mso-width-percent:0;mso-height-percent:0;mso-width-relative:margin;mso-height-relative:margin" o:spid="_x0000_s1026" strokecolor="#00aca0 [3205]" strokeweight="1pt" from=".8pt,16.55pt" to="480.3pt,16.55pt" w14:anchorId="5DCCDD71" o:gfxdata="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">
               <v:stroke joinstyle="miter"/>
@@ -9999,7 +10734,7 @@
             </wp:anchor>
           </w:drawing>
         </mc:Choice>
-        <mc:Fallback xmlns:arto="http://schemas.microsoft.com/office/word/2006/arto" xmlns:a="http://schemas.openxmlformats.org/drawingml/2006/main">
+        <mc:Fallback xmlns:a="http://schemas.openxmlformats.org/drawingml/2006/main" xmlns:arto="http://schemas.microsoft.com/office/word/2006/arto">
           <w:pict>
             <v:line id="Connettore diritto 42" style="position:absolute;z-index:251658248;visibility:visible;mso-wrap-style:square;mso-width-percent:0;mso-height-percent:0;mso-wrap-distance-left:9pt;mso-wrap-distance-top:0;mso-wrap-distance-right:9pt;mso-wrap-distance-bottom:0;mso-position-horizontal:absolute;mso-position-horizontal-relative:text;mso-position-vertical:absolute;mso-position-vertical-relative:text;mso-width-percent:0;mso-height-percent:0;mso-width-relative:margin;mso-height-relative:margin" o:spid="_x0000_s1026" strokecolor="#00aca0 [3205]" strokeweight="1pt" from=".8pt,16.55pt" to="480.3pt,16.55pt" w14:anchorId="24B66D7B" o:gfxdata="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">
               <v:stroke joinstyle="miter"/>
@@ -13425,7 +14160,7 @@
     <w:unhideWhenUsed/>
     <w:qFormat/>
     <w:locked/>
-    <w:rsid w:val="00A4045D"/>
+    <w:rsid w:val="00C175FF"/>
     <w:pPr>
       <w:spacing w:before="120" w:after="280" w:line="240" w:lineRule="auto"/>
       <w:jc w:val="center"/>
@@ -14992,7 +15727,7 @@
     <w:link w:val="Caption"/>
     <w:qFormat/>
     <w:locked/>
-    <w:rsid w:val="00A4045D"/>
+    <w:rsid w:val="00C175FF"/>
     <w:rPr>
       <w:rFonts w:ascii="Segoe UI" w:hAnsi="Segoe UI"/>
       <w:b/>
@@ -17100,10 +17835,6 @@
 </file>
 
 <file path=customXml/item1.xml><?xml version="1.0" encoding="utf-8"?>
-<b:Sources xmlns:b="http://schemas.openxmlformats.org/officeDocument/2006/bibliography" xmlns="http://schemas.openxmlformats.org/officeDocument/2006/bibliography" SelectedStyle="\APASixthEditionOfficeOnline.xsl" StyleName="APA" Version="6"/>
-</file>
-
-<file path=customXml/item2.xml><?xml version="1.0" encoding="utf-8"?>
 <ct:contentTypeSchema xmlns:ct="http://schemas.microsoft.com/office/2006/metadata/contentType" xmlns:ma="http://schemas.microsoft.com/office/2006/metadata/properties/metaAttributes" ct:_="" ma:_="" ma:contentTypeName="Document" ma:contentTypeID="0x010100D3B57A43E8143347A77F0646A96FDE4E" ma:contentTypeVersion="15" ma:contentTypeDescription="Create a new document." ma:contentTypeScope="" ma:versionID="c9d89aec224b6538b798d42b1134640d">
   <xsd:schema xmlns:xsd="http://www.w3.org/2001/XMLSchema" xmlns:xs="http://www.w3.org/2001/XMLSchema" xmlns:p="http://schemas.microsoft.com/office/2006/metadata/properties" xmlns:ns2="d572179a-693a-4767-874c-935bdc77d781" xmlns:ns3="5b6fb746-084d-48d4-b5a4-43650cc0592f" targetNamespace="http://schemas.microsoft.com/office/2006/metadata/properties" ma:root="true" ma:fieldsID="d929cab6cdb26c2b1abab1d414661ee5" ns2:_="" ns3:_="">
     <xsd:import namespace="d572179a-693a-4767-874c-935bdc77d781"/>
@@ -17338,16 +18069,11 @@
 </ct:contentTypeSchema>
 </file>
 
-<file path=customXml/item3.xml><?xml version="1.0" encoding="utf-8"?>
-<?mso-contentType ?>
-<FormTemplates xmlns="http://schemas.microsoft.com/sharepoint/v3/contenttype/forms">
-  <Display>DocumentLibraryForm</Display>
-  <Edit>DocumentLibraryForm</Edit>
-  <New>DocumentLibraryForm</New>
-</FormTemplates>
+<file path=customXml/item2.xml><?xml version="1.0" encoding="utf-8"?>
+<b:Sources xmlns:b="http://schemas.openxmlformats.org/officeDocument/2006/bibliography" xmlns="http://schemas.openxmlformats.org/officeDocument/2006/bibliography" SelectedStyle="\APASixthEditionOfficeOnline.xsl" StyleName="APA" Version="6"/>
 </file>
 
-<file path=customXml/item4.xml><?xml version="1.0" encoding="utf-8"?>
+<file path=customXml/item3.xml><?xml version="1.0" encoding="utf-8"?>
 <p:properties xmlns:p="http://schemas.microsoft.com/office/2006/metadata/properties" xmlns:xsi="http://www.w3.org/2001/XMLSchema-instance" xmlns:pc="http://schemas.microsoft.com/office/infopath/2007/PartnerControls">
   <documentManagement>
     <lcf76f155ced4ddcb4097134ff3c332f xmlns="d572179a-693a-4767-874c-935bdc77d781">
@@ -17365,15 +18091,16 @@
 </p:properties>
 </file>
 
-<file path=customXml/itemProps1.xml><?xml version="1.0" encoding="utf-8"?>
-<ds:datastoreItem xmlns:ds="http://schemas.openxmlformats.org/officeDocument/2006/customXml" ds:itemID="{6709144A-2248-4775-882C-94A61192A9D1}">
-  <ds:schemaRefs>
-    <ds:schemaRef ds:uri="http://schemas.openxmlformats.org/officeDocument/2006/bibliography"/>
-  </ds:schemaRefs>
-</ds:datastoreItem>
+<file path=customXml/item4.xml><?xml version="1.0" encoding="utf-8"?>
+<?mso-contentType ?>
+<FormTemplates xmlns="http://schemas.microsoft.com/sharepoint/v3/contenttype/forms">
+  <Display>DocumentLibraryForm</Display>
+  <Edit>DocumentLibraryForm</Edit>
+  <New>DocumentLibraryForm</New>
+</FormTemplates>
 </file>
 
-<file path=customXml/itemProps2.xml><?xml version="1.0" encoding="utf-8"?>
+<file path=customXml/itemProps1.xml><?xml version="1.0" encoding="utf-8"?>
 <ds:datastoreItem xmlns:ds="http://schemas.openxmlformats.org/officeDocument/2006/customXml" ds:itemID="{BA79D355-A3BD-4399-BB3C-95A8AAAC829D}">
   <ds:schemaRefs>
     <ds:schemaRef ds:uri="http://schemas.microsoft.com/office/2006/metadata/contentType"/>
@@ -17392,15 +18119,15 @@
 </ds:datastoreItem>
 </file>
 
-<file path=customXml/itemProps3.xml><?xml version="1.0" encoding="utf-8"?>
-<ds:datastoreItem xmlns:ds="http://schemas.openxmlformats.org/officeDocument/2006/customXml" ds:itemID="{66CA8A1F-5062-4600-A03D-C860B5AC34A2}">
+<file path=customXml/itemProps2.xml><?xml version="1.0" encoding="utf-8"?>
+<ds:datastoreItem xmlns:ds="http://schemas.openxmlformats.org/officeDocument/2006/customXml" ds:itemID="{6709144A-2248-4775-882C-94A61192A9D1}">
   <ds:schemaRefs>
-    <ds:schemaRef ds:uri="http://schemas.microsoft.com/sharepoint/v3/contenttype/forms"/>
+    <ds:schemaRef ds:uri="http://schemas.openxmlformats.org/officeDocument/2006/bibliography"/>
   </ds:schemaRefs>
 </ds:datastoreItem>
 </file>
 
-<file path=customXml/itemProps4.xml><?xml version="1.0" encoding="utf-8"?>
+<file path=customXml/itemProps3.xml><?xml version="1.0" encoding="utf-8"?>
 <ds:datastoreItem xmlns:ds="http://schemas.openxmlformats.org/officeDocument/2006/customXml" ds:itemID="{F88E4A43-9604-4E4F-BE8A-D9A07075A8B3}">
   <ds:schemaRefs>
     <ds:schemaRef ds:uri="http://schemas.microsoft.com/office/2006/metadata/properties"/>
@@ -17409,4 +18136,12 @@
     <ds:schemaRef ds:uri="5b6fb746-084d-48d4-b5a4-43650cc0592f"/>
   </ds:schemaRefs>
 </ds:datastoreItem>
+</file>
+
+<file path=customXml/itemProps4.xml><?xml version="1.0" encoding="utf-8"?>
+<ds:datastoreItem xmlns:ds="http://schemas.openxmlformats.org/officeDocument/2006/customXml" ds:itemID="{66CA8A1F-5062-4600-A03D-C860B5AC34A2}">
+  <ds:schemaRefs>
+    <ds:schemaRef ds:uri="http://schemas.microsoft.com/sharepoint/v3/contenttype/forms"/>
+  </ds:schemaRefs>
+</ds:datastoreItem>
 </file>
</xml_diff>

<commit_message>
File upload adjusted. References generate errors. Fix them next
</commit_message>
<xml_diff>
--- a/templates/WAPT_template.docx
+++ b/templates/WAPT_template.docx
@@ -6,67 +6,6 @@
       <w:pPr>
         <w:pStyle w:val="SezioneFrontespizio"/>
       </w:pPr>
-      <w:r>
-        <w:drawing>
-          <wp:anchor distT="0" distB="0" distL="114300" distR="114300" simplePos="0" relativeHeight="251662336" behindDoc="0" locked="0" layoutInCell="1" allowOverlap="1" wp14:anchorId="260E15D2" wp14:editId="41809B26">
-            <wp:simplePos x="0" y="0"/>
-            <wp:positionH relativeFrom="column">
-              <wp:posOffset>-47716</wp:posOffset>
-            </wp:positionH>
-            <wp:positionV relativeFrom="paragraph">
-              <wp:posOffset>363</wp:posOffset>
-            </wp:positionV>
-            <wp:extent cx="1191895" cy="1191895"/>
-            <wp:effectExtent l="0" t="0" r="8255" b="8255"/>
-            <wp:wrapSquare wrapText="bothSides"/>
-            <wp:docPr id="2076651959" name="Picture 1"/>
-            <wp:cNvGraphicFramePr>
-              <a:graphicFrameLocks xmlns:a="http://schemas.openxmlformats.org/drawingml/2006/main" noChangeAspect="1"/>
-            </wp:cNvGraphicFramePr>
-            <a:graphic xmlns:a="http://schemas.openxmlformats.org/drawingml/2006/main">
-              <a:graphicData uri="http://schemas.openxmlformats.org/drawingml/2006/picture">
-                <pic:pic xmlns:pic="http://schemas.openxmlformats.org/drawingml/2006/picture">
-                  <pic:nvPicPr>
-                    <pic:cNvPr id="0" name="Picture 2"/>
-                    <pic:cNvPicPr>
-                      <a:picLocks noChangeAspect="1" noChangeArrowheads="1"/>
-                    </pic:cNvPicPr>
-                  </pic:nvPicPr>
-                  <pic:blipFill>
-                    <a:blip r:embed="rId11">
-                      <a:extLst>
-                        <a:ext uri="{28A0092B-C50C-407E-A947-70E740481C1C}">
-                          <a14:useLocalDpi xmlns:a14="http://schemas.microsoft.com/office/drawing/2010/main" val="0"/>
-                        </a:ext>
-                      </a:extLst>
-                    </a:blip>
-                    <a:srcRect/>
-                    <a:stretch>
-                      <a:fillRect/>
-                    </a:stretch>
-                  </pic:blipFill>
-                  <pic:spPr bwMode="auto">
-                    <a:xfrm>
-                      <a:off x="0" y="0"/>
-                      <a:ext cx="1191895" cy="1191895"/>
-                    </a:xfrm>
-                    <a:prstGeom prst="rect">
-                      <a:avLst/>
-                    </a:prstGeom>
-                    <a:noFill/>
-                  </pic:spPr>
-                </pic:pic>
-              </a:graphicData>
-            </a:graphic>
-            <wp14:sizeRelH relativeFrom="margin">
-              <wp14:pctWidth>0</wp14:pctWidth>
-            </wp14:sizeRelH>
-            <wp14:sizeRelV relativeFrom="margin">
-              <wp14:pctHeight>0</wp14:pctHeight>
-            </wp14:sizeRelV>
-          </wp:anchor>
-        </w:drawing>
-      </w:r>
       <w:r>
         <w:br w:type="textWrapping" w:clear="all"/>
       </w:r>
@@ -2365,21 +2304,7 @@
         <w:rPr>
           <w:i/>
         </w:rPr>
-        <w:t>{</w:t>
-      </w:r>
-      <w:proofErr w:type="spellStart"/>
-      <w:r>
-        <w:rPr>
-          <w:i/>
-        </w:rPr>
-        <w:t>testing_company_name</w:t>
-      </w:r>
-      <w:proofErr w:type="spellEnd"/>
-      <w:r>
-        <w:rPr>
-          <w:i/>
-        </w:rPr>
-        <w:t>}</w:t>
+        <w:t>{testing_company_name}</w:t>
       </w:r>
       <w:r>
         <w:rPr>
@@ -2685,21 +2610,7 @@
               <w:rPr>
                 <w:rFonts w:ascii="Segoe UI" w:hAnsi="Segoe UI" w:cs="Segoe UI"/>
               </w:rPr>
-              <w:t>{</w:t>
-            </w:r>
-            <w:proofErr w:type="spellStart"/>
-            <w:r>
-              <w:rPr>
-                <w:rFonts w:ascii="Segoe UI" w:hAnsi="Segoe UI" w:cs="Segoe UI"/>
-              </w:rPr>
-              <w:t>approver_name</w:t>
-            </w:r>
-            <w:proofErr w:type="spellEnd"/>
-            <w:r>
-              <w:rPr>
-                <w:rFonts w:ascii="Segoe UI" w:hAnsi="Segoe UI" w:cs="Segoe UI"/>
-              </w:rPr>
-              <w:t>}</w:t>
+              <w:t>{approver_name}</w:t>
             </w:r>
           </w:p>
         </w:tc>
@@ -2718,21 +2629,7 @@
               <w:rPr>
                 <w:rFonts w:ascii="Segoe UI" w:hAnsi="Segoe UI" w:cs="Segoe UI"/>
               </w:rPr>
-              <w:t>{</w:t>
-            </w:r>
-            <w:proofErr w:type="spellStart"/>
-            <w:r>
-              <w:rPr>
-                <w:rFonts w:ascii="Segoe UI" w:hAnsi="Segoe UI" w:cs="Segoe UI"/>
-              </w:rPr>
-              <w:t>approver_date</w:t>
-            </w:r>
-            <w:proofErr w:type="spellEnd"/>
-            <w:r>
-              <w:rPr>
-                <w:rFonts w:ascii="Segoe UI" w:hAnsi="Segoe UI" w:cs="Segoe UI"/>
-              </w:rPr>
-              <w:t>}</w:t>
+              <w:t>{approver_date}</w:t>
             </w:r>
           </w:p>
         </w:tc>
@@ -2895,25 +2792,7 @@
                 <w:sz w:val="20"/>
                 <w:szCs w:val="20"/>
               </w:rPr>
-              <w:t>{</w:t>
-            </w:r>
-            <w:proofErr w:type="spellStart"/>
-            <w:r>
-              <w:rPr>
-                <w:rFonts w:ascii="Segoe UI" w:hAnsi="Segoe UI" w:cs="Segoe UI"/>
-                <w:sz w:val="20"/>
-                <w:szCs w:val="20"/>
-              </w:rPr>
-              <w:t>role</w:t>
-            </w:r>
-            <w:proofErr w:type="spellEnd"/>
-            <w:r>
-              <w:rPr>
-                <w:rFonts w:ascii="Segoe UI" w:hAnsi="Segoe UI" w:cs="Segoe UI"/>
-                <w:sz w:val="20"/>
-                <w:szCs w:val="20"/>
-              </w:rPr>
-              <w:t>}</w:t>
+              <w:t>{role}</w:t>
             </w:r>
           </w:p>
         </w:tc>
@@ -3050,25 +2929,7 @@
                 <w:sz w:val="20"/>
                 <w:szCs w:val="20"/>
               </w:rPr>
-              <w:t>{</w:t>
-            </w:r>
-            <w:proofErr w:type="spellStart"/>
-            <w:r>
-              <w:rPr>
-                <w:rFonts w:ascii="Segoe UI" w:hAnsi="Segoe UI" w:cs="Segoe UI"/>
-                <w:sz w:val="20"/>
-                <w:szCs w:val="20"/>
-              </w:rPr>
-              <w:t>revisioner_name</w:t>
-            </w:r>
-            <w:proofErr w:type="spellEnd"/>
-            <w:r>
-              <w:rPr>
-                <w:rFonts w:ascii="Segoe UI" w:hAnsi="Segoe UI" w:cs="Segoe UI"/>
-                <w:sz w:val="20"/>
-                <w:szCs w:val="20"/>
-              </w:rPr>
-              <w:t>}</w:t>
+              <w:t>{revisioner_name}</w:t>
             </w:r>
           </w:p>
         </w:tc>
@@ -3117,25 +2978,7 @@
                 <w:sz w:val="20"/>
                 <w:szCs w:val="20"/>
               </w:rPr>
-              <w:t>{</w:t>
-            </w:r>
-            <w:proofErr w:type="spellStart"/>
-            <w:r>
-              <w:rPr>
-                <w:rFonts w:ascii="Segoe UI" w:hAnsi="Segoe UI" w:cs="Segoe UI"/>
-                <w:sz w:val="20"/>
-                <w:szCs w:val="20"/>
-              </w:rPr>
-              <w:t>revisioner_role</w:t>
-            </w:r>
-            <w:proofErr w:type="spellEnd"/>
-            <w:r>
-              <w:rPr>
-                <w:rFonts w:ascii="Segoe UI" w:hAnsi="Segoe UI" w:cs="Segoe UI"/>
-                <w:sz w:val="20"/>
-                <w:szCs w:val="20"/>
-              </w:rPr>
-              <w:t>}</w:t>
+              <w:t>{revisioner_role}</w:t>
             </w:r>
           </w:p>
         </w:tc>
@@ -3182,21 +3025,7 @@
               <w:rPr>
                 <w:rFonts w:ascii="Segoe UI" w:hAnsi="Segoe UI" w:cs="Segoe UI"/>
               </w:rPr>
-              <w:t>{</w:t>
-            </w:r>
-            <w:proofErr w:type="spellStart"/>
-            <w:r>
-              <w:rPr>
-                <w:rFonts w:ascii="Segoe UI" w:hAnsi="Segoe UI" w:cs="Segoe UI"/>
-              </w:rPr>
-              <w:t>revisioner_date</w:t>
-            </w:r>
-            <w:proofErr w:type="spellEnd"/>
-            <w:r>
-              <w:rPr>
-                <w:rFonts w:ascii="Segoe UI" w:hAnsi="Segoe UI" w:cs="Segoe UI"/>
-              </w:rPr>
-              <w:t>}</w:t>
+              <w:t>{revisioner_date}</w:t>
             </w:r>
           </w:p>
         </w:tc>
@@ -3258,78 +3087,37 @@
         <w:rPr>
           <w:iCs/>
         </w:rPr>
-        <w:t>{</w:t>
-      </w:r>
-      <w:proofErr w:type="spellStart"/>
+        <w:t>{testing_company_name}</w:t>
+      </w:r>
+      <w:r>
+        <w:t xml:space="preserve"> </w:t>
+      </w:r>
+      <w:r>
+        <w:t xml:space="preserve">è stata ingaggiata da </w:t>
+      </w:r>
       <w:r>
         <w:rPr>
           <w:iCs/>
         </w:rPr>
-        <w:t>testing_company_name</w:t>
-      </w:r>
-      <w:proofErr w:type="spellEnd"/>
-      <w:r>
-        <w:rPr>
-          <w:iCs/>
-        </w:rPr>
-        <w:t>}</w:t>
-      </w:r>
-      <w:r>
-        <w:t xml:space="preserve"> </w:t>
-      </w:r>
-      <w:r>
-        <w:t xml:space="preserve">è stata ingaggiata da </w:t>
-      </w:r>
-      <w:r>
-        <w:rPr>
-          <w:iCs/>
-        </w:rPr>
+        <w:t>{client_name}</w:t>
+      </w:r>
+      <w:r>
+        <w:t xml:space="preserve"> per condurre attività di Web Application Penetration Test sulle sue applicazioni in esecuzione all'interno/esterno della rete del Cliente. </w:t>
+      </w:r>
+      <w:r>
+        <w:t xml:space="preserve">Le attività tecniche </w:t>
+      </w:r>
+      <w:r>
+        <w:t xml:space="preserve">hanno avuto inizio il giorno </w:t>
+      </w:r>
+      <w:r>
         <w:t>{</w:t>
       </w:r>
-      <w:proofErr w:type="spellStart"/>
-      <w:r>
-        <w:rPr>
-          <w:iCs/>
-        </w:rPr>
-        <w:t>client_name</w:t>
-      </w:r>
-      <w:proofErr w:type="spellEnd"/>
-      <w:r>
-        <w:rPr>
-          <w:iCs/>
-        </w:rPr>
-        <w:t>}</w:t>
-      </w:r>
-      <w:r>
-        <w:t xml:space="preserve"> per condurre attività di Web Application </w:t>
-      </w:r>
-      <w:proofErr w:type="spellStart"/>
-      <w:r>
-        <w:t>Penetration</w:t>
-      </w:r>
-      <w:proofErr w:type="spellEnd"/>
-      <w:r>
-        <w:t xml:space="preserve"> Test sulle sue applicazioni in esecuzione all'interno/esterno della rete del Cliente. </w:t>
-      </w:r>
-      <w:r>
-        <w:t xml:space="preserve">Le attività tecniche </w:t>
-      </w:r>
-      <w:r>
-        <w:t xml:space="preserve">hanno avuto inizio il giorno </w:t>
-      </w:r>
-      <w:r>
-        <w:t>{</w:t>
-      </w:r>
-      <w:proofErr w:type="spellStart"/>
       <w:r>
         <w:t>testing_</w:t>
       </w:r>
       <w:r>
-        <w:t>start_date</w:t>
-      </w:r>
-      <w:proofErr w:type="spellEnd"/>
-      <w:r>
-        <w:t xml:space="preserve">} </w:t>
+        <w:t xml:space="preserve">start_date} </w:t>
       </w:r>
       <w:r>
         <w:t xml:space="preserve">e hanno coinvolto le risorse di </w:t>
@@ -3338,156 +3126,85 @@
         <w:rPr>
           <w:i/>
         </w:rPr>
+        <w:t>{testing_company_name}</w:t>
+      </w:r>
+      <w:r>
+        <w:t xml:space="preserve"> </w:t>
+      </w:r>
+      <w:r>
+        <w:t xml:space="preserve">per una durata di </w:t>
+      </w:r>
+      <w:r>
+        <w:t>{testing_duration}</w:t>
+      </w:r>
+      <w:r>
+        <w:t xml:space="preserve"> giorni lavorativi </w:t>
+      </w:r>
+      <w:r>
+        <w:t>durante il</w:t>
+      </w:r>
+      <w:r>
+        <w:t xml:space="preserve"> periodo </w:t>
+      </w:r>
+      <w:r>
+        <w:t xml:space="preserve">compreso tra il </w:t>
+      </w:r>
+      <w:r>
         <w:t>{</w:t>
       </w:r>
-      <w:proofErr w:type="spellStart"/>
+      <w:r>
+        <w:t>testing_</w:t>
+      </w:r>
+      <w:r>
+        <w:t xml:space="preserve">start_date} </w:t>
+      </w:r>
+      <w:r>
+        <w:t>e il</w:t>
+      </w:r>
+      <w:r>
+        <w:t xml:space="preserve"> </w:t>
+      </w:r>
+      <w:r>
+        <w:t>{testing_end_date}</w:t>
+      </w:r>
+      <w:r>
+        <w:t xml:space="preserve">. I test sono stati condotti </w:t>
+      </w:r>
+      <w:r>
+        <w:t>da</w:t>
+      </w:r>
+      <w:r>
+        <w:t xml:space="preserve"> remoto </w:t>
+      </w:r>
+      <w:r>
+        <w:t xml:space="preserve">presso la </w:t>
+      </w:r>
+      <w:r>
+        <w:t xml:space="preserve">sede di </w:t>
+      </w:r>
       <w:r>
         <w:rPr>
           <w:i/>
         </w:rPr>
-        <w:t>testing_company_name</w:t>
-      </w:r>
-      <w:proofErr w:type="spellEnd"/>
-      <w:r>
-        <w:rPr>
-          <w:i/>
-        </w:rPr>
-        <w:t>}</w:t>
+        <w:t>{testing_company_name}</w:t>
       </w:r>
       <w:r>
         <w:t xml:space="preserve"> </w:t>
       </w:r>
       <w:r>
-        <w:t xml:space="preserve">per una durata di </w:t>
-      </w:r>
-      <w:r>
-        <w:t>{</w:t>
-      </w:r>
-      <w:proofErr w:type="spellStart"/>
-      <w:r>
-        <w:t>testing_duration</w:t>
-      </w:r>
-      <w:proofErr w:type="spellEnd"/>
-      <w:r>
-        <w:t>}</w:t>
-      </w:r>
-      <w:r>
-        <w:t xml:space="preserve"> giorni lavorativi </w:t>
-      </w:r>
-      <w:r>
-        <w:t>durante il</w:t>
-      </w:r>
-      <w:r>
-        <w:t xml:space="preserve"> periodo </w:t>
-      </w:r>
-      <w:r>
-        <w:t xml:space="preserve">compreso tra il </w:t>
-      </w:r>
-      <w:r>
-        <w:t>{</w:t>
-      </w:r>
-      <w:proofErr w:type="spellStart"/>
-      <w:r>
-        <w:t>testing_</w:t>
-      </w:r>
-      <w:r>
-        <w:t>start_date</w:t>
-      </w:r>
-      <w:proofErr w:type="spellEnd"/>
-      <w:r>
-        <w:t xml:space="preserve">} </w:t>
-      </w:r>
-      <w:r>
-        <w:t>e il</w:t>
-      </w:r>
-      <w:r>
-        <w:t xml:space="preserve"> </w:t>
-      </w:r>
-      <w:r>
-        <w:t>{</w:t>
-      </w:r>
-      <w:proofErr w:type="spellStart"/>
-      <w:r>
-        <w:t>testing_end_date</w:t>
-      </w:r>
-      <w:proofErr w:type="spellEnd"/>
-      <w:r>
-        <w:t>}</w:t>
-      </w:r>
-      <w:r>
-        <w:t xml:space="preserve">. I test sono stati condotti </w:t>
-      </w:r>
-      <w:r>
-        <w:t>da</w:t>
-      </w:r>
-      <w:r>
-        <w:t xml:space="preserve"> remoto </w:t>
-      </w:r>
-      <w:r>
-        <w:t xml:space="preserve">presso la </w:t>
-      </w:r>
-      <w:r>
-        <w:t xml:space="preserve">sede di </w:t>
-      </w:r>
-      <w:r>
-        <w:rPr>
-          <w:i/>
-        </w:rPr>
-        <w:t>{</w:t>
-      </w:r>
-      <w:proofErr w:type="spellStart"/>
-      <w:r>
-        <w:rPr>
-          <w:i/>
-        </w:rPr>
-        <w:t>testing_company_name</w:t>
-      </w:r>
-      <w:proofErr w:type="spellEnd"/>
-      <w:r>
-        <w:rPr>
-          <w:i/>
-        </w:rPr>
-        <w:t>}</w:t>
-      </w:r>
-      <w:r>
-        <w:t xml:space="preserve"> </w:t>
-      </w:r>
-      <w:r>
         <w:t>/da remoto tramite collegamento VPN su rete Cliente</w:t>
       </w:r>
       <w:r>
         <w:t xml:space="preserve">. </w:t>
       </w:r>
       <w:r>
-        <w:t xml:space="preserve">L’attività di </w:t>
-      </w:r>
-      <w:proofErr w:type="spellStart"/>
-      <w:r>
-        <w:t>Penetration</w:t>
-      </w:r>
-      <w:proofErr w:type="spellEnd"/>
-      <w:r>
-        <w:t xml:space="preserve"> Test è stata effettuata in modalità </w:t>
+        <w:t xml:space="preserve">L’attività di Penetration Test è stata effettuata in modalità </w:t>
       </w:r>
       <w:r>
         <w:rPr>
           <w:b/>
         </w:rPr>
-        <w:t>{</w:t>
-      </w:r>
-      <w:proofErr w:type="spellStart"/>
-      <w:r>
-        <w:rPr>
-          <w:b/>
-        </w:rPr>
-        <w:t>testing_mode</w:t>
-      </w:r>
-      <w:proofErr w:type="spellEnd"/>
-      <w:r>
-        <w:rPr>
-          <w:b/>
-        </w:rPr>
-        <w:t>}</w:t>
+        <w:t>{testing_mode}</w:t>
       </w:r>
       <w:r>
         <w:rPr>
@@ -3522,21 +3239,7 @@
         <w:rPr>
           <w:i/>
         </w:rPr>
-        <w:t>{</w:t>
-      </w:r>
-      <w:proofErr w:type="spellStart"/>
-      <w:r>
-        <w:rPr>
-          <w:i/>
-        </w:rPr>
-        <w:t>testing_company_name</w:t>
-      </w:r>
-      <w:proofErr w:type="spellEnd"/>
-      <w:r>
-        <w:rPr>
-          <w:i/>
-        </w:rPr>
-        <w:t>}</w:t>
+        <w:t>{testing_company_name}</w:t>
       </w:r>
       <w:r>
         <w:t xml:space="preserve"> per il rientro allo stato di conformità con le best practices in ambito di IT Security</w:t>
@@ -3658,7 +3361,7 @@
                     </pic:cNvPicPr>
                   </pic:nvPicPr>
                   <pic:blipFill>
-                    <a:blip r:embed="rId12">
+                    <a:blip r:embed="rId11">
                       <a:extLst>
                         <a:ext uri="{28A0092B-C50C-407E-A947-70E740481C1C}">
                           <a14:useLocalDpi xmlns:a14="http://schemas.microsoft.com/office/drawing/2010/main" val="0"/>
@@ -3736,13 +3439,8 @@
         <w:pStyle w:val="BodySubtitle"/>
       </w:pPr>
       <w:r>
-        <w:t xml:space="preserve">Step 1: </w:t>
-      </w:r>
-      <w:proofErr w:type="spellStart"/>
-      <w:r>
-        <w:t>Reconnaissance</w:t>
-      </w:r>
-      <w:proofErr w:type="spellEnd"/>
+        <w:t>Step 1: Reconnaissance</w:t>
+      </w:r>
     </w:p>
     <w:p>
       <w:pPr>
@@ -3750,31 +3448,13 @@
       </w:pPr>
       <w:r>
         <w:lastRenderedPageBreak/>
-        <w:t xml:space="preserve">La prima fase del </w:t>
-      </w:r>
-      <w:proofErr w:type="spellStart"/>
-      <w:r>
-        <w:t>penetration</w:t>
-      </w:r>
-      <w:proofErr w:type="spellEnd"/>
-      <w:r>
-        <w:t xml:space="preserve"> testing è denominata </w:t>
-      </w:r>
-      <w:proofErr w:type="spellStart"/>
+        <w:t xml:space="preserve">La prima fase del penetration testing è denominata </w:t>
+      </w:r>
       <w:r>
         <w:t>reconnaissance</w:t>
       </w:r>
-      <w:proofErr w:type="spellEnd"/>
-      <w:r>
-        <w:t xml:space="preserve">. Durante questa fase, il </w:t>
-      </w:r>
-      <w:proofErr w:type="spellStart"/>
-      <w:r>
-        <w:t>penetration</w:t>
-      </w:r>
-      <w:proofErr w:type="spellEnd"/>
-      <w:r>
-        <w:t xml:space="preserve"> tester raccoglie informazioni sul sistema target, come informazioni sulla topologia della rete, sui sistemi operativi e sulle applicazioni, sugli account utente. L'obiettivo è raccogliere il maggior numero di dati possibile, in modo </w:t>
+      <w:r>
+        <w:t xml:space="preserve">. Durante questa fase, il penetration tester raccoglie informazioni sul sistema target, come informazioni sulla topologia della rete, sui sistemi operativi e sulle applicazioni, sugli account utente. L'obiettivo è raccogliere il maggior numero di dati possibile, in modo </w:t>
       </w:r>
       <w:r>
         <w:t xml:space="preserve">da </w:t>
@@ -3796,11 +3476,9 @@
       <w:r>
         <w:t xml:space="preserve">La fase di </w:t>
       </w:r>
-      <w:proofErr w:type="spellStart"/>
       <w:r>
         <w:t>reconnaissance</w:t>
       </w:r>
-      <w:proofErr w:type="spellEnd"/>
       <w:r>
         <w:t xml:space="preserve"> </w:t>
       </w:r>
@@ -3813,11 +3491,9 @@
       <w:r>
         <w:t xml:space="preserve"> metodi utilizzati per recuperare le informazioni. La </w:t>
       </w:r>
-      <w:proofErr w:type="spellStart"/>
       <w:r>
         <w:t>reconnaissance</w:t>
       </w:r>
-      <w:proofErr w:type="spellEnd"/>
       <w:r>
         <w:t xml:space="preserve"> </w:t>
       </w:r>
@@ -3830,11 +3506,9 @@
       <w:r>
         <w:t xml:space="preserve"> informazioni da risorse già pubblicamente disponibili, mentre la </w:t>
       </w:r>
-      <w:proofErr w:type="spellStart"/>
       <w:r>
         <w:t>reconnaissance</w:t>
       </w:r>
-      <w:proofErr w:type="spellEnd"/>
       <w:r>
         <w:t xml:space="preserve"> </w:t>
       </w:r>
@@ -3842,15 +3516,7 @@
         <w:t>attiva prevede l'interazione diretta con il sistema target</w:t>
       </w:r>
       <w:r>
-        <w:t xml:space="preserve"> per il </w:t>
-      </w:r>
-      <w:proofErr w:type="spellStart"/>
-      <w:r>
-        <w:t>collezionamento</w:t>
-      </w:r>
-      <w:proofErr w:type="spellEnd"/>
-      <w:r>
-        <w:t xml:space="preserve"> dei dati</w:t>
+        <w:t xml:space="preserve"> per il collezionamento dei dati</w:t>
       </w:r>
       <w:r>
         <w:t xml:space="preserve">. </w:t>
@@ -3892,11 +3558,9 @@
       <w:r>
         <w:t xml:space="preserve">fase di </w:t>
       </w:r>
-      <w:proofErr w:type="spellStart"/>
       <w:r>
         <w:t>reconnaissance</w:t>
       </w:r>
-      <w:proofErr w:type="spellEnd"/>
       <w:r>
         <w:t>, il passo successivo consiste nell'eseguire l</w:t>
       </w:r>
@@ -3910,15 +3574,7 @@
         <w:t>scanning</w:t>
       </w:r>
       <w:r>
-        <w:t xml:space="preserve">. In questa fase, il </w:t>
-      </w:r>
-      <w:proofErr w:type="spellStart"/>
-      <w:r>
-        <w:t>penetration</w:t>
-      </w:r>
-      <w:proofErr w:type="spellEnd"/>
-      <w:r>
-        <w:t xml:space="preserve"> tester utilizza vari strumenti </w:t>
+        <w:t xml:space="preserve">. In questa fase, il penetration tester utilizza vari strumenti </w:t>
       </w:r>
       <w:r>
         <w:t>al fine di</w:t>
@@ -3949,30 +3605,38 @@
       <w:r>
         <w:t xml:space="preserve">Questa fase può anche essere eseguita come attività indipendente; in questi casi, viene definita semplicemente </w:t>
       </w:r>
-      <w:proofErr w:type="spellStart"/>
-      <w:r>
-        <w:t>vulnerability</w:t>
-      </w:r>
-      <w:proofErr w:type="spellEnd"/>
+      <w:r>
+        <w:t>vulnerability assessment</w:t>
+      </w:r>
+      <w:r>
+        <w:t xml:space="preserve"> e viene eseguita</w:t>
+      </w:r>
+      <w:r>
+        <w:t xml:space="preserve"> solitamente</w:t>
+      </w:r>
+      <w:r>
+        <w:t xml:space="preserve"> con strumenti automatizzati. Tuttavia, l'esecuzione del sol</w:t>
+      </w:r>
+      <w:r>
+        <w:t xml:space="preserve">o </w:t>
+      </w:r>
+      <w:r>
+        <w:t>scanning</w:t>
+      </w:r>
       <w:r>
         <w:t xml:space="preserve"> </w:t>
       </w:r>
-      <w:proofErr w:type="spellStart"/>
-      <w:r>
-        <w:t>assessment</w:t>
-      </w:r>
-      <w:proofErr w:type="spellEnd"/>
-      <w:r>
-        <w:t xml:space="preserve"> e viene eseguita</w:t>
-      </w:r>
-      <w:r>
-        <w:t xml:space="preserve"> solitamente</w:t>
-      </w:r>
-      <w:r>
-        <w:t xml:space="preserve"> con strumenti automatizzati. Tuttavia, l'esecuzione del sol</w:t>
-      </w:r>
-      <w:r>
-        <w:t xml:space="preserve">o </w:t>
+      <w:r>
+        <w:t>in assenza di analisi dei risultati da parte di un analista</w:t>
+      </w:r>
+      <w:r>
+        <w:t xml:space="preserve"> presenta degli svantaggi. L</w:t>
+      </w:r>
+      <w:r>
+        <w:t>o</w:t>
+      </w:r>
+      <w:r>
+        <w:t xml:space="preserve"> </w:t>
       </w:r>
       <w:r>
         <w:t>scanning</w:t>
@@ -3981,10 +3645,22 @@
         <w:t xml:space="preserve"> </w:t>
       </w:r>
       <w:r>
-        <w:t>in assenza di analisi dei risultati da parte di un analista</w:t>
-      </w:r>
-      <w:r>
-        <w:t xml:space="preserve"> presenta degli svantaggi. L</w:t>
+        <w:t xml:space="preserve">può identificare potenziali difetti, ma non può determinare </w:t>
+      </w:r>
+      <w:r>
+        <w:t xml:space="preserve">l’impatto </w:t>
+      </w:r>
+      <w:r>
+        <w:t>provocato dal</w:t>
+      </w:r>
+      <w:r>
+        <w:t>lo sfruttamento</w:t>
+      </w:r>
+      <w:r>
+        <w:t xml:space="preserve"> delle falle rilevate</w:t>
+      </w:r>
+      <w:r>
+        <w:t>. Pertanto, sebbene l</w:t>
       </w:r>
       <w:r>
         <w:t>o</w:t>
@@ -3999,48 +3675,10 @@
         <w:t xml:space="preserve"> </w:t>
       </w:r>
       <w:r>
-        <w:t xml:space="preserve">può identificare potenziali difetti, ma non può determinare </w:t>
-      </w:r>
-      <w:r>
-        <w:t xml:space="preserve">l’impatto </w:t>
-      </w:r>
-      <w:r>
-        <w:t>provocato dal</w:t>
-      </w:r>
-      <w:r>
-        <w:t>lo sfruttamento</w:t>
-      </w:r>
-      <w:r>
-        <w:t xml:space="preserve"> delle falle rilevate</w:t>
-      </w:r>
-      <w:r>
-        <w:t>. Pertanto, sebbene l</w:t>
-      </w:r>
-      <w:r>
-        <w:t>o</w:t>
-      </w:r>
-      <w:r>
-        <w:t xml:space="preserve"> </w:t>
-      </w:r>
-      <w:r>
-        <w:t>scanning</w:t>
-      </w:r>
-      <w:r>
-        <w:t xml:space="preserve"> </w:t>
-      </w:r>
-      <w:r>
         <w:t xml:space="preserve">sia essenziale per la sicurezza informatica, per raggiungere il suo pieno potenziale ha bisogno dell'intervento </w:t>
       </w:r>
       <w:r>
-        <w:t xml:space="preserve">analitico di </w:t>
-      </w:r>
-      <w:proofErr w:type="spellStart"/>
-      <w:r>
-        <w:t>penetration</w:t>
-      </w:r>
-      <w:proofErr w:type="spellEnd"/>
-      <w:r>
-        <w:t xml:space="preserve"> tester</w:t>
+        <w:t>analitico di penetration tester</w:t>
       </w:r>
       <w:r>
         <w:t>.</w:t>
@@ -4051,72 +3689,31 @@
         <w:pStyle w:val="BodySubtitle"/>
       </w:pPr>
       <w:r>
-        <w:t xml:space="preserve">Step 3: </w:t>
-      </w:r>
-      <w:proofErr w:type="spellStart"/>
-      <w:r>
-        <w:t>Vulnerability</w:t>
-      </w:r>
-      <w:proofErr w:type="spellEnd"/>
-      <w:r>
-        <w:t xml:space="preserve"> </w:t>
-      </w:r>
-      <w:proofErr w:type="spellStart"/>
-      <w:r>
-        <w:t>Assessment</w:t>
-      </w:r>
-      <w:proofErr w:type="spellEnd"/>
+        <w:t>Step 3: Vulnerability Assessment</w:t>
+      </w:r>
     </w:p>
     <w:p>
       <w:pPr>
         <w:pStyle w:val="IntelleraBodyPT"/>
       </w:pPr>
       <w:r>
-        <w:t xml:space="preserve">La terza fase del </w:t>
-      </w:r>
-      <w:proofErr w:type="spellStart"/>
-      <w:r>
-        <w:t>penetration</w:t>
-      </w:r>
-      <w:proofErr w:type="spellEnd"/>
-      <w:r>
-        <w:t xml:space="preserve"> testing è </w:t>
+        <w:t xml:space="preserve">La terza fase del penetration testing è </w:t>
       </w:r>
       <w:r>
         <w:t xml:space="preserve">il </w:t>
       </w:r>
-      <w:proofErr w:type="spellStart"/>
-      <w:r>
-        <w:t>Vulnerability</w:t>
-      </w:r>
-      <w:proofErr w:type="spellEnd"/>
+      <w:r>
+        <w:t>Vulnerability Assessment</w:t>
+      </w:r>
+      <w:r>
+        <w:t xml:space="preserve">. In questa fase, il penetration tester utilizza tutti i dati raccolti nelle fasi di </w:t>
+      </w:r>
+      <w:r>
+        <w:t>reconnaissance</w:t>
+      </w:r>
       <w:r>
         <w:t xml:space="preserve"> </w:t>
       </w:r>
-      <w:proofErr w:type="spellStart"/>
-      <w:r>
-        <w:t>Assessment</w:t>
-      </w:r>
-      <w:proofErr w:type="spellEnd"/>
-      <w:r>
-        <w:t xml:space="preserve">. In questa fase, il </w:t>
-      </w:r>
-      <w:proofErr w:type="spellStart"/>
-      <w:r>
-        <w:t>penetration</w:t>
-      </w:r>
-      <w:proofErr w:type="spellEnd"/>
-      <w:r>
-        <w:t xml:space="preserve"> tester utilizza tutti i dati raccolti nelle fasi di </w:t>
-      </w:r>
-      <w:proofErr w:type="spellStart"/>
-      <w:r>
-        <w:t>reconnaissance</w:t>
-      </w:r>
-      <w:proofErr w:type="spellEnd"/>
-      <w:r>
-        <w:t xml:space="preserve"> </w:t>
-      </w:r>
       <w:r>
         <w:t xml:space="preserve">e </w:t>
       </w:r>
@@ -4127,13 +3724,8 @@
         <w:t xml:space="preserve"> per identificare le potenziali vulnerabilità</w:t>
       </w:r>
       <w:r>
-        <w:t xml:space="preserve">, comprenderne l’impatto e l’effettiva </w:t>
-      </w:r>
-      <w:proofErr w:type="spellStart"/>
-      <w:r>
-        <w:t>sfruttabilità</w:t>
-      </w:r>
-      <w:proofErr w:type="spellEnd"/>
+        <w:t>, comprenderne l’impatto e l’effettiva sfruttabilità</w:t>
+      </w:r>
       <w:r>
         <w:t xml:space="preserve">. </w:t>
       </w:r>
@@ -4158,15 +3750,7 @@
         <w:t>rilevate</w:t>
       </w:r>
       <w:r>
-        <w:t xml:space="preserve"> in questa fase, i </w:t>
-      </w:r>
-      <w:proofErr w:type="spellStart"/>
-      <w:r>
-        <w:t>penetration</w:t>
-      </w:r>
-      <w:proofErr w:type="spellEnd"/>
-      <w:r>
-        <w:t xml:space="preserve"> tester </w:t>
+        <w:t xml:space="preserve"> in questa fase, i penetration tester </w:t>
       </w:r>
       <w:r>
         <w:t>attingere a diverse risorse</w:t>
@@ -4175,35 +3759,14 @@
         <w:t xml:space="preserve">. Una di queste è il </w:t>
       </w:r>
       <w:r>
-        <w:t xml:space="preserve">National </w:t>
-      </w:r>
-      <w:proofErr w:type="spellStart"/>
-      <w:r>
-        <w:t>Vulnerability</w:t>
-      </w:r>
-      <w:proofErr w:type="spellEnd"/>
-      <w:r>
-        <w:t xml:space="preserve"> Database</w:t>
+        <w:t>National Vulnerability Database</w:t>
       </w:r>
       <w:r>
         <w:t xml:space="preserve"> (NVD), un archivio di dati sulla gestione delle vulnerabilità creato e mantenuto dal governo degli Stati Uniti che analizza le vulnerabilità del software pubblicate nel database </w:t>
       </w:r>
       <w:r>
-        <w:t xml:space="preserve">Common </w:t>
-      </w:r>
-      <w:proofErr w:type="spellStart"/>
-      <w:r>
-        <w:t>Vulnerabilities</w:t>
-      </w:r>
-      <w:proofErr w:type="spellEnd"/>
-      <w:r>
-        <w:t xml:space="preserve"> and </w:t>
-      </w:r>
-      <w:proofErr w:type="spellStart"/>
-      <w:r>
-        <w:t>Exposures</w:t>
-      </w:r>
-      <w:proofErr w:type="spellEnd"/>
+        <w:t>Common Vulnerabilities and Exposures</w:t>
+      </w:r>
       <w:r>
         <w:t xml:space="preserve"> (CVE). L'NVD valuta la gravità delle vulnerabilità </w:t>
       </w:r>
@@ -4220,15 +3783,7 @@
         <w:t xml:space="preserve"> </w:t>
       </w:r>
       <w:r>
-        <w:t xml:space="preserve">Common </w:t>
-      </w:r>
-      <w:proofErr w:type="spellStart"/>
-      <w:r>
-        <w:t>Vulnerability</w:t>
-      </w:r>
-      <w:proofErr w:type="spellEnd"/>
-      <w:r>
-        <w:t xml:space="preserve"> Scoring System </w:t>
+        <w:t xml:space="preserve">Common Vulnerability Scoring System </w:t>
       </w:r>
       <w:r>
         <w:t xml:space="preserve">(CVSS), attraverso il quale è possibile </w:t>
@@ -4275,21 +3830,11 @@
         <w:t>exploitation</w:t>
       </w:r>
       <w:r>
-        <w:t xml:space="preserve">. In questa fase, il </w:t>
-      </w:r>
-      <w:proofErr w:type="spellStart"/>
-      <w:r>
-        <w:t>penetration</w:t>
-      </w:r>
-      <w:proofErr w:type="spellEnd"/>
-      <w:r>
-        <w:t xml:space="preserve"> tester tenta di accedere al sistema target e di sfruttare le vulnerabilità identificate. Ciò avviene utilizzando strumenti automatizzati come </w:t>
-      </w:r>
-      <w:proofErr w:type="spellStart"/>
+        <w:t xml:space="preserve">. In questa fase, il penetration tester tenta di accedere al sistema target e di sfruttare le vulnerabilità identificate. Ciò avviene utilizzando strumenti automatizzati come </w:t>
+      </w:r>
       <w:r>
         <w:t>Metasploit</w:t>
       </w:r>
-      <w:proofErr w:type="spellEnd"/>
       <w:r>
         <w:t xml:space="preserve"> combinati con attività manuali, </w:t>
       </w:r>
@@ -4311,15 +3856,7 @@
         <w:t xml:space="preserve">più delicata </w:t>
       </w:r>
       <w:r>
-        <w:t xml:space="preserve">nell’esecuzione di un </w:t>
-      </w:r>
-      <w:proofErr w:type="spellStart"/>
-      <w:r>
-        <w:t>penetration</w:t>
-      </w:r>
-      <w:proofErr w:type="spellEnd"/>
-      <w:r>
-        <w:t xml:space="preserve"> test</w:t>
+        <w:t>nell’esecuzione di un penetration test</w:t>
       </w:r>
       <w:r>
         <w:t xml:space="preserve">, </w:t>
@@ -4425,15 +3962,7 @@
         <w:t>exploitation</w:t>
       </w:r>
       <w:r>
-        <w:t xml:space="preserve">, i </w:t>
-      </w:r>
-      <w:proofErr w:type="spellStart"/>
-      <w:r>
-        <w:t>penetration</w:t>
-      </w:r>
-      <w:proofErr w:type="spellEnd"/>
-      <w:r>
-        <w:t xml:space="preserve"> tester preparano </w:t>
+        <w:t xml:space="preserve">, i penetration tester preparano </w:t>
       </w:r>
       <w:r>
         <w:t>la</w:t>
@@ -4457,15 +3986,7 @@
         <w:t xml:space="preserve">report </w:t>
       </w:r>
       <w:r>
-        <w:t xml:space="preserve">generato in questa fase finale di </w:t>
-      </w:r>
-      <w:proofErr w:type="spellStart"/>
-      <w:r>
-        <w:t>penetration</w:t>
-      </w:r>
-      <w:proofErr w:type="spellEnd"/>
-      <w:r>
-        <w:t xml:space="preserve"> testing </w:t>
+        <w:t xml:space="preserve">generato in questa fase finale di penetration testing </w:t>
       </w:r>
       <w:r>
         <w:t xml:space="preserve">è finalizzato a guidare l’organizzazione nel </w:t>
@@ -4497,15 +4018,7 @@
         <w:t xml:space="preserve">report </w:t>
       </w:r>
       <w:r>
-        <w:t xml:space="preserve">di </w:t>
-      </w:r>
-      <w:proofErr w:type="spellStart"/>
-      <w:r>
-        <w:t>penetration</w:t>
-      </w:r>
-      <w:proofErr w:type="spellEnd"/>
-      <w:r>
-        <w:t xml:space="preserve"> test </w:t>
+        <w:t xml:space="preserve">di penetration test </w:t>
       </w:r>
       <w:r>
         <w:t>prevede la</w:t>
@@ -4580,7 +4093,6 @@
       <w:r>
         <w:t xml:space="preserve">La descrizione di ogni problema di sicurezza individuato è composta da un </w:t>
       </w:r>
-      <w:proofErr w:type="spellStart"/>
       <w:r>
         <w:rPr>
           <w:i/>
@@ -4588,7 +4100,6 @@
         </w:rPr>
         <w:t>finding</w:t>
       </w:r>
-      <w:proofErr w:type="spellEnd"/>
       <w:r>
         <w:t xml:space="preserve">, dall’impatto della criticità rilevata, dalla semplicità di esecuzione dell’attacco da parte di un utente malintenzionato e da un suggerimento sulle contromisure da </w:t>
       </w:r>
@@ -4617,23 +4128,7 @@
           <w:i/>
           <w:iCs/>
         </w:rPr>
-        <w:t xml:space="preserve">Common </w:t>
-      </w:r>
-      <w:proofErr w:type="spellStart"/>
-      <w:r>
-        <w:rPr>
-          <w:i/>
-          <w:iCs/>
-        </w:rPr>
-        <w:t>Vulnerability</w:t>
-      </w:r>
-      <w:proofErr w:type="spellEnd"/>
-      <w:r>
-        <w:rPr>
-          <w:i/>
-          <w:iCs/>
-        </w:rPr>
-        <w:t xml:space="preserve"> Scoring System</w:t>
+        <w:t>Common Vulnerability Scoring System</w:t>
       </w:r>
       <w:r>
         <w:t xml:space="preserve"> (CVSS</w:t>
@@ -4658,7 +4153,7 @@
       <w:r>
         <w:t xml:space="preserve">Per una dettagliata documentazione relativa il calcolo e le specifiche dello standard CVSS3 si faccia riferimento alla </w:t>
       </w:r>
-      <w:hyperlink r:id="rId13" w:history="1">
+      <w:hyperlink r:id="rId12" w:history="1">
         <w:r>
           <w:rPr>
             <w:rStyle w:val="Hyperlink"/>
@@ -4721,7 +4216,6 @@
                 <w:b w:val="0"/>
               </w:rPr>
             </w:pPr>
-            <w:proofErr w:type="spellStart"/>
             <w:r>
               <w:rPr>
                 <w:rFonts w:ascii="Segoe UI" w:hAnsi="Segoe UI" w:cs="Segoe UI"/>
@@ -4729,7 +4223,6 @@
               </w:rPr>
               <w:t>Severità</w:t>
             </w:r>
-            <w:proofErr w:type="spellEnd"/>
           </w:p>
         </w:tc>
         <w:tc>
@@ -4780,7 +4273,6 @@
                 <w:rFonts w:ascii="Segoe UI" w:eastAsia="Times New Roman" w:hAnsi="Segoe UI" w:cs="Segoe UI"/>
               </w:rPr>
             </w:pPr>
-            <w:proofErr w:type="spellStart"/>
             <w:r>
               <w:rPr>
                 <w:rFonts w:ascii="Segoe UI" w:eastAsia="Times New Roman" w:hAnsi="Segoe UI" w:cs="Segoe UI"/>
@@ -4788,7 +4280,6 @@
               </w:rPr>
               <w:t>Nessuna</w:t>
             </w:r>
-            <w:proofErr w:type="spellEnd"/>
           </w:p>
         </w:tc>
         <w:tc>
@@ -4984,14 +4475,12 @@
                 <w:color w:val="FFFFFF" w:themeColor="background1"/>
               </w:rPr>
             </w:pPr>
-            <w:proofErr w:type="spellStart"/>
             <w:r>
               <w:rPr>
                 <w:rFonts w:ascii="Segoe UI" w:hAnsi="Segoe UI" w:cs="Segoe UI"/>
               </w:rPr>
               <w:t>Critica</w:t>
             </w:r>
-            <w:proofErr w:type="spellEnd"/>
           </w:p>
         </w:tc>
         <w:tc>
@@ -5142,7 +4631,6 @@
                 <w:szCs w:val="22"/>
               </w:rPr>
             </w:pPr>
-            <w:proofErr w:type="spellStart"/>
             <w:r>
               <w:rPr>
                 <w:rFonts w:ascii="Segoe UI" w:eastAsiaTheme="minorEastAsia" w:hAnsi="Segoe UI" w:cs="Segoe UI"/>
@@ -5152,7 +4640,6 @@
               </w:rPr>
               <w:t>Applicazione</w:t>
             </w:r>
-            <w:proofErr w:type="spellEnd"/>
           </w:p>
         </w:tc>
         <w:tc>
@@ -5273,7 +4760,6 @@
               </w:rPr>
               <w:t>{</w:t>
             </w:r>
-            <w:proofErr w:type="spellStart"/>
             <w:r>
               <w:rPr>
                 <w:rFonts w:ascii="Segoe UI" w:eastAsia="Times New Roman" w:hAnsi="Segoe UI" w:cs="Segoe UI"/>
@@ -5283,7 +4769,6 @@
               </w:rPr>
               <w:t>url</w:t>
             </w:r>
-            <w:proofErr w:type="spellEnd"/>
             <w:r>
               <w:rPr>
                 <w:rFonts w:ascii="Segoe UI" w:eastAsia="Times New Roman" w:hAnsi="Segoe UI" w:cs="Segoe UI"/>
@@ -5396,21 +4881,7 @@
         <w:rPr>
           <w:lang w:eastAsia="it-IT"/>
         </w:rPr>
-        <w:t>tilizzate per condurre l’</w:t>
-      </w:r>
-      <w:proofErr w:type="spellStart"/>
-      <w:r>
-        <w:rPr>
-          <w:lang w:eastAsia="it-IT"/>
-        </w:rPr>
-        <w:t>assessment</w:t>
-      </w:r>
-      <w:proofErr w:type="spellEnd"/>
-      <w:r>
-        <w:rPr>
-          <w:lang w:eastAsia="it-IT"/>
-        </w:rPr>
-        <w:t xml:space="preserve"> di sicurezza:</w:t>
+        <w:t>tilizzate per condurre l’assessment di sicurezza:</w:t>
       </w:r>
     </w:p>
     <w:tbl>
@@ -5449,7 +4920,6 @@
                 <w:szCs w:val="22"/>
               </w:rPr>
             </w:pPr>
-            <w:proofErr w:type="spellStart"/>
             <w:r>
               <w:rPr>
                 <w:rFonts w:ascii="Segoe UI" w:eastAsiaTheme="minorEastAsia" w:hAnsi="Segoe UI" w:cs="Segoe UI"/>
@@ -5459,7 +4929,6 @@
               </w:rPr>
               <w:t>Utenza</w:t>
             </w:r>
-            <w:proofErr w:type="spellEnd"/>
           </w:p>
         </w:tc>
         <w:tc>
@@ -5484,7 +4953,6 @@
                 <w:szCs w:val="22"/>
               </w:rPr>
             </w:pPr>
-            <w:proofErr w:type="spellStart"/>
             <w:r>
               <w:rPr>
                 <w:rFonts w:ascii="Segoe UI" w:hAnsi="Segoe UI" w:cs="Segoe UI"/>
@@ -5494,7 +4962,6 @@
               </w:rPr>
               <w:t>Descrizione</w:t>
             </w:r>
-            <w:proofErr w:type="spellEnd"/>
           </w:p>
         </w:tc>
       </w:tr>
@@ -5665,14 +5132,9 @@
         <w:t xml:space="preserve">: </w:t>
       </w:r>
       <w:r>
-        <w:t xml:space="preserve">Utenze utilizzate per l’attività di </w:t>
-      </w:r>
-      <w:proofErr w:type="spellStart"/>
-      <w:r>
-        <w:t>assessment</w:t>
+        <w:t>Utenze utilizzate per l’attività di assessment</w:t>
       </w:r>
       <w:bookmarkEnd w:id="21"/>
-      <w:proofErr w:type="spellEnd"/>
     </w:p>
     <w:p>
       <w:pPr>
@@ -5737,21 +5199,7 @@
         <w:rPr>
           <w:lang w:eastAsia="it-IT"/>
         </w:rPr>
-        <w:t xml:space="preserve">del presente </w:t>
-      </w:r>
-      <w:proofErr w:type="spellStart"/>
-      <w:r>
-        <w:rPr>
-          <w:lang w:eastAsia="it-IT"/>
-        </w:rPr>
-        <w:t>Penetration</w:t>
-      </w:r>
-      <w:proofErr w:type="spellEnd"/>
-      <w:r>
-        <w:rPr>
-          <w:lang w:eastAsia="it-IT"/>
-        </w:rPr>
-        <w:t xml:space="preserve"> Test:</w:t>
+        <w:t>del presente Penetration Test:</w:t>
       </w:r>
     </w:p>
     <w:p>
@@ -5768,23 +5216,13 @@
         </w:rPr>
         <w:t>Attacchi che mirano a provocare disservizi all’applicazione o ad utenti (</w:t>
       </w:r>
-      <w:proofErr w:type="spellStart"/>
       <w:r>
         <w:rPr>
           <w:i/>
           <w:iCs/>
           <w:lang w:val="it-IT" w:eastAsia="it-IT"/>
         </w:rPr>
-        <w:t>Denial</w:t>
-      </w:r>
-      <w:proofErr w:type="spellEnd"/>
-      <w:r>
-        <w:rPr>
-          <w:i/>
-          <w:iCs/>
-          <w:lang w:val="it-IT" w:eastAsia="it-IT"/>
-        </w:rPr>
-        <w:t xml:space="preserve"> of Service</w:t>
+        <w:t>Denial of Service</w:t>
       </w:r>
       <w:r>
         <w:rPr>
@@ -5807,28 +5245,12 @@
           <w:lang w:eastAsia="it-IT"/>
         </w:rPr>
       </w:pPr>
-      <w:proofErr w:type="spellStart"/>
       <w:r>
         <w:rPr>
           <w:lang w:eastAsia="it-IT"/>
         </w:rPr>
-        <w:t>Attività</w:t>
-      </w:r>
-      <w:proofErr w:type="spellEnd"/>
-      <w:r>
-        <w:rPr>
-          <w:lang w:eastAsia="it-IT"/>
-        </w:rPr>
-        <w:t xml:space="preserve"> di </w:t>
-      </w:r>
-      <w:proofErr w:type="spellStart"/>
-      <w:r>
-        <w:rPr>
-          <w:lang w:eastAsia="it-IT"/>
-        </w:rPr>
-        <w:t>rimedio</w:t>
-      </w:r>
-      <w:proofErr w:type="spellEnd"/>
+        <w:t>Attività di rimedio</w:t>
+      </w:r>
       <w:r>
         <w:rPr>
           <w:lang w:eastAsia="it-IT"/>
@@ -5886,68 +5308,40 @@
         <w:rPr>
           <w:i/>
         </w:rPr>
-        <w:t>{</w:t>
-      </w:r>
-      <w:proofErr w:type="spellStart"/>
+        <w:t>{testing_company_name}</w:t>
+      </w:r>
+      <w:r>
+        <w:t xml:space="preserve"> </w:t>
+      </w:r>
+      <w:r>
+        <w:t xml:space="preserve">segnala che l’infrastruttura tecnologica </w:t>
+      </w:r>
+      <w:r>
+        <w:t xml:space="preserve">e il livello di sicurezza dell’applicativo </w:t>
+      </w:r>
+      <w:r>
+        <w:t>{#target</w:t>
+      </w:r>
+      <w:r>
+        <w:t>s</w:t>
+      </w:r>
+      <w:r>
+        <w:t>} {name} {/target</w:t>
+      </w:r>
+      <w:r>
+        <w:t>s</w:t>
+      </w:r>
+      <w:r>
+        <w:t xml:space="preserve">} </w:t>
+      </w:r>
+      <w:r>
+        <w:t xml:space="preserve">di </w:t>
+      </w:r>
       <w:r>
         <w:rPr>
           <w:i/>
         </w:rPr>
-        <w:t>testing_company_name</w:t>
-      </w:r>
-      <w:proofErr w:type="spellEnd"/>
-      <w:r>
-        <w:rPr>
-          <w:i/>
-        </w:rPr>
-        <w:t>}</w:t>
-      </w:r>
-      <w:r>
-        <w:t xml:space="preserve"> </w:t>
-      </w:r>
-      <w:r>
-        <w:t xml:space="preserve">segnala che l’infrastruttura tecnologica </w:t>
-      </w:r>
-      <w:r>
-        <w:t xml:space="preserve">e il livello di sicurezza dell’applicativo </w:t>
-      </w:r>
-      <w:r>
-        <w:t>{#target</w:t>
-      </w:r>
-      <w:r>
-        <w:t>s</w:t>
-      </w:r>
-      <w:r>
-        <w:t>} {name} {/target</w:t>
-      </w:r>
-      <w:r>
-        <w:t>s</w:t>
-      </w:r>
-      <w:r>
-        <w:t xml:space="preserve">} </w:t>
-      </w:r>
-      <w:r>
-        <w:t xml:space="preserve">di </w:t>
-      </w:r>
-      <w:r>
-        <w:rPr>
-          <w:i/>
-        </w:rPr>
-        <w:t>{</w:t>
-      </w:r>
-      <w:proofErr w:type="spellStart"/>
-      <w:r>
-        <w:rPr>
-          <w:i/>
-        </w:rPr>
-        <w:t>client_name</w:t>
-      </w:r>
-      <w:proofErr w:type="spellEnd"/>
-      <w:r>
-        <w:rPr>
-          <w:i/>
-        </w:rPr>
-        <w:t>}</w:t>
+        <w:t>{client_name}</w:t>
       </w:r>
       <w:r>
         <w:rPr>
@@ -5976,15 +5370,7 @@
         <w:pStyle w:val="IntelleraBodyPT"/>
       </w:pPr>
       <w:r>
-        <w:t>{</w:t>
-      </w:r>
-      <w:proofErr w:type="spellStart"/>
-      <w:r>
-        <w:t>executive_summary</w:t>
-      </w:r>
-      <w:proofErr w:type="spellEnd"/>
-      <w:r>
-        <w:t>}</w:t>
+        <w:t>{executive_summary}</w:t>
       </w:r>
       <w:r>
         <w:t>.</w:t>
@@ -5995,15 +5381,7 @@
         <w:pStyle w:val="IntelleraBodyPT"/>
       </w:pPr>
       <w:r>
-        <w:t xml:space="preserve">In particolare, il prospetto riassuntivo del livello di </w:t>
-      </w:r>
-      <w:proofErr w:type="spellStart"/>
-      <w:r>
-        <w:t>severity</w:t>
-      </w:r>
-      <w:proofErr w:type="spellEnd"/>
-      <w:r>
-        <w:t xml:space="preserve"> risulta essere il seguente:</w:t>
+        <w:t>In particolare, il prospetto riassuntivo del livello di severity risulta essere il seguente:</w:t>
       </w:r>
     </w:p>
     <w:p>
@@ -6047,7 +5425,6 @@
                 <w:szCs w:val="22"/>
               </w:rPr>
             </w:pPr>
-            <w:proofErr w:type="spellStart"/>
             <w:r>
               <w:rPr>
                 <w:rFonts w:ascii="Segoe UI" w:eastAsiaTheme="minorEastAsia" w:hAnsi="Segoe UI" w:cs="Segoe UI"/>
@@ -6057,7 +5434,6 @@
               </w:rPr>
               <w:t>Applicazione</w:t>
             </w:r>
-            <w:proofErr w:type="spellEnd"/>
           </w:p>
         </w:tc>
         <w:tc>
@@ -6082,7 +5458,6 @@
                 <w:szCs w:val="22"/>
               </w:rPr>
             </w:pPr>
-            <w:proofErr w:type="spellStart"/>
             <w:r>
               <w:rPr>
                 <w:rFonts w:ascii="Segoe UI" w:hAnsi="Segoe UI" w:cs="Segoe UI"/>
@@ -6092,7 +5467,6 @@
               </w:rPr>
               <w:t>Severità</w:t>
             </w:r>
-            <w:proofErr w:type="spellEnd"/>
           </w:p>
         </w:tc>
       </w:tr>
@@ -6180,7 +5554,6 @@
               </w:rPr>
               <w:t>{</w:t>
             </w:r>
-            <w:proofErr w:type="spellStart"/>
             <w:r>
               <w:rPr>
                 <w:rFonts w:ascii="Segoe UI" w:eastAsia="Times New Roman" w:hAnsi="Segoe UI" w:cs="Segoe UI"/>
@@ -6190,7 +5563,6 @@
               </w:rPr>
               <w:t>severity</w:t>
             </w:r>
-            <w:proofErr w:type="spellEnd"/>
             <w:r>
               <w:rPr>
                 <w:rFonts w:ascii="Segoe UI" w:eastAsia="Times New Roman" w:hAnsi="Segoe UI" w:cs="Segoe UI"/>
@@ -6298,7 +5670,7 @@
             </wp:cNvGraphicFramePr>
             <a:graphic xmlns:a="http://schemas.openxmlformats.org/drawingml/2006/main">
               <a:graphicData uri="http://schemas.openxmlformats.org/drawingml/2006/chart">
-                <c:chart xmlns:c="http://schemas.openxmlformats.org/drawingml/2006/chart" xmlns:r="http://schemas.openxmlformats.org/officeDocument/2006/relationships" r:id="rId14"/>
+                <c:chart xmlns:c="http://schemas.openxmlformats.org/drawingml/2006/chart" xmlns:r="http://schemas.openxmlformats.org/officeDocument/2006/relationships" r:id="rId13"/>
               </a:graphicData>
             </a:graphic>
           </wp:inline>
@@ -6363,15 +5735,7 @@
         <w:pStyle w:val="IntelleraBodyPT"/>
       </w:pPr>
       <w:r>
-        <w:t xml:space="preserve">Questa sezione contiene una descrizione dettagliata di tutte le vulnerabilità riscontrate durante le attività di </w:t>
-      </w:r>
-      <w:proofErr w:type="spellStart"/>
-      <w:r>
-        <w:t>assessment</w:t>
-      </w:r>
-      <w:proofErr w:type="spellEnd"/>
-      <w:r>
-        <w:t xml:space="preserve">, dove per vulnerabilità si intende: “Qualsiasi errore od omissione nella progettazione, nello sviluppo o nella configurazione di software e/o sistemi, tale che la loro esecuzione possa violare la </w:t>
+        <w:t xml:space="preserve">Questa sezione contiene una descrizione dettagliata di tutte le vulnerabilità riscontrate durante le attività di assessment, dove per vulnerabilità si intende: “Qualsiasi errore od omissione nella progettazione, nello sviluppo o nella configurazione di software e/o sistemi, tale che la loro esecuzione possa violare la </w:t>
       </w:r>
       <w:r>
         <w:t>Confidenzialità</w:t>
@@ -7049,29 +6413,7 @@
                 <w:sz w:val="22"/>
                 <w:szCs w:val="22"/>
               </w:rPr>
-              <w:t xml:space="preserve">Classe </w:t>
-            </w:r>
-            <w:proofErr w:type="spellStart"/>
-            <w:r>
-              <w:rPr>
-                <w:rFonts w:ascii="Segoe UI" w:hAnsi="Segoe UI" w:cs="Segoe UI"/>
-                <w:bCs w:val="0"/>
-                <w:color w:val="FFFFFF" w:themeColor="background1"/>
-                <w:sz w:val="22"/>
-                <w:szCs w:val="22"/>
-              </w:rPr>
-              <w:t>vulnerabilità</w:t>
-            </w:r>
-            <w:proofErr w:type="spellEnd"/>
-            <w:r>
-              <w:rPr>
-                <w:rFonts w:ascii="Segoe UI" w:hAnsi="Segoe UI" w:cs="Segoe UI"/>
-                <w:bCs w:val="0"/>
-                <w:color w:val="FFFFFF" w:themeColor="background1"/>
-                <w:sz w:val="22"/>
-                <w:szCs w:val="22"/>
-              </w:rPr>
-              <w:t xml:space="preserve"> OWASP Top </w:t>
+              <w:t xml:space="preserve">Classe vulnerabilità OWASP Top </w:t>
             </w:r>
             <w:r>
               <w:rPr>
@@ -7118,7 +6460,6 @@
                 <w:szCs w:val="22"/>
               </w:rPr>
             </w:pPr>
-            <w:proofErr w:type="spellStart"/>
             <w:r>
               <w:rPr>
                 <w:rFonts w:ascii="Segoe UI" w:hAnsi="Segoe UI" w:cs="Segoe UI"/>
@@ -7129,7 +6470,6 @@
               </w:rPr>
               <w:t>Esito</w:t>
             </w:r>
-            <w:proofErr w:type="spellEnd"/>
           </w:p>
         </w:tc>
       </w:tr>
@@ -7190,7 +6530,6 @@
                 <w:lang w:val="en-US"/>
               </w:rPr>
             </w:pPr>
-            <w:proofErr w:type="spellStart"/>
             <w:r>
               <w:rPr>
                 <w:rFonts w:ascii="Segoe UI" w:hAnsi="Segoe UI" w:cs="Segoe UI"/>
@@ -7200,7 +6539,6 @@
               </w:rPr>
               <w:t>Negativo</w:t>
             </w:r>
-            <w:proofErr w:type="spellEnd"/>
           </w:p>
         </w:tc>
       </w:tr>
@@ -7256,7 +6594,6 @@
                 <w:lang w:val="en-US"/>
               </w:rPr>
             </w:pPr>
-            <w:proofErr w:type="spellStart"/>
             <w:r>
               <w:rPr>
                 <w:rFonts w:ascii="Segoe UI" w:hAnsi="Segoe UI" w:cs="Segoe UI"/>
@@ -7266,7 +6603,6 @@
               </w:rPr>
               <w:t>Negativo</w:t>
             </w:r>
-            <w:proofErr w:type="spellEnd"/>
           </w:p>
         </w:tc>
       </w:tr>
@@ -7322,7 +6658,6 @@
                 <w:lang w:val="en-US" w:eastAsia="it-IT"/>
               </w:rPr>
             </w:pPr>
-            <w:proofErr w:type="spellStart"/>
             <w:r>
               <w:rPr>
                 <w:rFonts w:ascii="Segoe UI" w:hAnsi="Segoe UI" w:cs="Segoe UI"/>
@@ -7332,7 +6667,6 @@
               </w:rPr>
               <w:t>Negativo</w:t>
             </w:r>
-            <w:proofErr w:type="spellEnd"/>
           </w:p>
         </w:tc>
       </w:tr>
@@ -7387,7 +6721,6 @@
                 <w:lang w:val="en-US" w:eastAsia="it-IT"/>
               </w:rPr>
             </w:pPr>
-            <w:proofErr w:type="spellStart"/>
             <w:r>
               <w:rPr>
                 <w:rFonts w:ascii="Segoe UI" w:hAnsi="Segoe UI" w:cs="Segoe UI"/>
@@ -7397,7 +6730,6 @@
               </w:rPr>
               <w:t>Negativo</w:t>
             </w:r>
-            <w:proofErr w:type="spellEnd"/>
           </w:p>
         </w:tc>
       </w:tr>
@@ -7453,7 +6785,6 @@
                 <w:szCs w:val="22"/>
               </w:rPr>
             </w:pPr>
-            <w:proofErr w:type="spellStart"/>
             <w:r>
               <w:rPr>
                 <w:rFonts w:ascii="Segoe UI" w:hAnsi="Segoe UI" w:cs="Segoe UI"/>
@@ -7463,7 +6794,6 @@
               </w:rPr>
               <w:t>Negativo</w:t>
             </w:r>
-            <w:proofErr w:type="spellEnd"/>
           </w:p>
         </w:tc>
       </w:tr>
@@ -7518,7 +6848,6 @@
                 <w:szCs w:val="22"/>
               </w:rPr>
             </w:pPr>
-            <w:proofErr w:type="spellStart"/>
             <w:r>
               <w:rPr>
                 <w:rFonts w:ascii="Segoe UI" w:hAnsi="Segoe UI" w:cs="Segoe UI"/>
@@ -7528,7 +6857,6 @@
               </w:rPr>
               <w:t>Negativo</w:t>
             </w:r>
-            <w:proofErr w:type="spellEnd"/>
           </w:p>
         </w:tc>
       </w:tr>
@@ -7584,7 +6912,6 @@
                 <w:szCs w:val="22"/>
               </w:rPr>
             </w:pPr>
-            <w:proofErr w:type="spellStart"/>
             <w:r>
               <w:rPr>
                 <w:rFonts w:ascii="Segoe UI" w:hAnsi="Segoe UI" w:cs="Segoe UI"/>
@@ -7594,7 +6921,6 @@
               </w:rPr>
               <w:t>Negativo</w:t>
             </w:r>
-            <w:proofErr w:type="spellEnd"/>
           </w:p>
         </w:tc>
       </w:tr>
@@ -7649,7 +6975,6 @@
                 <w:szCs w:val="22"/>
               </w:rPr>
             </w:pPr>
-            <w:proofErr w:type="spellStart"/>
             <w:r>
               <w:rPr>
                 <w:rFonts w:ascii="Segoe UI" w:hAnsi="Segoe UI" w:cs="Segoe UI"/>
@@ -7659,7 +6984,6 @@
               </w:rPr>
               <w:t>Negativo</w:t>
             </w:r>
-            <w:proofErr w:type="spellEnd"/>
           </w:p>
         </w:tc>
       </w:tr>
@@ -7715,7 +7039,6 @@
                 <w:szCs w:val="22"/>
               </w:rPr>
             </w:pPr>
-            <w:proofErr w:type="spellStart"/>
             <w:r>
               <w:rPr>
                 <w:rFonts w:ascii="Segoe UI" w:hAnsi="Segoe UI" w:cs="Segoe UI"/>
@@ -7725,7 +7048,6 @@
               </w:rPr>
               <w:t>Negativo</w:t>
             </w:r>
-            <w:proofErr w:type="spellEnd"/>
           </w:p>
         </w:tc>
       </w:tr>
@@ -7782,7 +7104,6 @@
                 <w:szCs w:val="22"/>
               </w:rPr>
             </w:pPr>
-            <w:proofErr w:type="spellStart"/>
             <w:r>
               <w:rPr>
                 <w:rFonts w:ascii="Segoe UI" w:hAnsi="Segoe UI" w:cs="Segoe UI"/>
@@ -7792,7 +7113,6 @@
               </w:rPr>
               <w:t>Negativo</w:t>
             </w:r>
-            <w:proofErr w:type="spellEnd"/>
           </w:p>
         </w:tc>
       </w:tr>
@@ -8104,27 +7424,7 @@
                 <w:sz w:val="20"/>
                 <w:szCs w:val="20"/>
               </w:rPr>
-              <w:t>{</w:t>
-            </w:r>
-            <w:proofErr w:type="spellStart"/>
-            <w:r>
-              <w:rPr>
-                <w:rFonts w:ascii="Segoe UI" w:hAnsi="Segoe UI" w:cs="Segoe UI"/>
-                <w:bCs/>
-                <w:sz w:val="20"/>
-                <w:szCs w:val="20"/>
-              </w:rPr>
-              <w:t>cvss_score</w:t>
-            </w:r>
-            <w:proofErr w:type="spellEnd"/>
-            <w:r>
-              <w:rPr>
-                <w:rFonts w:ascii="Segoe UI" w:hAnsi="Segoe UI" w:cs="Segoe UI"/>
-                <w:bCs/>
-                <w:sz w:val="20"/>
-                <w:szCs w:val="20"/>
-              </w:rPr>
-              <w:t>}</w:t>
+              <w:t>{cvss_score}</w:t>
             </w:r>
           </w:p>
         </w:tc>
@@ -8166,7 +7466,6 @@
               </w:rPr>
               <w:t xml:space="preserve"> </w:t>
             </w:r>
-            <w:proofErr w:type="spellStart"/>
             <w:r>
               <w:rPr>
                 <w:rFonts w:ascii="Segoe UI" w:hAnsi="Segoe UI" w:cs="Segoe UI"/>
@@ -8176,7 +7475,6 @@
               </w:rPr>
               <w:t>Vector</w:t>
             </w:r>
-            <w:proofErr w:type="spellEnd"/>
           </w:p>
         </w:tc>
         <w:tc>
@@ -8201,27 +7499,7 @@
                 <w:szCs w:val="20"/>
                 <w:lang w:val="en-GB"/>
               </w:rPr>
-              <w:t>{</w:t>
-            </w:r>
-            <w:proofErr w:type="spellStart"/>
-            <w:r>
-              <w:rPr>
-                <w:rFonts w:ascii="Segoe UI" w:hAnsi="Segoe UI" w:cs="Segoe UI"/>
-                <w:sz w:val="20"/>
-                <w:szCs w:val="20"/>
-                <w:lang w:val="en-GB"/>
-              </w:rPr>
-              <w:t>cvss_vector</w:t>
-            </w:r>
-            <w:proofErr w:type="spellEnd"/>
-            <w:r>
-              <w:rPr>
-                <w:rFonts w:ascii="Segoe UI" w:hAnsi="Segoe UI" w:cs="Segoe UI"/>
-                <w:sz w:val="20"/>
-                <w:szCs w:val="20"/>
-                <w:lang w:val="en-GB"/>
-              </w:rPr>
-              <w:t>}</w:t>
+              <w:t>{cvss_vector}</w:t>
             </w:r>
           </w:p>
         </w:tc>
@@ -8266,15 +7544,7 @@
               <w:pStyle w:val="IntelleraContenutoTabellaVulnPT"/>
             </w:pPr>
             <w:r>
-              <w:t>{</w:t>
-            </w:r>
-            <w:proofErr w:type="spellStart"/>
-            <w:r>
-              <w:t>description</w:t>
-            </w:r>
-            <w:proofErr w:type="spellEnd"/>
-            <w:r>
-              <w:t>}</w:t>
+              <w:t>{description}</w:t>
             </w:r>
           </w:p>
         </w:tc>
@@ -8587,27 +7857,7 @@
                 <w:szCs w:val="20"/>
                 <w:lang w:eastAsia="it-IT"/>
               </w:rPr>
-              <w:t>{</w:t>
-            </w:r>
-            <w:proofErr w:type="spellStart"/>
-            <w:r>
-              <w:rPr>
-                <w:rFonts w:ascii="Segoe UI" w:hAnsi="Segoe UI" w:cs="Segoe UI"/>
-                <w:sz w:val="20"/>
-                <w:szCs w:val="20"/>
-                <w:lang w:eastAsia="it-IT"/>
-              </w:rPr>
-              <w:t>http_method</w:t>
-            </w:r>
-            <w:proofErr w:type="spellEnd"/>
-            <w:r>
-              <w:rPr>
-                <w:rFonts w:ascii="Segoe UI" w:hAnsi="Segoe UI" w:cs="Segoe UI"/>
-                <w:sz w:val="20"/>
-                <w:szCs w:val="20"/>
-                <w:lang w:eastAsia="it-IT"/>
-              </w:rPr>
-              <w:t>}</w:t>
+              <w:t>{http_method}</w:t>
             </w:r>
           </w:p>
         </w:tc>
@@ -8632,27 +7882,7 @@
                 <w:szCs w:val="20"/>
                 <w:lang w:eastAsia="it-IT"/>
               </w:rPr>
-              <w:t>{</w:t>
-            </w:r>
-            <w:proofErr w:type="spellStart"/>
-            <w:r>
-              <w:rPr>
-                <w:rFonts w:ascii="Segoe UI" w:hAnsi="Segoe UI" w:cs="Segoe UI"/>
-                <w:sz w:val="20"/>
-                <w:szCs w:val="20"/>
-                <w:lang w:eastAsia="it-IT"/>
-              </w:rPr>
-              <w:t>path</w:t>
-            </w:r>
-            <w:proofErr w:type="spellEnd"/>
-            <w:r>
-              <w:rPr>
-                <w:rFonts w:ascii="Segoe UI" w:hAnsi="Segoe UI" w:cs="Segoe UI"/>
-                <w:sz w:val="20"/>
-                <w:szCs w:val="20"/>
-                <w:lang w:eastAsia="it-IT"/>
-              </w:rPr>
-              <w:t>}</w:t>
+              <w:t>{path}</w:t>
             </w:r>
           </w:p>
         </w:tc>
@@ -8675,25 +7905,7 @@
                 <w:sz w:val="20"/>
                 <w:szCs w:val="20"/>
               </w:rPr>
-              <w:t>{</w:t>
-            </w:r>
-            <w:proofErr w:type="spellStart"/>
-            <w:r>
-              <w:rPr>
-                <w:rFonts w:ascii="Segoe UI" w:hAnsi="Segoe UI" w:cs="Segoe UI"/>
-                <w:sz w:val="20"/>
-                <w:szCs w:val="20"/>
-              </w:rPr>
-              <w:t>parameter</w:t>
-            </w:r>
-            <w:proofErr w:type="spellEnd"/>
-            <w:r>
-              <w:rPr>
-                <w:rFonts w:ascii="Segoe UI" w:hAnsi="Segoe UI" w:cs="Segoe UI"/>
-                <w:sz w:val="20"/>
-                <w:szCs w:val="20"/>
-              </w:rPr>
-              <w:t>}</w:t>
+              <w:t>{parameter}</w:t>
             </w:r>
             <w:r>
               <w:rPr>
@@ -8852,37 +8064,144 @@
         <w:rPr>
           <w:b w:val="0"/>
           <w:bCs w:val="0"/>
+          <w:lang w:val="en-US"/>
         </w:rPr>
       </w:pPr>
       <w:r>
         <w:rPr>
           <w:b w:val="0"/>
           <w:bCs w:val="0"/>
+          <w:lang w:val="en-US"/>
         </w:rPr>
-        <w:t>{</w:t>
+        <w:t xml:space="preserve">REF </w:t>
       </w:r>
       <w:r>
         <w:rPr>
           <w:b w:val="0"/>
           <w:bCs w:val="0"/>
+          <w:lang w:val="en-US"/>
         </w:rPr>
-        <w:t>/</w:t>
-      </w:r>
-      <w:proofErr w:type="spellStart"/>
+        <w:t xml:space="preserve">2: </w:t>
+      </w:r>
       <w:r>
         <w:rPr>
           <w:b w:val="0"/>
           <w:bCs w:val="0"/>
+          <w:lang w:val="en-US"/>
         </w:rPr>
-        <w:t>type</w:t>
-      </w:r>
-      <w:proofErr w:type="spellEnd"/>
+        <w:t>{</w:t>
+      </w:r>
       <w:r>
         <w:rPr>
           <w:b w:val="0"/>
           <w:bCs w:val="0"/>
+          <w:lang w:val="en-US"/>
         </w:rPr>
-        <w:t xml:space="preserve"> == "text"}</w:t>
+        <w:t xml:space="preserve">$ref 2} </w:t>
+      </w:r>
+      <w:r>
+        <w:rPr>
+          <w:b w:val="0"/>
+          <w:bCs w:val="0"/>
+          <w:lang w:val="en-US"/>
+        </w:rPr>
+        <w:t>This must be working</w:t>
+      </w:r>
+    </w:p>
+    <w:p>
+      <w:pPr>
+        <w:tabs>
+          <w:tab w:val="left" w:pos="5940"/>
+        </w:tabs>
+        <w:rPr>
+          <w:rFonts w:ascii="Segoe UI" w:hAnsi="Segoe UI" w:cs="Segoe UI"/>
+          <w:sz w:val="20"/>
+          <w:szCs w:val="20"/>
+          <w:lang w:val="en-US"/>
+        </w:rPr>
+      </w:pPr>
+      <w:r>
+        <w:rPr>
+          <w:rFonts w:ascii="Segoe UI" w:hAnsi="Segoe UI" w:cs="Segoe UI"/>
+          <w:sz w:val="20"/>
+          <w:szCs w:val="20"/>
+          <w:lang w:val="en-US"/>
+        </w:rPr>
+        <w:t xml:space="preserve">REF 2: {$ref </w:t>
+      </w:r>
+      <w:r>
+        <w:rPr>
+          <w:rFonts w:ascii="Segoe UI" w:hAnsi="Segoe UI" w:cs="Segoe UI"/>
+          <w:sz w:val="20"/>
+          <w:szCs w:val="20"/>
+          <w:lang w:val="en-US"/>
+        </w:rPr>
+        <w:t>4</w:t>
+      </w:r>
+      <w:r>
+        <w:rPr>
+          <w:rFonts w:ascii="Segoe UI" w:hAnsi="Segoe UI" w:cs="Segoe UI"/>
+          <w:sz w:val="20"/>
+          <w:szCs w:val="20"/>
+          <w:lang w:val="en-US"/>
+        </w:rPr>
+        <w:t xml:space="preserve">} This </w:t>
+      </w:r>
+      <w:r>
+        <w:rPr>
+          <w:rFonts w:ascii="Segoe UI" w:hAnsi="Segoe UI" w:cs="Segoe UI"/>
+          <w:sz w:val="20"/>
+          <w:szCs w:val="20"/>
+          <w:lang w:val="en-US"/>
+        </w:rPr>
+        <w:t>works instead to reference the image of the vulnerability</w:t>
+      </w:r>
+    </w:p>
+    <w:p>
+      <w:pPr>
+        <w:pStyle w:val="BodySubtitle"/>
+        <w:rPr>
+          <w:b w:val="0"/>
+          <w:bCs w:val="0"/>
+          <w:lang w:val="en-US"/>
+        </w:rPr>
+      </w:pPr>
+    </w:p>
+    <w:p>
+      <w:pPr>
+        <w:pStyle w:val="BodySubtitle"/>
+        <w:rPr>
+          <w:b w:val="0"/>
+          <w:bCs w:val="0"/>
+          <w:lang w:val="en-US"/>
+        </w:rPr>
+      </w:pPr>
+      <w:r>
+        <w:rPr>
+          <w:b w:val="0"/>
+          <w:bCs w:val="0"/>
+          <w:lang w:val="en-US"/>
+        </w:rPr>
+        <w:lastRenderedPageBreak/>
+        <w:t>…</w:t>
+      </w:r>
+    </w:p>
+    <w:p>
+      <w:pPr>
+        <w:pStyle w:val="BodySubtitle"/>
+        <w:rPr>
+          <w:b w:val="0"/>
+          <w:bCs w:val="0"/>
+          <w:lang w:val="en-US"/>
+        </w:rPr>
+      </w:pPr>
+      <w:r>
+        <w:rPr>
+          <w:b w:val="0"/>
+          <w:bCs w:val="0"/>
+          <w:lang w:val="en-US"/>
+        </w:rPr>
+        <w:t>{/type == "text"}</w:t>
       </w:r>
     </w:p>
     <w:p>
@@ -8941,18 +8260,39 @@
     <w:p>
       <w:pPr>
         <w:pStyle w:val="Caption"/>
-      </w:pPr>
-      <w:r>
-        <w:lastRenderedPageBreak/>
+        <w:rPr>
+          <w:lang w:val="en-US"/>
+        </w:rPr>
+      </w:pPr>
+      <w:r>
+        <w:rPr>
+          <w:lang w:val="en-US"/>
+        </w:rPr>
         <w:t>{</w:t>
       </w:r>
-      <w:proofErr w:type="spellStart"/>
-      <w:r>
-        <w:t>caption</w:t>
-      </w:r>
-      <w:proofErr w:type="spellEnd"/>
-      <w:r>
-        <w:t>}</w:t>
+      <w:r>
+        <w:rPr>
+          <w:lang w:val="en-US"/>
+        </w:rPr>
+        <w:t>&amp;</w:t>
+      </w:r>
+      <w:r>
+        <w:rPr>
+          <w:lang w:val="en-US"/>
+        </w:rPr>
+        <w:t>figure</w:t>
+      </w:r>
+      <w:r>
+        <w:rPr>
+          <w:lang w:val="en-US"/>
+        </w:rPr>
+        <w:t xml:space="preserve"> </w:t>
+      </w:r>
+      <w:r>
+        <w:rPr>
+          <w:lang w:val="en-US"/>
+        </w:rPr>
+        <w:t>caption}</w:t>
       </w:r>
       <w:bookmarkStart w:id="34" w:name="fig_vuln"/>
       <w:bookmarkEnd w:id="34"/>
@@ -9016,19 +8356,11 @@
           <w:lang w:val="en-US"/>
         </w:rPr>
       </w:pPr>
-      <w:proofErr w:type="spellStart"/>
       <w:r>
         <w:rPr>
           <w:lang w:val="en-US"/>
         </w:rPr>
-        <w:t>Soluzione</w:t>
-      </w:r>
-      <w:proofErr w:type="spellEnd"/>
-      <w:r>
-        <w:rPr>
-          <w:lang w:val="en-US"/>
-        </w:rPr>
-        <w:t>:</w:t>
+        <w:t>Soluzione:</w:t>
       </w:r>
     </w:p>
     <w:p>
@@ -9052,6 +8384,9 @@
           <w:lang w:val="en-US"/>
         </w:rPr>
       </w:pPr>
+      <w:r>
+        <w:t>{@pageBreak}</w:t>
+      </w:r>
     </w:p>
     <w:p>
       <w:pPr>
@@ -9864,9 +9199,9 @@
       </w:pPr>
     </w:p>
     <w:sectPr>
-      <w:headerReference w:type="default" r:id="rId15"/>
-      <w:footerReference w:type="default" r:id="rId16"/>
-      <w:headerReference w:type="first" r:id="rId17"/>
+      <w:headerReference w:type="default" r:id="rId14"/>
+      <w:footerReference w:type="default" r:id="rId15"/>
+      <w:headerReference w:type="first" r:id="rId16"/>
       <w:pgSz w:w="11906" w:h="16838" w:code="9"/>
       <w:pgMar w:top="1134" w:right="1134" w:bottom="2694" w:left="1134" w:header="454" w:footer="142" w:gutter="0"/>
       <w:cols w:space="708"/>
@@ -10040,7 +9375,7 @@
             </wp:anchor>
           </w:drawing>
         </mc:Choice>
-        <mc:Fallback xmlns:a="http://schemas.openxmlformats.org/drawingml/2006/main" xmlns:pic="http://schemas.openxmlformats.org/drawingml/2006/picture" xmlns:a14="http://schemas.microsoft.com/office/drawing/2010/main" xmlns:arto="http://schemas.microsoft.com/office/word/2006/arto">
+        <mc:Fallback xmlns:arto="http://schemas.microsoft.com/office/word/2006/arto" xmlns:a14="http://schemas.microsoft.com/office/drawing/2010/main" xmlns:pic="http://schemas.openxmlformats.org/drawingml/2006/picture" xmlns:a="http://schemas.openxmlformats.org/drawingml/2006/main">
           <w:pict>
             <v:oval id="Ovale 50" style="position:absolute;margin-left:228.9pt;margin-top:.25pt;width:22.7pt;height:22.7pt;z-index:-251658234;visibility:visible;mso-wrap-style:square;mso-width-percent:0;mso-height-percent:0;mso-wrap-distance-left:9pt;mso-wrap-distance-top:0;mso-wrap-distance-right:9pt;mso-wrap-distance-bottom:0;mso-position-horizontal:absolute;mso-position-horizontal-relative:margin;mso-position-vertical:absolute;mso-position-vertical-relative:text;mso-width-percent:0;mso-height-percent:0;mso-width-relative:margin;mso-height-relative:margin;v-text-anchor:middle" o:spid="_x0000_s1026" fillcolor="#b0b7b9 [3215]" strokecolor="white [3201]" strokeweight="1.5pt" w14:anchorId="56BCA546" o:gfxdata="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">
               <v:stroke joinstyle="miter"/>
@@ -10118,7 +9453,7 @@
             </wp:anchor>
           </w:drawing>
         </mc:Choice>
-        <mc:Fallback xmlns:a="http://schemas.openxmlformats.org/drawingml/2006/main" xmlns:pic="http://schemas.openxmlformats.org/drawingml/2006/picture" xmlns:a14="http://schemas.microsoft.com/office/drawing/2010/main" xmlns:arto="http://schemas.microsoft.com/office/word/2006/arto">
+        <mc:Fallback xmlns:arto="http://schemas.microsoft.com/office/word/2006/arto" xmlns:a14="http://schemas.microsoft.com/office/drawing/2010/main" xmlns:pic="http://schemas.openxmlformats.org/drawingml/2006/picture" xmlns:a="http://schemas.openxmlformats.org/drawingml/2006/main">
           <w:pict>
             <v:oval id="Ovale 49" style="position:absolute;margin-left:168.65pt;margin-top:.25pt;width:22.7pt;height:22.7pt;z-index:-251658235;visibility:visible;mso-wrap-style:square;mso-width-percent:0;mso-height-percent:0;mso-wrap-distance-left:9pt;mso-wrap-distance-top:0;mso-wrap-distance-right:9pt;mso-wrap-distance-bottom:0;mso-position-horizontal:absolute;mso-position-horizontal-relative:text;mso-position-vertical:absolute;mso-position-vertical-relative:text;mso-width-percent:0;mso-height-percent:0;mso-width-relative:margin;mso-height-relative:margin;v-text-anchor:middle" o:spid="_x0000_s1026" fillcolor="#b0b7b9 [3215]" strokecolor="white [3201]" strokeweight="1.5pt" w14:anchorId="5EA5490E" o:gfxdata="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">
               <v:stroke joinstyle="miter"/>
@@ -10183,7 +9518,7 @@
             </wp:anchor>
           </w:drawing>
         </mc:Choice>
-        <mc:Fallback xmlns:a="http://schemas.openxmlformats.org/drawingml/2006/main" xmlns:pic="http://schemas.openxmlformats.org/drawingml/2006/picture" xmlns:a14="http://schemas.microsoft.com/office/drawing/2010/main" xmlns:arto="http://schemas.microsoft.com/office/word/2006/arto">
+        <mc:Fallback xmlns:arto="http://schemas.microsoft.com/office/word/2006/arto" xmlns:a14="http://schemas.microsoft.com/office/drawing/2010/main" xmlns:pic="http://schemas.openxmlformats.org/drawingml/2006/picture" xmlns:a="http://schemas.openxmlformats.org/drawingml/2006/main">
           <w:pict>
             <v:line id="Connettore diritto 48" style="position:absolute;z-index:251658244;visibility:visible;mso-wrap-style:square;mso-wrap-distance-left:9pt;mso-wrap-distance-top:0;mso-wrap-distance-right:9pt;mso-wrap-distance-bottom:0;mso-position-horizontal:absolute;mso-position-horizontal-relative:text;mso-position-vertical:absolute;mso-position-vertical-relative:text" o:spid="_x0000_s1026" strokecolor="#00aca0 [3205]" strokeweight="1pt" from="0,-14.7pt" to="479.5pt,-14.7pt" w14:anchorId="619FA7DF" o:gfxdata="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">
               <v:stroke joinstyle="miter"/>
@@ -10260,7 +9595,7 @@
             </wp:anchor>
           </w:drawing>
         </mc:Choice>
-        <mc:Fallback xmlns:a="http://schemas.openxmlformats.org/drawingml/2006/main" xmlns:pic="http://schemas.openxmlformats.org/drawingml/2006/picture" xmlns:a14="http://schemas.microsoft.com/office/drawing/2010/main" xmlns:arto="http://schemas.microsoft.com/office/word/2006/arto">
+        <mc:Fallback xmlns:arto="http://schemas.microsoft.com/office/word/2006/arto" xmlns:a14="http://schemas.microsoft.com/office/drawing/2010/main" xmlns:pic="http://schemas.openxmlformats.org/drawingml/2006/picture" xmlns:a="http://schemas.openxmlformats.org/drawingml/2006/main">
           <w:pict>
             <v:oval id="Ovale 34" style="position:absolute;margin-left:108.55pt;margin-top:.85pt;width:22.7pt;height:22.7pt;z-index:-251658237;visibility:visible;mso-wrap-style:square;mso-width-percent:0;mso-height-percent:0;mso-wrap-distance-left:9pt;mso-wrap-distance-top:0;mso-wrap-distance-right:9pt;mso-wrap-distance-bottom:0;mso-position-horizontal:absolute;mso-position-horizontal-relative:text;mso-position-vertical:absolute;mso-position-vertical-relative:text;mso-width-percent:0;mso-height-percent:0;mso-width-relative:margin;mso-height-relative:margin;v-text-anchor:middle" o:spid="_x0000_s1026" fillcolor="#b0b7b9 [3215]" strokecolor="white [3201]" strokeweight="1.5pt" w14:anchorId="4C3E4451" o:gfxdata="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">
               <v:stroke joinstyle="miter"/>
@@ -10513,7 +9848,6 @@
       </w:rPr>
       <w:t>{</w:t>
     </w:r>
-    <w:proofErr w:type="spellStart"/>
     <w:r>
       <w:rPr>
         <w:i/>
@@ -10522,7 +9856,6 @@
       </w:rPr>
       <w:t>client_name</w:t>
     </w:r>
-    <w:proofErr w:type="spellEnd"/>
     <w:r>
       <w:rPr>
         <w:i/>
@@ -10640,7 +9973,7 @@
             </wp:anchor>
           </w:drawing>
         </mc:Choice>
-        <mc:Fallback xmlns:a="http://schemas.openxmlformats.org/drawingml/2006/main" xmlns:arto="http://schemas.microsoft.com/office/word/2006/arto">
+        <mc:Fallback xmlns:arto="http://schemas.microsoft.com/office/word/2006/arto" xmlns:a="http://schemas.openxmlformats.org/drawingml/2006/main">
           <w:pict>
             <v:line id="Connettore diritto 42" style="position:absolute;z-index:251658241;visibility:visible;mso-wrap-style:square;mso-width-percent:0;mso-height-percent:0;mso-wrap-distance-left:9pt;mso-wrap-distance-top:0;mso-wrap-distance-right:9pt;mso-wrap-distance-bottom:0;mso-position-horizontal:absolute;mso-position-horizontal-relative:text;mso-position-vertical:absolute;mso-position-vertical-relative:text;mso-width-percent:0;mso-height-percent:0;mso-width-relative:margin;mso-height-relative:margin" o:spid="_x0000_s1026" strokecolor="#00aca0 [3205]" strokeweight="1pt" from=".8pt,16.55pt" to="480.3pt,16.55pt" w14:anchorId="5DCCDD71" o:gfxdata="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">
               <v:stroke joinstyle="miter"/>
@@ -10734,7 +10067,7 @@
             </wp:anchor>
           </w:drawing>
         </mc:Choice>
-        <mc:Fallback xmlns:a="http://schemas.openxmlformats.org/drawingml/2006/main" xmlns:arto="http://schemas.microsoft.com/office/word/2006/arto">
+        <mc:Fallback xmlns:arto="http://schemas.microsoft.com/office/word/2006/arto" xmlns:a="http://schemas.openxmlformats.org/drawingml/2006/main">
           <w:pict>
             <v:line id="Connettore diritto 42" style="position:absolute;z-index:251658248;visibility:visible;mso-wrap-style:square;mso-width-percent:0;mso-height-percent:0;mso-wrap-distance-left:9pt;mso-wrap-distance-top:0;mso-wrap-distance-right:9pt;mso-wrap-distance-bottom:0;mso-position-horizontal:absolute;mso-position-horizontal-relative:text;mso-position-vertical:absolute;mso-position-vertical-relative:text;mso-width-percent:0;mso-height-percent:0;mso-width-relative:margin;mso-height-relative:margin" o:spid="_x0000_s1026" strokecolor="#00aca0 [3205]" strokeweight="1pt" from=".8pt,16.55pt" to="480.3pt,16.55pt" w14:anchorId="24B66D7B" o:gfxdata="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">
               <v:stroke joinstyle="miter"/>
@@ -17835,6 +17168,10 @@
 </file>
 
 <file path=customXml/item1.xml><?xml version="1.0" encoding="utf-8"?>
+<b:Sources xmlns:b="http://schemas.openxmlformats.org/officeDocument/2006/bibliography" xmlns="http://schemas.openxmlformats.org/officeDocument/2006/bibliography" SelectedStyle="\APASixthEditionOfficeOnline.xsl" StyleName="APA" Version="6"/>
+</file>
+
+<file path=customXml/item2.xml><?xml version="1.0" encoding="utf-8"?>
 <ct:contentTypeSchema xmlns:ct="http://schemas.microsoft.com/office/2006/metadata/contentType" xmlns:ma="http://schemas.microsoft.com/office/2006/metadata/properties/metaAttributes" ct:_="" ma:_="" ma:contentTypeName="Document" ma:contentTypeID="0x010100D3B57A43E8143347A77F0646A96FDE4E" ma:contentTypeVersion="15" ma:contentTypeDescription="Create a new document." ma:contentTypeScope="" ma:versionID="c9d89aec224b6538b798d42b1134640d">
   <xsd:schema xmlns:xsd="http://www.w3.org/2001/XMLSchema" xmlns:xs="http://www.w3.org/2001/XMLSchema" xmlns:p="http://schemas.microsoft.com/office/2006/metadata/properties" xmlns:ns2="d572179a-693a-4767-874c-935bdc77d781" xmlns:ns3="5b6fb746-084d-48d4-b5a4-43650cc0592f" targetNamespace="http://schemas.microsoft.com/office/2006/metadata/properties" ma:root="true" ma:fieldsID="d929cab6cdb26c2b1abab1d414661ee5" ns2:_="" ns3:_="">
     <xsd:import namespace="d572179a-693a-4767-874c-935bdc77d781"/>
@@ -18069,11 +17406,16 @@
 </ct:contentTypeSchema>
 </file>
 
-<file path=customXml/item2.xml><?xml version="1.0" encoding="utf-8"?>
-<b:Sources xmlns:b="http://schemas.openxmlformats.org/officeDocument/2006/bibliography" xmlns="http://schemas.openxmlformats.org/officeDocument/2006/bibliography" SelectedStyle="\APASixthEditionOfficeOnline.xsl" StyleName="APA" Version="6"/>
+<file path=customXml/item3.xml><?xml version="1.0" encoding="utf-8"?>
+<?mso-contentType ?>
+<FormTemplates xmlns="http://schemas.microsoft.com/sharepoint/v3/contenttype/forms">
+  <Display>DocumentLibraryForm</Display>
+  <Edit>DocumentLibraryForm</Edit>
+  <New>DocumentLibraryForm</New>
+</FormTemplates>
 </file>
 
-<file path=customXml/item3.xml><?xml version="1.0" encoding="utf-8"?>
+<file path=customXml/item4.xml><?xml version="1.0" encoding="utf-8"?>
 <p:properties xmlns:p="http://schemas.microsoft.com/office/2006/metadata/properties" xmlns:xsi="http://www.w3.org/2001/XMLSchema-instance" xmlns:pc="http://schemas.microsoft.com/office/infopath/2007/PartnerControls">
   <documentManagement>
     <lcf76f155ced4ddcb4097134ff3c332f xmlns="d572179a-693a-4767-874c-935bdc77d781">
@@ -18091,16 +17433,15 @@
 </p:properties>
 </file>
 
-<file path=customXml/item4.xml><?xml version="1.0" encoding="utf-8"?>
-<?mso-contentType ?>
-<FormTemplates xmlns="http://schemas.microsoft.com/sharepoint/v3/contenttype/forms">
-  <Display>DocumentLibraryForm</Display>
-  <Edit>DocumentLibraryForm</Edit>
-  <New>DocumentLibraryForm</New>
-</FormTemplates>
+<file path=customXml/itemProps1.xml><?xml version="1.0" encoding="utf-8"?>
+<ds:datastoreItem xmlns:ds="http://schemas.openxmlformats.org/officeDocument/2006/customXml" ds:itemID="{6709144A-2248-4775-882C-94A61192A9D1}">
+  <ds:schemaRefs>
+    <ds:schemaRef ds:uri="http://schemas.openxmlformats.org/officeDocument/2006/bibliography"/>
+  </ds:schemaRefs>
+</ds:datastoreItem>
 </file>
 
-<file path=customXml/itemProps1.xml><?xml version="1.0" encoding="utf-8"?>
+<file path=customXml/itemProps2.xml><?xml version="1.0" encoding="utf-8"?>
 <ds:datastoreItem xmlns:ds="http://schemas.openxmlformats.org/officeDocument/2006/customXml" ds:itemID="{BA79D355-A3BD-4399-BB3C-95A8AAAC829D}">
   <ds:schemaRefs>
     <ds:schemaRef ds:uri="http://schemas.microsoft.com/office/2006/metadata/contentType"/>
@@ -18119,15 +17460,15 @@
 </ds:datastoreItem>
 </file>
 
-<file path=customXml/itemProps2.xml><?xml version="1.0" encoding="utf-8"?>
-<ds:datastoreItem xmlns:ds="http://schemas.openxmlformats.org/officeDocument/2006/customXml" ds:itemID="{6709144A-2248-4775-882C-94A61192A9D1}">
+<file path=customXml/itemProps3.xml><?xml version="1.0" encoding="utf-8"?>
+<ds:datastoreItem xmlns:ds="http://schemas.openxmlformats.org/officeDocument/2006/customXml" ds:itemID="{66CA8A1F-5062-4600-A03D-C860B5AC34A2}">
   <ds:schemaRefs>
-    <ds:schemaRef ds:uri="http://schemas.openxmlformats.org/officeDocument/2006/bibliography"/>
+    <ds:schemaRef ds:uri="http://schemas.microsoft.com/sharepoint/v3/contenttype/forms"/>
   </ds:schemaRefs>
 </ds:datastoreItem>
 </file>
 
-<file path=customXml/itemProps3.xml><?xml version="1.0" encoding="utf-8"?>
+<file path=customXml/itemProps4.xml><?xml version="1.0" encoding="utf-8"?>
 <ds:datastoreItem xmlns:ds="http://schemas.openxmlformats.org/officeDocument/2006/customXml" ds:itemID="{F88E4A43-9604-4E4F-BE8A-D9A07075A8B3}">
   <ds:schemaRefs>
     <ds:schemaRef ds:uri="http://schemas.microsoft.com/office/2006/metadata/properties"/>
@@ -18136,12 +17477,4 @@
     <ds:schemaRef ds:uri="5b6fb746-084d-48d4-b5a4-43650cc0592f"/>
   </ds:schemaRefs>
 </ds:datastoreItem>
-</file>
-
-<file path=customXml/itemProps4.xml><?xml version="1.0" encoding="utf-8"?>
-<ds:datastoreItem xmlns:ds="http://schemas.openxmlformats.org/officeDocument/2006/customXml" ds:itemID="{66CA8A1F-5062-4600-A03D-C860B5AC34A2}">
-  <ds:schemaRefs>
-    <ds:schemaRef ds:uri="http://schemas.microsoft.com/sharepoint/v3/contenttype/forms"/>
-  </ds:schemaRefs>
-</ds:datastoreItem>
 </file>
</xml_diff>